<commit_message>
feat: verify and archive self-contained submission draft
</commit_message>
<xml_diff>
--- a/deliverables/doc/OS_Agent_记忆优化_技术方案与测试报告.docx
+++ b/deliverables/doc/OS_Agent_记忆优化_技术方案与测试报告.docx
@@ -147,7 +147,7 @@
           <w:rFonts w:ascii="Microsoft YaHei" w:hAnsi="Microsoft YaHei" w:eastAsia="Microsoft YaHei"/>
           <w:sz w:val="21"/>
         </w:rPr>
-        <w:t>当前仓库已形成纯 Python 标准库可运行原型、SQLite v2 持久化、应用服务层、本地 Web 演示、分区评测和规模基准。2026-09-05 固定报告中，开发机 10,000 条知识下的冷查询为 45.801ms、热查询 p99 为 57.641ms；该数据使用 Windows 和 HashEmbedding，仅证明当前检索实现的开发机性能，不替代真实银河麒麟 embedding SDK 验收。</w:t>
+        <w:t>当前仓库已形成纯 Python 标准库可运行原型、SQLite v2 持久化、应用服务层、本地 Web 演示、分区评测和规模基准。2026-09-05 最终固定报告中，开发机 10,000 条知识下的冷查询为 87.620ms、热查询 p99 为 112.732ms；该数据使用 Windows 和 HashEmbedding，仅证明当前检索实现的开发机性能，不替代真实银河麒麟 embedding SDK 验收。</w:t>
       </w:r>
     </w:p>
     <w:p>
@@ -1508,7 +1508,7 @@
           <w:rFonts w:ascii="Microsoft YaHei" w:hAnsi="Microsoft YaHei" w:eastAsia="Microsoft YaHei"/>
           <w:sz w:val="21"/>
         </w:rPr>
-        <w:t>开发机 10,000 条：冷查询 45.801ms、热 p99 57.641ms、吞吐 20.39 QPS、Python 峰值内存 161.160MB、SQLite 39.977MB。原始报告见 artifacts/verification/。</w:t>
+        <w:t>开发机 10,000 条：冷查询 87.620ms、热 p99 112.732ms、吞吐 12.14 QPS、Python 峰值内存 161.160MB、SQLite 39.977MB。原始报告见 artifacts/verification/。</w:t>
       </w:r>
     </w:p>
     <w:p>
@@ -2159,7 +2159,7 @@
           <w:rFonts w:ascii="Microsoft YaHei" w:hAnsi="Microsoft YaHei" w:eastAsia="Microsoft YaHei"/>
           <w:sz w:val="21"/>
         </w:rPr>
-        <w:t>当前版本在 Windows 开发机完成 61 项自动化测试、120 条分区合成数据评测和最高 10,000 条知识规模测试。仓库内测试全部通过；v2 test 分区全部预设阈值通过；10,000 条时冷查询 45.801ms、热查询 p99 57.641ms。</w:t>
+        <w:t>当前版本在 Windows 开发机完成 65 项自动化测试、120 条分区合成数据评测和最高 10,000 条知识规模测试。仓库内测试全部通过；v2 test 分区全部预设阈值通过；10,000 条时冷查询 87.620ms、热查询 p99 112.732ms。</w:t>
       </w:r>
     </w:p>
     <w:p>
@@ -3168,7 +3168,7 @@
                 <w:b w:val="0"/>
                 <w:sz w:val="18"/>
               </w:rPr>
-              <w:t>0.082ms</w:t>
+              <w:t>0.138ms</w:t>
             </w:r>
           </w:p>
         </w:tc>
@@ -3633,7 +3633,7 @@
                 <w:b w:val="0"/>
                 <w:sz w:val="18"/>
               </w:rPr>
-              <w:t>84.538</w:t>
+              <w:t>94.781</w:t>
             </w:r>
           </w:p>
         </w:tc>
@@ -3649,7 +3649,7 @@
                 <w:b w:val="0"/>
                 <w:sz w:val="18"/>
               </w:rPr>
-              <w:t>4.299</w:t>
+              <w:t>4.653</w:t>
             </w:r>
           </w:p>
         </w:tc>
@@ -3665,7 +3665,7 @@
                 <w:b w:val="0"/>
                 <w:sz w:val="18"/>
               </w:rPr>
-              <w:t>4.671</w:t>
+              <w:t>4.434</w:t>
             </w:r>
           </w:p>
         </w:tc>
@@ -3681,7 +3681,7 @@
                 <w:b w:val="0"/>
                 <w:sz w:val="18"/>
               </w:rPr>
-              <w:t>5.055</w:t>
+              <w:t>5.395</w:t>
             </w:r>
           </w:p>
         </w:tc>
@@ -3697,7 +3697,7 @@
                 <w:b w:val="0"/>
                 <w:sz w:val="18"/>
               </w:rPr>
-              <w:t>5.408</w:t>
+              <w:t>6.035</w:t>
             </w:r>
           </w:p>
         </w:tc>
@@ -3713,7 +3713,7 @@
                 <w:b w:val="0"/>
                 <w:sz w:val="18"/>
               </w:rPr>
-              <w:t>215.27</w:t>
+              <w:t>220.27</w:t>
             </w:r>
           </w:p>
         </w:tc>
@@ -3795,39 +3795,7 @@
                 <w:b w:val="0"/>
                 <w:sz w:val="18"/>
               </w:rPr>
-              <w:t>889.624</w:t>
-            </w:r>
-          </w:p>
-        </w:tc>
-        <w:tc>
-          <w:tcPr>
-            <w:tcW w:type="dxa" w:w="941"/>
-          </w:tcPr>
-          <w:p>
-            <w:r/>
-            <w:r>
-              <w:rPr>
-                <w:rFonts w:ascii="Microsoft YaHei" w:hAnsi="Microsoft YaHei" w:eastAsia="Microsoft YaHei"/>
-                <w:b w:val="0"/>
-                <w:sz w:val="18"/>
-              </w:rPr>
-              <w:t>7.719</w:t>
-            </w:r>
-          </w:p>
-        </w:tc>
-        <w:tc>
-          <w:tcPr>
-            <w:tcW w:type="dxa" w:w="941"/>
-          </w:tcPr>
-          <w:p>
-            <w:r/>
-            <w:r>
-              <w:rPr>
-                <w:rFonts w:ascii="Microsoft YaHei" w:hAnsi="Microsoft YaHei" w:eastAsia="Microsoft YaHei"/>
-                <w:b w:val="0"/>
-                <w:sz w:val="18"/>
-              </w:rPr>
-              <w:t>7.733</w:t>
+              <w:t>974.794</w:t>
             </w:r>
           </w:p>
         </w:tc>
@@ -3859,7 +3827,7 @@
                 <w:b w:val="0"/>
                 <w:sz w:val="18"/>
               </w:rPr>
-              <w:t>9.217</w:t>
+              <w:t>9.057</w:t>
             </w:r>
           </w:p>
         </w:tc>
@@ -3875,7 +3843,39 @@
                 <w:b w:val="0"/>
                 <w:sz w:val="18"/>
               </w:rPr>
-              <w:t>126.38</w:t>
+              <w:t>11.038</w:t>
+            </w:r>
+          </w:p>
+        </w:tc>
+        <w:tc>
+          <w:tcPr>
+            <w:tcW w:type="dxa" w:w="941"/>
+          </w:tcPr>
+          <w:p>
+            <w:r/>
+            <w:r>
+              <w:rPr>
+                <w:rFonts w:ascii="Microsoft YaHei" w:hAnsi="Microsoft YaHei" w:eastAsia="Microsoft YaHei"/>
+                <w:b w:val="0"/>
+                <w:sz w:val="18"/>
+              </w:rPr>
+              <w:t>12.398</w:t>
+            </w:r>
+          </w:p>
+        </w:tc>
+        <w:tc>
+          <w:tcPr>
+            <w:tcW w:type="dxa" w:w="941"/>
+          </w:tcPr>
+          <w:p>
+            <w:r/>
+            <w:r>
+              <w:rPr>
+                <w:rFonts w:ascii="Microsoft YaHei" w:hAnsi="Microsoft YaHei" w:eastAsia="Microsoft YaHei"/>
+                <w:b w:val="0"/>
+                <w:sz w:val="18"/>
+              </w:rPr>
+              <w:t>107.08</w:t>
             </w:r>
           </w:p>
         </w:tc>
@@ -3957,7 +3957,7 @@
                 <w:b w:val="0"/>
                 <w:sz w:val="18"/>
               </w:rPr>
-              <w:t>4,413.426</w:t>
+              <w:t>7,463.104</w:t>
             </w:r>
           </w:p>
         </w:tc>
@@ -3973,7 +3973,7 @@
                 <w:b w:val="0"/>
                 <w:sz w:val="18"/>
               </w:rPr>
-              <w:t>24.784</w:t>
+              <w:t>37.034</w:t>
             </w:r>
           </w:p>
         </w:tc>
@@ -3989,7 +3989,7 @@
                 <w:b w:val="0"/>
                 <w:sz w:val="18"/>
               </w:rPr>
-              <w:t>24.067</w:t>
+              <w:t>46.273</w:t>
             </w:r>
           </w:p>
         </w:tc>
@@ -4005,7 +4005,7 @@
                 <w:b w:val="0"/>
                 <w:sz w:val="18"/>
               </w:rPr>
-              <w:t>25.560</w:t>
+              <w:t>66.981</w:t>
             </w:r>
           </w:p>
         </w:tc>
@@ -4021,7 +4021,7 @@
                 <w:b w:val="0"/>
                 <w:sz w:val="18"/>
               </w:rPr>
-              <w:t>25.580</w:t>
+              <w:t>70.032</w:t>
             </w:r>
           </w:p>
         </w:tc>
@@ -4037,7 +4037,7 @@
                 <w:b w:val="0"/>
                 <w:sz w:val="18"/>
               </w:rPr>
-              <w:t>41.51</w:t>
+              <w:t>22.03</w:t>
             </w:r>
           </w:p>
         </w:tc>
@@ -4119,7 +4119,7 @@
                 <w:b w:val="0"/>
                 <w:sz w:val="18"/>
               </w:rPr>
-              <w:t>9,081.436</w:t>
+              <w:t>16,066.888</w:t>
             </w:r>
           </w:p>
         </w:tc>
@@ -4135,7 +4135,7 @@
                 <w:b w:val="0"/>
                 <w:sz w:val="18"/>
               </w:rPr>
-              <w:t>45.801</w:t>
+              <w:t>87.620</w:t>
             </w:r>
           </w:p>
         </w:tc>
@@ -4151,7 +4151,7 @@
                 <w:b w:val="0"/>
                 <w:sz w:val="18"/>
               </w:rPr>
-              <w:t>48.935</w:t>
+              <w:t>80.604</w:t>
             </w:r>
           </w:p>
         </w:tc>
@@ -4167,7 +4167,7 @@
                 <w:b w:val="0"/>
                 <w:sz w:val="18"/>
               </w:rPr>
-              <w:t>54.433</w:t>
+              <w:t>107.486</w:t>
             </w:r>
           </w:p>
         </w:tc>
@@ -4183,7 +4183,7 @@
                 <w:b w:val="0"/>
                 <w:sz w:val="18"/>
               </w:rPr>
-              <w:t>57.641</w:t>
+              <w:t>112.732</w:t>
             </w:r>
           </w:p>
         </w:tc>
@@ -4199,7 +4199,7 @@
                 <w:b w:val="0"/>
                 <w:sz w:val="18"/>
               </w:rPr>
-              <w:t>20.39</w:t>
+              <w:t>12.14</w:t>
             </w:r>
           </w:p>
         </w:tc>
@@ -4296,7 +4296,7 @@
           <w:rFonts w:ascii="Microsoft YaHei" w:hAnsi="Microsoft YaHei" w:eastAsia="Microsoft YaHei"/>
           <w:sz w:val="21"/>
         </w:rPr>
-        <w:t>截至本报告生成时共 61 项，全部通过，覆盖核心单元、SQLite 迁移、服务集成、HTTP 端到端、指标、性能报告、环境/演示预检、隐私扫描、提交包边界，以及跨租户、提示注入、失败工具、硬删除和嵌套凭证等安全对抗。详细映射见 docs/06_测试矩阵.md。</w:t>
+        <w:t>截至本报告生成时共 65 项，全部通过，覆盖核心单元、SQLite 迁移、服务集成、HTTP 端到端、指标、性能报告、环境/演示预检、隐私扫描、提交包边界，以及跨租户、提示注入、失败工具、硬删除和嵌套凭证等安全对抗。详细映射见 docs/06_测试矩阵.md。</w:t>
       </w:r>
     </w:p>
     <w:p>

</xml_diff>

<commit_message>
build: verify and package evidence-driven round-two release (R14)
</commit_message>
<xml_diff>
--- a/deliverables/doc/OS_Agent_记忆优化_技术方案与测试报告.docx
+++ b/deliverables/doc/OS_Agent_记忆优化_技术方案与测试报告.docx
@@ -40,7 +40,7 @@
         </w:rPr>
         <w:t>对应赛题：XA-202612</w:t>
         <w:br/>
-        <w:t>生成日期：2026-09-05</w:t>
+        <w:t>第二轮证据日期：2026-09-06</w:t>
       </w:r>
     </w:p>
     <w:p>
@@ -79,7 +79,7 @@
           <w:rFonts w:ascii="Microsoft YaHei" w:hAnsi="Microsoft YaHei" w:eastAsia="Microsoft YaHei"/>
           <w:sz w:val="21"/>
         </w:rPr>
-        <w:t>版本：1.0（比赛交付草案）</w:t>
+        <w:t>版本：第二轮（开发机交付草案）</w:t>
       </w:r>
     </w:p>
     <w:p>
@@ -91,7 +91,7 @@
           <w:rFonts w:ascii="Microsoft YaHei" w:hAnsi="Microsoft YaHei" w:eastAsia="Microsoft YaHei"/>
           <w:sz w:val="21"/>
         </w:rPr>
-        <w:t>更新时间：2026-09-05</w:t>
+        <w:t>更新时间：2026-09-06</w:t>
       </w:r>
     </w:p>
     <w:p>
@@ -147,7 +147,7 @@
           <w:rFonts w:ascii="Microsoft YaHei" w:hAnsi="Microsoft YaHei" w:eastAsia="Microsoft YaHei"/>
           <w:sz w:val="21"/>
         </w:rPr>
-        <w:t>当前仓库已形成纯 Python 标准库可运行原型、SQLite v2 持久化、应用服务层、本地 Web 演示、分区评测和规模基准。2026-09-05 最终固定报告中，开发机 10,000 条知识下的冷查询为 87.620ms、热查询 p99 为 112.732ms；该数据使用 Windows 和 HashEmbedding，仅证明当前检索实现的开发机性能，不替代真实银河麒麟 embedding SDK 验收。</w:t>
+        <w:t>当前仓库已形成标准库原型、增量 SQLite 持久化、统一生命周期服务、本地场景演示、分区评测和规模基准。第二轮测试数及性能统一由 artifacts/verification/round2/evidence_summary.json 生成，见《第二轮验收报告》。数据使用 Windows 和 HashEmbedding，不替代真实银河麒麟 embedding SDK 验收。</w:t>
       </w:r>
     </w:p>
     <w:p>
@@ -1296,7 +1296,7 @@
           <w:rFonts w:ascii="Microsoft YaHei" w:hAnsi="Microsoft YaHei" w:eastAsia="Microsoft YaHei"/>
           <w:sz w:val="21"/>
         </w:rPr>
-        <w:t>入库时缓存文档向量并建立倒排索引。查询时先强制解析作用域，再按状态/场景过滤、词法召回有限候选，查询向量只编码一次，最后语义重排。融合分数：</w:t>
+        <w:t>入库缓存文档向量并建立词法及有符号向量维度倒排。查询按作用域、状态、有效期和场景过滤，合并词法候选与近似语义候选，查询向量只编码一次后重排；近似语义召回可能引入干扰，需要对照实验。融合分数：</w:t>
       </w:r>
     </w:p>
     <w:p>
@@ -1364,7 +1364,7 @@
           <w:rFonts w:ascii="Microsoft YaHei" w:hAnsi="Microsoft YaHei" w:eastAsia="Microsoft YaHei"/>
           <w:sz w:val="21"/>
         </w:rPr>
-        <w:t>客户端以计划 ID 确认，过期、重复或不存在的计划拒绝。</w:t>
+        <w:t>客户端以计划 ID、tenant_id、user_id 确认；过期或作用域不匹配拒绝，已成功确认的同作用域请求返回原回执。</w:t>
       </w:r>
     </w:p>
     <w:p>
@@ -1420,7 +1420,7 @@
           <w:rFonts w:ascii="Microsoft YaHei" w:hAnsi="Microsoft YaHei" w:eastAsia="Microsoft YaHei"/>
           <w:sz w:val="21"/>
         </w:rPr>
-        <w:t>SQLite v2 保存偏好当前值、历史、知识、向量、生命周期、审计和冲突决策，并可从 v1 迁移。MemoryService 提供 ingest、preferences、search、conflicts、resolve-conflict、forget-preview、forget-confirm 和 stats。</w:t>
+        <w:t>SQLite 保存偏好、历史、知识、向量、审计、决策以及阶段证据和去重摘要；主键差异增量提交，服务失败回滚，单进程读写串行，重启恢复阶段证据。MemoryService 提供接入、检索、冲突、遗忘、概览与专属租户演示接口。</w:t>
       </w:r>
     </w:p>
     <w:p>
@@ -1484,7 +1484,7 @@
           <w:rFonts w:ascii="Microsoft YaHei" w:hAnsi="Microsoft YaHei" w:eastAsia="Microsoft YaHei"/>
           <w:sz w:val="21"/>
         </w:rPr>
-        <w:t>评测输出偏好/冲突/遗忘的 Precision、Recall、F1，检索 Precision@K、Recall@K、MRR、nDCG@K、无答案正确性和延迟，以及遗忘误删率。v2 合成集共 120 条，train/dev/test 各 40 条，覆盖六类核心场景、失败工具、提示注入、同义查询、无答案、冲突和跨用户反例。</w:t>
+        <w:t>v1/v2 保留为历史标签诊断：这些标签含单条低证据，按当前服务晋升门槛执行后有目标未满足。v3 为正文及模板族隔离的 42 事件、18 主题、54 查询，包含正例改写、无答案及跨用户干扰。</w:t>
       </w:r>
     </w:p>
     <w:p>
@@ -1496,7 +1496,7 @@
           <w:rFonts w:ascii="Microsoft YaHei" w:hAnsi="Microsoft YaHei" w:eastAsia="Microsoft YaHei"/>
           <w:sz w:val="21"/>
         </w:rPr>
-        <w:t>冻结 test 分区：偏好 F1 1.0、检索 Precision@3 0.9286、Recall@3 1.0、MRR 1.0、nDCG@3 1.0、冲突 F1 1.0、遗忘 F1 1.0、误删率 0。标签在仓库公开，因此不是独立盲测。</w:t>
+        <w:t>只用 dev 选择统一阈值再报告 test；词法、向量和混合各自按同一规则选阈值。当前混合检索未稳定优于词法基线，两个 ≥0.85 质量目标仍未全部满足。不能沿用旧版 1.0，也不能把工程回归通过说成质量目标全部达成。</w:t>
       </w:r>
     </w:p>
     <w:p>
@@ -1508,7 +1508,7 @@
           <w:rFonts w:ascii="Microsoft YaHei" w:hAnsi="Microsoft YaHei" w:eastAsia="Microsoft YaHei"/>
           <w:sz w:val="21"/>
         </w:rPr>
-        <w:t>开发机 10,000 条：冷查询 87.620ms、热 p99 112.732ms、吞吐 12.14 QPS、Python 峰值内存 161.160MB、SQLite 39.977MB。原始报告见 artifacts/verification/。</w:t>
+        <w:t>规模检索与实际服务负载分别报告，后者包含接入、SQLite、重启及混合读写和 HTTP。当前数据统一见 docs/18_第二轮验收报告.md 和 artifacts/verification/round2/；公开 test 被开发者接触，不能视为独立盲测。</w:t>
       </w:r>
     </w:p>
     <w:p>
@@ -2115,7 +2115,7 @@
         <w:pStyle w:val="Heading1"/>
       </w:pPr>
       <w:r>
-        <w:t>OS Agent 多源融合记忆优化系统测试报告</w:t>
+        <w:t>第二轮本地工程与评测报告</w:t>
       </w:r>
     </w:p>
     <w:p>
@@ -2127,51 +2127,51 @@
           <w:rFonts w:ascii="Microsoft YaHei" w:hAnsi="Microsoft YaHei" w:eastAsia="Microsoft YaHei"/>
           <w:sz w:val="21"/>
         </w:rPr>
-        <w:t>版本：1.0（开发机验证）</w:t>
+        <w:t>固定证据生成时间（UTC）：2026-09-06T09:32:22+00:00。本报告与 PPT 共用 evidence_summary.json。</w:t>
       </w:r>
     </w:p>
     <w:p>
       <w:pPr>
-        <w:spacing w:line="324" w:lineRule="auto"/>
+        <w:pStyle w:val="Heading2"/>
+      </w:pPr>
+      <w:r>
+        <w:t>验收结论</w:t>
+      </w:r>
+    </w:p>
+    <w:p>
+      <w:pPr>
+        <w:pStyle w:val="ListBullet"/>
       </w:pPr>
       <w:r>
         <w:rPr>
           <w:rFonts w:ascii="Microsoft YaHei" w:hAnsi="Microsoft YaHei" w:eastAsia="Microsoft YaHei"/>
           <w:sz w:val="21"/>
         </w:rPr>
-        <w:t>报告日期：2026-09-05</w:t>
+        <w:t>工程检查通过：True；自动化测试 86 项全部通过。</w:t>
       </w:r>
     </w:p>
     <w:p>
       <w:pPr>
-        <w:pStyle w:val="Heading2"/>
-      </w:pPr>
-      <w:r>
-        <w:t>1. 结论摘要</w:t>
-      </w:r>
-    </w:p>
-    <w:p>
-      <w:pPr>
-        <w:spacing w:line="324" w:lineRule="auto"/>
+        <w:pStyle w:val="ListBullet"/>
       </w:pPr>
       <w:r>
         <w:rPr>
           <w:rFonts w:ascii="Microsoft YaHei" w:hAnsi="Microsoft YaHei" w:eastAsia="Microsoft YaHei"/>
           <w:sz w:val="21"/>
         </w:rPr>
-        <w:t>当前版本在 Windows 开发机完成 65 项自动化测试、120 条分区合成数据评测和最高 10,000 条知识规模测试。仓库内测试全部通过；v2 test 分区全部预设阈值通过；10,000 条时冷查询 87.620ms、热查询 p99 112.732ms。</w:t>
+        <w:t>内部质量目标全部满足：False；正式赛事就绪：False。</w:t>
       </w:r>
     </w:p>
     <w:p>
       <w:pPr>
-        <w:spacing w:line="324" w:lineRule="auto"/>
+        <w:pStyle w:val="ListBullet"/>
       </w:pPr>
       <w:r>
         <w:rPr>
           <w:rFonts w:ascii="Microsoft YaHei" w:hAnsi="Microsoft YaHei" w:eastAsia="Microsoft YaHei"/>
           <w:sz w:val="21"/>
         </w:rPr>
-        <w:t>这些结果证明当前源码、HashEmbedding 回退方案和 SQLite v2 在本开发机可复现，不证明真实银河麒麟 embedding SDK 达标。兼容性报告的“真实银河麒麟环境”“真实 SDK”“赛题指定环境整体就绪”均为否或未验证。</w:t>
+        <w:t>真实 SDK、麒麟、盲测、授权案例、视频和赛事凭证仍未取得；本轮仅验收本地任务。</w:t>
       </w:r>
     </w:p>
     <w:p>
@@ -2179,111 +2179,155 @@
         <w:pStyle w:val="Heading2"/>
       </w:pPr>
       <w:r>
-        <w:t>2. 测试对象</w:t>
+        <w:t>第二轮实质改造</w:t>
       </w:r>
     </w:p>
     <w:p>
       <w:pPr>
-        <w:pStyle w:val="ListBullet"/>
+        <w:spacing w:line="324" w:lineRule="auto"/>
       </w:pPr>
       <w:r>
         <w:rPr>
           <w:rFonts w:ascii="Microsoft YaHei" w:hAnsi="Microsoft YaHei" w:eastAsia="Microsoft YaHei"/>
           <w:sz w:val="21"/>
         </w:rPr>
-        <w:t>多源输入规范化、校验、去重、错误隔离和递归脱敏。</w:t>
+        <w:t>服务、CLI 与评测统一经过生命周期门槛；检索检查有效期；软删除重启后不恢复向量；</w:t>
       </w:r>
     </w:p>
     <w:p>
       <w:pPr>
-        <w:pStyle w:val="ListBullet"/>
+        <w:spacing w:line="324" w:lineRule="auto"/>
       </w:pPr>
       <w:r>
         <w:rPr>
           <w:rFonts w:ascii="Microsoft YaHei" w:hAnsi="Microsoft YaHei" w:eastAsia="Microsoft YaHei"/>
           <w:sz w:val="21"/>
         </w:rPr>
-        <w:t>记忆污染检测与来源权威度控制。</w:t>
+        <w:t>持久化失败回滚内存、阶段证据和确认状态。SQLite 按主键增量写入，跨请求/重启去重，</w:t>
       </w:r>
     </w:p>
     <w:p>
       <w:pPr>
-        <w:pStyle w:val="ListBullet"/>
+        <w:spacing w:line="324" w:lineRule="auto"/>
       </w:pPr>
       <w:r>
         <w:rPr>
           <w:rFonts w:ascii="Microsoft YaHei" w:hAnsi="Microsoft YaHei" w:eastAsia="Microsoft YaHei"/>
           <w:sz w:val="21"/>
         </w:rPr>
-        <w:t>多维偏好、证据聚合、时间衰减、工具反馈和版本回溯。</w:t>
+        <w:t>确认回执幂等，删除同时清理阶段证据。冲突/遗忘确认绑定租户与用户。</w:t>
       </w:r>
     </w:p>
     <w:p>
       <w:pPr>
-        <w:pStyle w:val="ListBullet"/>
+        <w:spacing w:line="324" w:lineRule="auto"/>
       </w:pPr>
       <w:r>
         <w:rPr>
           <w:rFonts w:ascii="Microsoft YaHei" w:hAnsi="Microsoft YaHei" w:eastAsia="Microsoft YaHei"/>
           <w:sz w:val="21"/>
         </w:rPr>
-        <w:t>短期 TTL、中期聚合和长期晋升/拒绝/过期/降级。</w:t>
+        <w:t>词法倒排候选与近似语义候选合并，冲突补数字、条件、场景判断。</w:t>
       </w:r>
     </w:p>
     <w:p>
       <w:pPr>
-        <w:pStyle w:val="ListBullet"/>
+        <w:spacing w:line="324" w:lineRule="auto"/>
       </w:pPr>
       <w:r>
         <w:rPr>
           <w:rFonts w:ascii="Microsoft YaHei" w:hAnsi="Microsoft YaHei" w:eastAsia="Microsoft YaHei"/>
           <w:sz w:val="21"/>
         </w:rPr>
-        <w:t>知识抽取、作用域、冲突隔离/决策、混合检索和无答案。</w:t>
+        <w:t>embedding 配置贯穿服务、评测与基准，模型版本/维度变化时重建缓存，限制超时调用。</w:t>
       </w:r>
     </w:p>
     <w:p>
       <w:pPr>
-        <w:pStyle w:val="ListBullet"/>
+        <w:spacing w:line="324" w:lineRule="auto"/>
       </w:pPr>
       <w:r>
         <w:rPr>
           <w:rFonts w:ascii="Microsoft YaHei" w:hAnsi="Microsoft YaHei" w:eastAsia="Microsoft YaHei"/>
           <w:sz w:val="21"/>
         </w:rPr>
-        <w:t>遗忘预览、确认、软/硬删除、索引同步和审计回执。</w:t>
+        <w:t>界面新增合成场景、偏好历史、冲突前后对照、目标预览与演示租户恢复。</w:t>
       </w:r>
     </w:p>
     <w:p>
       <w:pPr>
-        <w:pStyle w:val="ListBullet"/>
+        <w:pStyle w:val="Heading2"/>
+      </w:pPr>
+      <w:r>
+        <w:t>数据与协议</w:t>
+      </w:r>
+    </w:p>
+    <w:p>
+      <w:pPr>
+        <w:spacing w:line="324" w:lineRule="auto"/>
       </w:pPr>
       <w:r>
         <w:rPr>
           <w:rFonts w:ascii="Microsoft YaHei" w:hAnsi="Microsoft YaHei" w:eastAsia="Microsoft YaHei"/>
           <w:sz w:val="21"/>
         </w:rPr>
-        <w:t>SQLite v1→v2 迁移、完整状态持久化。</w:t>
+        <w:t>v3 含 42 个输入事件、18 个办公主题、54 个查询。每分区 14 个事件和 18 个查询，</w:t>
       </w:r>
     </w:p>
     <w:p>
       <w:pPr>
-        <w:pStyle w:val="ListBullet"/>
+        <w:spacing w:line="324" w:lineRule="auto"/>
       </w:pPr>
       <w:r>
         <w:rPr>
           <w:rFonts w:ascii="Microsoft YaHei" w:hAnsi="Microsoft YaHei" w:eastAsia="Microsoft YaHei"/>
           <w:sz w:val="21"/>
         </w:rPr>
-        <w:t>MemoryService、HTTP API、本地仪表盘、SDK 适配和环境诊断。</w:t>
+        <w:t>其中 12 个正例、6 个无答案。正文、模板族跨分区交集均为零，含改写及跨用户干扰。</w:t>
       </w:r>
     </w:p>
     <w:p>
       <w:pPr>
+        <w:spacing w:line="324" w:lineRule="auto"/>
+      </w:pPr>
+      <w:r>
+        <w:rPr>
+          <w:rFonts w:ascii="Microsoft YaHei" w:hAnsi="Microsoft YaHei" w:eastAsia="Microsoft YaHei"/>
+          <w:sz w:val="21"/>
+        </w:rPr>
+        <w:t>全部为开发者持有标签的合成内部评测，不是独立盲测；题量不足以证明开放域泛化。</w:t>
+      </w:r>
+    </w:p>
+    <w:p>
+      <w:pPr>
+        <w:spacing w:line="324" w:lineRule="auto"/>
+      </w:pPr>
+      <w:r>
+        <w:rPr>
+          <w:rFonts w:ascii="Microsoft YaHei" w:hAnsi="Microsoft YaHei" w:eastAsia="Microsoft YaHei"/>
+          <w:sz w:val="21"/>
+        </w:rPr>
+        <w:t>仅用 dev 选择统一阈值 0.24，然后测试。配置及 dev 摘要见 evaluation_v3.json。</w:t>
+      </w:r>
+    </w:p>
+    <w:p>
+      <w:pPr>
+        <w:spacing w:line="324" w:lineRule="auto"/>
+      </w:pPr>
+      <w:r>
+        <w:rPr>
+          <w:rFonts w:ascii="Microsoft YaHei" w:hAnsi="Microsoft YaHei" w:eastAsia="Microsoft YaHei"/>
+          <w:sz w:val="21"/>
+        </w:rPr>
+        <w:t>测试标签在开发过程中可见，后续修改必须如实注明再次接触 test；本轮不能称为盲测。</w:t>
+      </w:r>
+    </w:p>
+    <w:p>
+      <w:pPr>
         <w:pStyle w:val="Heading2"/>
       </w:pPr>
       <w:r>
-        <w:t>3. 环境</w:t>
+        <w:t>检索对照</w:t>
       </w:r>
     </w:p>
     <w:tbl>
@@ -2293,13 +2337,16 @@
         <w:tblLook w:firstColumn="1" w:firstRow="1" w:lastColumn="0" w:lastRow="0" w:noHBand="0" w:noVBand="1" w:val="04A0"/>
       </w:tblPr>
       <w:tblGrid>
-        <w:gridCol w:w="4703"/>
-        <w:gridCol w:w="4703"/>
+        <w:gridCol w:w="1881"/>
+        <w:gridCol w:w="1881"/>
+        <w:gridCol w:w="1881"/>
+        <w:gridCol w:w="1881"/>
+        <w:gridCol w:w="1881"/>
       </w:tblGrid>
       <w:tr>
         <w:tc>
           <w:tcPr>
-            <w:tcW w:type="dxa" w:w="4703"/>
+            <w:tcW w:type="dxa" w:w="1881"/>
           </w:tcPr>
           <w:p>
             <w:r/>
@@ -2309,13 +2356,13 @@
                 <w:b/>
                 <w:sz w:val="18"/>
               </w:rPr>
-              <w:t>项目</w:t>
+              <w:t>模式</w:t>
             </w:r>
           </w:p>
         </w:tc>
         <w:tc>
           <w:tcPr>
-            <w:tcW w:type="dxa" w:w="4703"/>
+            <w:tcW w:type="dxa" w:w="1881"/>
           </w:tcPr>
           <w:p>
             <w:r/>
@@ -2325,7 +2372,55 @@
                 <w:b/>
                 <w:sz w:val="18"/>
               </w:rPr>
-              <w:t>开发机记录</w:t>
+              <w:t>正例 Recall@3</w:t>
+            </w:r>
+          </w:p>
+        </w:tc>
+        <w:tc>
+          <w:tcPr>
+            <w:tcW w:type="dxa" w:w="1881"/>
+          </w:tcPr>
+          <w:p>
+            <w:r/>
+            <w:r>
+              <w:rPr>
+                <w:rFonts w:ascii="Microsoft YaHei" w:hAnsi="Microsoft YaHei" w:eastAsia="Microsoft YaHei"/>
+                <w:b/>
+                <w:sz w:val="18"/>
+              </w:rPr>
+              <w:t>无答案正确率</w:t>
+            </w:r>
+          </w:p>
+        </w:tc>
+        <w:tc>
+          <w:tcPr>
+            <w:tcW w:type="dxa" w:w="1881"/>
+          </w:tcPr>
+          <w:p>
+            <w:r/>
+            <w:r>
+              <w:rPr>
+                <w:rFonts w:ascii="Microsoft YaHei" w:hAnsi="Microsoft YaHei" w:eastAsia="Microsoft YaHei"/>
+                <w:b/>
+                <w:sz w:val="18"/>
+              </w:rPr>
+              <w:t>平衡得分</w:t>
+            </w:r>
+          </w:p>
+        </w:tc>
+        <w:tc>
+          <w:tcPr>
+            <w:tcW w:type="dxa" w:w="1881"/>
+          </w:tcPr>
+          <w:p>
+            <w:r/>
+            <w:r>
+              <w:rPr>
+                <w:rFonts w:ascii="Microsoft YaHei" w:hAnsi="Microsoft YaHei" w:eastAsia="Microsoft YaHei"/>
+                <w:b/>
+                <w:sz w:val="18"/>
+              </w:rPr>
+              <w:t>dev 阈值</w:t>
             </w:r>
           </w:p>
         </w:tc>
@@ -2333,7 +2428,7 @@
       <w:tr>
         <w:tc>
           <w:tcPr>
-            <w:tcW w:type="dxa" w:w="4703"/>
+            <w:tcW w:type="dxa" w:w="1881"/>
           </w:tcPr>
           <w:p>
             <w:r/>
@@ -2343,13 +2438,13 @@
                 <w:b w:val="0"/>
                 <w:sz w:val="18"/>
               </w:rPr>
-              <w:t>操作系统</w:t>
+              <w:t>lexical</w:t>
             </w:r>
           </w:p>
         </w:tc>
         <w:tc>
           <w:tcPr>
-            <w:tcW w:type="dxa" w:w="4703"/>
+            <w:tcW w:type="dxa" w:w="1881"/>
           </w:tcPr>
           <w:p>
             <w:r/>
@@ -2359,15 +2454,13 @@
                 <w:b w:val="0"/>
                 <w:sz w:val="18"/>
               </w:rPr>
-              <w:t>Windows 10 10.0.19045</w:t>
+              <w:t>0.8333</w:t>
             </w:r>
           </w:p>
         </w:tc>
-      </w:tr>
-      <w:tr>
         <w:tc>
           <w:tcPr>
-            <w:tcW w:type="dxa" w:w="4703"/>
+            <w:tcW w:type="dxa" w:w="1881"/>
           </w:tcPr>
           <w:p>
             <w:r/>
@@ -2377,13 +2470,13 @@
                 <w:b w:val="0"/>
                 <w:sz w:val="18"/>
               </w:rPr>
-              <w:t>架构</w:t>
+              <w:t>1.0000</w:t>
             </w:r>
           </w:p>
         </w:tc>
         <w:tc>
           <w:tcPr>
-            <w:tcW w:type="dxa" w:w="4703"/>
+            <w:tcW w:type="dxa" w:w="1881"/>
           </w:tcPr>
           <w:p>
             <w:r/>
@@ -2393,15 +2486,13 @@
                 <w:b w:val="0"/>
                 <w:sz w:val="18"/>
               </w:rPr>
-              <w:t>AMD64</w:t>
+              <w:t>0.9167</w:t>
             </w:r>
           </w:p>
         </w:tc>
-      </w:tr>
-      <w:tr>
         <w:tc>
           <w:tcPr>
-            <w:tcW w:type="dxa" w:w="4703"/>
+            <w:tcW w:type="dxa" w:w="1881"/>
           </w:tcPr>
           <w:p>
             <w:r/>
@@ -2411,13 +2502,15 @@
                 <w:b w:val="0"/>
                 <w:sz w:val="18"/>
               </w:rPr>
-              <w:t>Python</w:t>
+              <w:t>0.12</w:t>
             </w:r>
           </w:p>
         </w:tc>
+      </w:tr>
+      <w:tr>
         <w:tc>
           <w:tcPr>
-            <w:tcW w:type="dxa" w:w="4703"/>
+            <w:tcW w:type="dxa" w:w="1881"/>
           </w:tcPr>
           <w:p>
             <w:r/>
@@ -2427,15 +2520,13 @@
                 <w:b w:val="0"/>
                 <w:sz w:val="18"/>
               </w:rPr>
-              <w:t>CPython 3.14.3</w:t>
+              <w:t>semantic</w:t>
             </w:r>
           </w:p>
         </w:tc>
-      </w:tr>
-      <w:tr>
         <w:tc>
           <w:tcPr>
-            <w:tcW w:type="dxa" w:w="4703"/>
+            <w:tcW w:type="dxa" w:w="1881"/>
           </w:tcPr>
           <w:p>
             <w:r/>
@@ -2445,13 +2536,13 @@
                 <w:b w:val="0"/>
                 <w:sz w:val="18"/>
               </w:rPr>
-              <w:t>SQLite</w:t>
+              <w:t>1.0000</w:t>
             </w:r>
           </w:p>
         </w:tc>
         <w:tc>
           <w:tcPr>
-            <w:tcW w:type="dxa" w:w="4703"/>
+            <w:tcW w:type="dxa" w:w="1881"/>
           </w:tcPr>
           <w:p>
             <w:r/>
@@ -2461,15 +2552,13 @@
                 <w:b w:val="0"/>
                 <w:sz w:val="18"/>
               </w:rPr>
-              <w:t>3.50.4</w:t>
+              <w:t>0.5000</w:t>
             </w:r>
           </w:p>
         </w:tc>
-      </w:tr>
-      <w:tr>
         <w:tc>
           <w:tcPr>
-            <w:tcW w:type="dxa" w:w="4703"/>
+            <w:tcW w:type="dxa" w:w="1881"/>
           </w:tcPr>
           <w:p>
             <w:r/>
@@ -2479,13 +2568,13 @@
                 <w:b w:val="0"/>
                 <w:sz w:val="18"/>
               </w:rPr>
-              <w:t>FTS5 / JSON1</w:t>
+              <w:t>0.7500</w:t>
             </w:r>
           </w:p>
         </w:tc>
         <w:tc>
           <w:tcPr>
-            <w:tcW w:type="dxa" w:w="4703"/>
+            <w:tcW w:type="dxa" w:w="1881"/>
           </w:tcPr>
           <w:p>
             <w:r/>
@@ -2495,7 +2584,7 @@
                 <w:b w:val="0"/>
                 <w:sz w:val="18"/>
               </w:rPr>
-              <w:t>可用 / 可用</w:t>
+              <w:t>0.2</w:t>
             </w:r>
           </w:p>
         </w:tc>
@@ -2503,7 +2592,7 @@
       <w:tr>
         <w:tc>
           <w:tcPr>
-            <w:tcW w:type="dxa" w:w="4703"/>
+            <w:tcW w:type="dxa" w:w="1881"/>
           </w:tcPr>
           <w:p>
             <w:r/>
@@ -2513,13 +2602,13 @@
                 <w:b w:val="0"/>
                 <w:sz w:val="18"/>
               </w:rPr>
-              <w:t>逻辑 CPU</w:t>
+              <w:t>hybrid</w:t>
             </w:r>
           </w:p>
         </w:tc>
         <w:tc>
           <w:tcPr>
-            <w:tcW w:type="dxa" w:w="4703"/>
+            <w:tcW w:type="dxa" w:w="1881"/>
           </w:tcPr>
           <w:p>
             <w:r/>
@@ -2529,15 +2618,13 @@
                 <w:b w:val="0"/>
                 <w:sz w:val="18"/>
               </w:rPr>
-              <w:t>8</w:t>
+              <w:t>0.8333</w:t>
             </w:r>
           </w:p>
         </w:tc>
-      </w:tr>
-      <w:tr>
         <w:tc>
           <w:tcPr>
-            <w:tcW w:type="dxa" w:w="4703"/>
+            <w:tcW w:type="dxa" w:w="1881"/>
           </w:tcPr>
           <w:p>
             <w:r/>
@@ -2547,13 +2634,13 @@
                 <w:b w:val="0"/>
                 <w:sz w:val="18"/>
               </w:rPr>
-              <w:t>物理内存</w:t>
+              <w:t>0.8333</w:t>
             </w:r>
           </w:p>
         </w:tc>
         <w:tc>
           <w:tcPr>
-            <w:tcW w:type="dxa" w:w="4703"/>
+            <w:tcW w:type="dxa" w:w="1881"/>
           </w:tcPr>
           <w:p>
             <w:r/>
@@ -2563,15 +2650,13 @@
                 <w:b w:val="0"/>
                 <w:sz w:val="18"/>
               </w:rPr>
-              <w:t>15.771GB</w:t>
+              <w:t>0.8333</w:t>
             </w:r>
           </w:p>
         </w:tc>
-      </w:tr>
-      <w:tr>
         <w:tc>
           <w:tcPr>
-            <w:tcW w:type="dxa" w:w="4703"/>
+            <w:tcW w:type="dxa" w:w="1881"/>
           </w:tcPr>
           <w:p>
             <w:r/>
@@ -2581,57 +2666,7 @@
                 <w:b w:val="0"/>
                 <w:sz w:val="18"/>
               </w:rPr>
-              <w:t>embedding</w:t>
-            </w:r>
-          </w:p>
-        </w:tc>
-        <w:tc>
-          <w:tcPr>
-            <w:tcW w:type="dxa" w:w="4703"/>
-          </w:tcPr>
-          <w:p>
-            <w:r/>
-            <w:r>
-              <w:rPr>
-                <w:rFonts w:ascii="Microsoft YaHei" w:hAnsi="Microsoft YaHei" w:eastAsia="Microsoft YaHei"/>
-                <w:b w:val="0"/>
-                <w:sz w:val="18"/>
-              </w:rPr>
-              <w:t>HashEmbedding（非真实 Kylin SDK）</w:t>
-            </w:r>
-          </w:p>
-        </w:tc>
-      </w:tr>
-      <w:tr>
-        <w:tc>
-          <w:tcPr>
-            <w:tcW w:type="dxa" w:w="4703"/>
-          </w:tcPr>
-          <w:p>
-            <w:r/>
-            <w:r>
-              <w:rPr>
-                <w:rFonts w:ascii="Microsoft YaHei" w:hAnsi="Microsoft YaHei" w:eastAsia="Microsoft YaHei"/>
-                <w:b w:val="0"/>
-                <w:sz w:val="18"/>
-              </w:rPr>
-              <w:t>银河麒麟</w:t>
-            </w:r>
-          </w:p>
-        </w:tc>
-        <w:tc>
-          <w:tcPr>
-            <w:tcW w:type="dxa" w:w="4703"/>
-          </w:tcPr>
-          <w:p>
-            <w:r/>
-            <w:r>
-              <w:rPr>
-                <w:rFonts w:ascii="Microsoft YaHei" w:hAnsi="Microsoft YaHei" w:eastAsia="Microsoft YaHei"/>
-                <w:b w:val="0"/>
-                <w:sz w:val="18"/>
-              </w:rPr>
-              <w:t>未运行</w:t>
+              <w:t>0.24</w:t>
             </w:r>
           </w:p>
         </w:tc>
@@ -2646,23 +2681,7 @@
           <w:rFonts w:ascii="Microsoft YaHei" w:hAnsi="Microsoft YaHei" w:eastAsia="Microsoft YaHei"/>
           <w:sz w:val="21"/>
         </w:rPr>
-        <w:t>原始环境证据：artifacts/verification/compatibility_windows_dev.json。</w:t>
-      </w:r>
-    </w:p>
-    <w:p>
-      <w:pPr>
-        <w:pStyle w:val="Heading2"/>
-      </w:pPr>
-      <w:r>
-        <w:t>4. 测试数据与来源</w:t>
-      </w:r>
-    </w:p>
-    <w:p>
-      <w:pPr>
-        <w:pStyle w:val="Heading3"/>
-      </w:pPr>
-      <w:r>
-        <w:t>4.1 v1 小型回归集</w:t>
+        <w:t>平衡得分为正例召回与无答案正确率的平均值，各模式分别在 dev 定阈值。</w:t>
       </w:r>
     </w:p>
     <w:p>
@@ -2674,15 +2693,7 @@
           <w:rFonts w:ascii="Microsoft YaHei" w:hAnsi="Microsoft YaHei" w:eastAsia="Microsoft YaHei"/>
           <w:sz w:val="21"/>
         </w:rPr>
-        <w:t>data/eval/office_memory_eval.json 含 11 条事件、9 条偏好标签、6 条检索查询、4 条冲突用例和 3 条遗忘用例，用于保持早期功能兼容。</w:t>
-      </w:r>
-    </w:p>
-    <w:p>
-      <w:pPr>
-        <w:pStyle w:val="Heading3"/>
-      </w:pPr>
-      <w:r>
-        <w:t>4.2 v2 扩展集</w:t>
+        <w:t>当前混合方案没有稳定胜过词法基线，不应宣称算法全面领先。语义候选覆盖更广，但也引入干扰。</w:t>
       </w:r>
     </w:p>
     <w:p>
@@ -2694,7 +2705,7 @@
           <w:rFonts w:ascii="Microsoft YaHei" w:hAnsi="Microsoft YaHei" w:eastAsia="Microsoft YaHei"/>
           <w:sz w:val="21"/>
         </w:rPr>
-        <w:t>data/eval/office_memory_eval_v2.json 由 scripts/generate_eval_v2.py 确定性生成，共 120 条事件，train/dev/test 各 40 条。覆盖报销、会议、公文、文件归档、终端安全、客户邮件六类场景和通用噪声，并包含失败工具、提示注入、同义表达、无答案、冲突、隐私和跨用户反例。</w:t>
+        <w:t>质量目标仍为两项各 ≥0.85；未达目标如实保留，不通过降低门槛把结果标绿。</w:t>
       </w:r>
     </w:p>
     <w:p>
@@ -2706,95 +2717,27 @@
           <w:rFonts w:ascii="Microsoft YaHei" w:hAnsi="Microsoft YaHei" w:eastAsia="Microsoft YaHei"/>
           <w:sz w:val="21"/>
         </w:rPr>
-        <w:t>全部数据均为合成数据，test 标签公开，只能作为冻结回归分区，不能宣称第三方独立盲测。</w:t>
+        <w:t>缓存消融统计编码次数并核对返回结果一致；衰减诊断出现持平也保留，单一诊断不等于统计提升。</w:t>
       </w:r>
     </w:p>
     <w:p>
       <w:pPr>
-        <w:pStyle w:val="Heading2"/>
-      </w:pPr>
-      <w:r>
-        <w:t>5. 指标口径</w:t>
-      </w:r>
-    </w:p>
-    <w:p>
-      <w:pPr>
-        <w:pStyle w:val="ListBullet"/>
+        <w:spacing w:line="324" w:lineRule="auto"/>
       </w:pPr>
       <w:r>
         <w:rPr>
           <w:rFonts w:ascii="Microsoft YaHei" w:hAnsi="Microsoft YaHei" w:eastAsia="Microsoft YaHei"/>
           <w:sz w:val="21"/>
         </w:rPr>
-        <w:t>偏好：微平均 Precision、Recall、F1；多报键值计假阳性。</w:t>
+        <w:t>旧 v1/v2 标签包含一次性低证据：门控后存在漏报和目标未满足，旧版 1.0 不再作为当前成绩。</w:t>
       </w:r>
     </w:p>
     <w:p>
       <w:pPr>
-        <w:pStyle w:val="ListBullet"/>
+        <w:pStyle w:val="Heading2"/>
       </w:pPr>
       <w:r>
-        <w:rPr>
-          <w:rFonts w:ascii="Microsoft YaHei" w:hAnsi="Microsoft YaHei" w:eastAsia="Microsoft YaHei"/>
-          <w:sz w:val="21"/>
-        </w:rPr>
-        <w:t>检索：Precision@K、Recall@K、MRR、nDCG@K；无答案只有正确返回空集才通过。</w:t>
-      </w:r>
-    </w:p>
-    <w:p>
-      <w:pPr>
-        <w:pStyle w:val="ListBullet"/>
-      </w:pPr>
-      <w:r>
-        <w:rPr>
-          <w:rFonts w:ascii="Microsoft YaHei" w:hAnsi="Microsoft YaHei" w:eastAsia="Microsoft YaHei"/>
-          <w:sz w:val="21"/>
-        </w:rPr>
-        <w:t>冲突：识别 Precision、Recall、F1 和包含解决结果的用例准确率。</w:t>
-      </w:r>
-    </w:p>
-    <w:p>
-      <w:pPr>
-        <w:pStyle w:val="ListBullet"/>
-      </w:pPr>
-      <w:r>
-        <w:rPr>
-          <w:rFonts w:ascii="Microsoft YaHei" w:hAnsi="Microsoft YaHei" w:eastAsia="Microsoft YaHei"/>
-          <w:sz w:val="21"/>
-        </w:rPr>
-        <w:t>遗忘：Precision、Recall、F1、用例准确率和误删率；任何授权集合外删除均处罚。</w:t>
-      </w:r>
-    </w:p>
-    <w:p>
-      <w:pPr>
-        <w:pStyle w:val="ListBullet"/>
-      </w:pPr>
-      <w:r>
-        <w:rPr>
-          <w:rFonts w:ascii="Microsoft YaHei" w:hAnsi="Microsoft YaHei" w:eastAsia="Microsoft YaHei"/>
-          <w:sz w:val="21"/>
-        </w:rPr>
-        <w:t>性能：首次查询为冷查询，后续同进程查询报告 p50/p95/p99 和 QPS；500ms 判定取冷查询与热 p99 的较大值。</w:t>
-      </w:r>
-    </w:p>
-    <w:p>
-      <w:pPr>
-        <w:pStyle w:val="ListBullet"/>
-      </w:pPr>
-      <w:r>
-        <w:rPr>
-          <w:rFonts w:ascii="Microsoft YaHei" w:hAnsi="Microsoft YaHei" w:eastAsia="Microsoft YaHei"/>
-          <w:sz w:val="21"/>
-        </w:rPr>
-        <w:t>资源：tracemalloc 记录 Python 峰值分配，SQLite 完整保存后记录磁盘体积。</w:t>
-      </w:r>
-    </w:p>
-    <w:p>
-      <w:pPr>
-        <w:pStyle w:val="Heading2"/>
-      </w:pPr>
-      <w:r>
-        <w:t>6. v2 test 分区结果</w:t>
+        <w:t>性能</w:t>
       </w:r>
     </w:p>
     <w:tbl>
@@ -2804,15 +2747,16 @@
         <w:tblLook w:firstColumn="1" w:firstRow="1" w:lastColumn="0" w:lastRow="0" w:noHBand="0" w:noVBand="1" w:val="04A0"/>
       </w:tblPr>
       <w:tblGrid>
-        <w:gridCol w:w="2351"/>
-        <w:gridCol w:w="2351"/>
-        <w:gridCol w:w="2351"/>
-        <w:gridCol w:w="2351"/>
+        <w:gridCol w:w="1881"/>
+        <w:gridCol w:w="1881"/>
+        <w:gridCol w:w="1881"/>
+        <w:gridCol w:w="1881"/>
+        <w:gridCol w:w="1881"/>
       </w:tblGrid>
       <w:tr>
         <w:tc>
           <w:tcPr>
-            <w:tcW w:type="dxa" w:w="2351"/>
+            <w:tcW w:type="dxa" w:w="1881"/>
           </w:tcPr>
           <w:p>
             <w:r/>
@@ -2822,662 +2766,13 @@
                 <w:b/>
                 <w:sz w:val="18"/>
               </w:rPr>
-              <w:t>指标</w:t>
+              <w:t>规模</w:t>
             </w:r>
           </w:p>
         </w:tc>
         <w:tc>
           <w:tcPr>
-            <w:tcW w:type="dxa" w:w="2351"/>
-          </w:tcPr>
-          <w:p>
-            <w:r/>
-            <w:r>
-              <w:rPr>
-                <w:rFonts w:ascii="Microsoft YaHei" w:hAnsi="Microsoft YaHei" w:eastAsia="Microsoft YaHei"/>
-                <w:b/>
-                <w:sz w:val="18"/>
-              </w:rPr>
-              <w:t>结果</w:t>
-            </w:r>
-          </w:p>
-        </w:tc>
-        <w:tc>
-          <w:tcPr>
-            <w:tcW w:type="dxa" w:w="2351"/>
-          </w:tcPr>
-          <w:p>
-            <w:r/>
-            <w:r>
-              <w:rPr>
-                <w:rFonts w:ascii="Microsoft YaHei" w:hAnsi="Microsoft YaHei" w:eastAsia="Microsoft YaHei"/>
-                <w:b/>
-                <w:sz w:val="18"/>
-              </w:rPr>
-              <w:t>目标</w:t>
-            </w:r>
-          </w:p>
-        </w:tc>
-        <w:tc>
-          <w:tcPr>
-            <w:tcW w:type="dxa" w:w="2351"/>
-          </w:tcPr>
-          <w:p>
-            <w:r/>
-            <w:r>
-              <w:rPr>
-                <w:rFonts w:ascii="Microsoft YaHei" w:hAnsi="Microsoft YaHei" w:eastAsia="Microsoft YaHei"/>
-                <w:b/>
-                <w:sz w:val="18"/>
-              </w:rPr>
-              <w:t>判定</w:t>
-            </w:r>
-          </w:p>
-        </w:tc>
-      </w:tr>
-      <w:tr>
-        <w:tc>
-          <w:tcPr>
-            <w:tcW w:type="dxa" w:w="2351"/>
-          </w:tcPr>
-          <w:p>
-            <w:r/>
-            <w:r>
-              <w:rPr>
-                <w:rFonts w:ascii="Microsoft YaHei" w:hAnsi="Microsoft YaHei" w:eastAsia="Microsoft YaHei"/>
-                <w:b w:val="0"/>
-                <w:sz w:val="18"/>
-              </w:rPr>
-              <w:t>偏好 Precision / Recall / F1</w:t>
-            </w:r>
-          </w:p>
-        </w:tc>
-        <w:tc>
-          <w:tcPr>
-            <w:tcW w:type="dxa" w:w="2351"/>
-          </w:tcPr>
-          <w:p>
-            <w:r/>
-            <w:r>
-              <w:rPr>
-                <w:rFonts w:ascii="Microsoft YaHei" w:hAnsi="Microsoft YaHei" w:eastAsia="Microsoft YaHei"/>
-                <w:b w:val="0"/>
-                <w:sz w:val="18"/>
-              </w:rPr>
-              <w:t>1.0 / 1.0 / 1.0</w:t>
-            </w:r>
-          </w:p>
-        </w:tc>
-        <w:tc>
-          <w:tcPr>
-            <w:tcW w:type="dxa" w:w="2351"/>
-          </w:tcPr>
-          <w:p>
-            <w:r/>
-            <w:r>
-              <w:rPr>
-                <w:rFonts w:ascii="Microsoft YaHei" w:hAnsi="Microsoft YaHei" w:eastAsia="Microsoft YaHei"/>
-                <w:b w:val="0"/>
-                <w:sz w:val="18"/>
-              </w:rPr>
-              <w:t>F1 ≥ 0.85</w:t>
-            </w:r>
-          </w:p>
-        </w:tc>
-        <w:tc>
-          <w:tcPr>
-            <w:tcW w:type="dxa" w:w="2351"/>
-          </w:tcPr>
-          <w:p>
-            <w:r/>
-            <w:r>
-              <w:rPr>
-                <w:rFonts w:ascii="Microsoft YaHei" w:hAnsi="Microsoft YaHei" w:eastAsia="Microsoft YaHei"/>
-                <w:b w:val="0"/>
-                <w:sz w:val="18"/>
-              </w:rPr>
-              <w:t>通过</w:t>
-            </w:r>
-          </w:p>
-        </w:tc>
-      </w:tr>
-      <w:tr>
-        <w:tc>
-          <w:tcPr>
-            <w:tcW w:type="dxa" w:w="2351"/>
-          </w:tcPr>
-          <w:p>
-            <w:r/>
-            <w:r>
-              <w:rPr>
-                <w:rFonts w:ascii="Microsoft YaHei" w:hAnsi="Microsoft YaHei" w:eastAsia="Microsoft YaHei"/>
-                <w:b w:val="0"/>
-                <w:sz w:val="18"/>
-              </w:rPr>
-              <w:t>检索 Precision@3</w:t>
-            </w:r>
-          </w:p>
-        </w:tc>
-        <w:tc>
-          <w:tcPr>
-            <w:tcW w:type="dxa" w:w="2351"/>
-          </w:tcPr>
-          <w:p>
-            <w:r/>
-            <w:r>
-              <w:rPr>
-                <w:rFonts w:ascii="Microsoft YaHei" w:hAnsi="Microsoft YaHei" w:eastAsia="Microsoft YaHei"/>
-                <w:b w:val="0"/>
-                <w:sz w:val="18"/>
-              </w:rPr>
-              <w:t>0.9286</w:t>
-            </w:r>
-          </w:p>
-        </w:tc>
-        <w:tc>
-          <w:tcPr>
-            <w:tcW w:type="dxa" w:w="2351"/>
-          </w:tcPr>
-          <w:p>
-            <w:r/>
-            <w:r>
-              <w:rPr>
-                <w:rFonts w:ascii="Microsoft YaHei" w:hAnsi="Microsoft YaHei" w:eastAsia="Microsoft YaHei"/>
-                <w:b w:val="0"/>
-                <w:sz w:val="18"/>
-              </w:rPr>
-              <w:t>≥ 0.30</w:t>
-            </w:r>
-          </w:p>
-        </w:tc>
-        <w:tc>
-          <w:tcPr>
-            <w:tcW w:type="dxa" w:w="2351"/>
-          </w:tcPr>
-          <w:p>
-            <w:r/>
-            <w:r>
-              <w:rPr>
-                <w:rFonts w:ascii="Microsoft YaHei" w:hAnsi="Microsoft YaHei" w:eastAsia="Microsoft YaHei"/>
-                <w:b w:val="0"/>
-                <w:sz w:val="18"/>
-              </w:rPr>
-              <w:t>通过</w:t>
-            </w:r>
-          </w:p>
-        </w:tc>
-      </w:tr>
-      <w:tr>
-        <w:tc>
-          <w:tcPr>
-            <w:tcW w:type="dxa" w:w="2351"/>
-          </w:tcPr>
-          <w:p>
-            <w:r/>
-            <w:r>
-              <w:rPr>
-                <w:rFonts w:ascii="Microsoft YaHei" w:hAnsi="Microsoft YaHei" w:eastAsia="Microsoft YaHei"/>
-                <w:b w:val="0"/>
-                <w:sz w:val="18"/>
-              </w:rPr>
-              <w:t>检索 Recall@3</w:t>
-            </w:r>
-          </w:p>
-        </w:tc>
-        <w:tc>
-          <w:tcPr>
-            <w:tcW w:type="dxa" w:w="2351"/>
-          </w:tcPr>
-          <w:p>
-            <w:r/>
-            <w:r>
-              <w:rPr>
-                <w:rFonts w:ascii="Microsoft YaHei" w:hAnsi="Microsoft YaHei" w:eastAsia="Microsoft YaHei"/>
-                <w:b w:val="0"/>
-                <w:sz w:val="18"/>
-              </w:rPr>
-              <w:t>1.0</w:t>
-            </w:r>
-          </w:p>
-        </w:tc>
-        <w:tc>
-          <w:tcPr>
-            <w:tcW w:type="dxa" w:w="2351"/>
-          </w:tcPr>
-          <w:p>
-            <w:r/>
-            <w:r>
-              <w:rPr>
-                <w:rFonts w:ascii="Microsoft YaHei" w:hAnsi="Microsoft YaHei" w:eastAsia="Microsoft YaHei"/>
-                <w:b w:val="0"/>
-                <w:sz w:val="18"/>
-              </w:rPr>
-              <w:t>≥ 0.85</w:t>
-            </w:r>
-          </w:p>
-        </w:tc>
-        <w:tc>
-          <w:tcPr>
-            <w:tcW w:type="dxa" w:w="2351"/>
-          </w:tcPr>
-          <w:p>
-            <w:r/>
-            <w:r>
-              <w:rPr>
-                <w:rFonts w:ascii="Microsoft YaHei" w:hAnsi="Microsoft YaHei" w:eastAsia="Microsoft YaHei"/>
-                <w:b w:val="0"/>
-                <w:sz w:val="18"/>
-              </w:rPr>
-              <w:t>通过</w:t>
-            </w:r>
-          </w:p>
-        </w:tc>
-      </w:tr>
-      <w:tr>
-        <w:tc>
-          <w:tcPr>
-            <w:tcW w:type="dxa" w:w="2351"/>
-          </w:tcPr>
-          <w:p>
-            <w:r/>
-            <w:r>
-              <w:rPr>
-                <w:rFonts w:ascii="Microsoft YaHei" w:hAnsi="Microsoft YaHei" w:eastAsia="Microsoft YaHei"/>
-                <w:b w:val="0"/>
-                <w:sz w:val="18"/>
-              </w:rPr>
-              <w:t>MRR / nDCG@3</w:t>
-            </w:r>
-          </w:p>
-        </w:tc>
-        <w:tc>
-          <w:tcPr>
-            <w:tcW w:type="dxa" w:w="2351"/>
-          </w:tcPr>
-          <w:p>
-            <w:r/>
-            <w:r>
-              <w:rPr>
-                <w:rFonts w:ascii="Microsoft YaHei" w:hAnsi="Microsoft YaHei" w:eastAsia="Microsoft YaHei"/>
-                <w:b w:val="0"/>
-                <w:sz w:val="18"/>
-              </w:rPr>
-              <w:t>1.0 / 1.0</w:t>
-            </w:r>
-          </w:p>
-        </w:tc>
-        <w:tc>
-          <w:tcPr>
-            <w:tcW w:type="dxa" w:w="2351"/>
-          </w:tcPr>
-          <w:p>
-            <w:r/>
-            <w:r>
-              <w:rPr>
-                <w:rFonts w:ascii="Microsoft YaHei" w:hAnsi="Microsoft YaHei" w:eastAsia="Microsoft YaHei"/>
-                <w:b w:val="0"/>
-                <w:sz w:val="18"/>
-              </w:rPr>
-              <w:t>≥ 0.85</w:t>
-            </w:r>
-          </w:p>
-        </w:tc>
-        <w:tc>
-          <w:tcPr>
-            <w:tcW w:type="dxa" w:w="2351"/>
-          </w:tcPr>
-          <w:p>
-            <w:r/>
-            <w:r>
-              <w:rPr>
-                <w:rFonts w:ascii="Microsoft YaHei" w:hAnsi="Microsoft YaHei" w:eastAsia="Microsoft YaHei"/>
-                <w:b w:val="0"/>
-                <w:sz w:val="18"/>
-              </w:rPr>
-              <w:t>通过</w:t>
-            </w:r>
-          </w:p>
-        </w:tc>
-      </w:tr>
-      <w:tr>
-        <w:tc>
-          <w:tcPr>
-            <w:tcW w:type="dxa" w:w="2351"/>
-          </w:tcPr>
-          <w:p>
-            <w:r/>
-            <w:r>
-              <w:rPr>
-                <w:rFonts w:ascii="Microsoft YaHei" w:hAnsi="Microsoft YaHei" w:eastAsia="Microsoft YaHei"/>
-                <w:b w:val="0"/>
-                <w:sz w:val="18"/>
-              </w:rPr>
-              <w:t>小集平均查询延迟</w:t>
-            </w:r>
-          </w:p>
-        </w:tc>
-        <w:tc>
-          <w:tcPr>
-            <w:tcW w:type="dxa" w:w="2351"/>
-          </w:tcPr>
-          <w:p>
-            <w:r/>
-            <w:r>
-              <w:rPr>
-                <w:rFonts w:ascii="Microsoft YaHei" w:hAnsi="Microsoft YaHei" w:eastAsia="Microsoft YaHei"/>
-                <w:b w:val="0"/>
-                <w:sz w:val="18"/>
-              </w:rPr>
-              <w:t>0.138ms</w:t>
-            </w:r>
-          </w:p>
-        </w:tc>
-        <w:tc>
-          <w:tcPr>
-            <w:tcW w:type="dxa" w:w="2351"/>
-          </w:tcPr>
-          <w:p>
-            <w:r/>
-            <w:r>
-              <w:rPr>
-                <w:rFonts w:ascii="Microsoft YaHei" w:hAnsi="Microsoft YaHei" w:eastAsia="Microsoft YaHei"/>
-                <w:b w:val="0"/>
-                <w:sz w:val="18"/>
-              </w:rPr>
-              <w:t>≤ 500ms</w:t>
-            </w:r>
-          </w:p>
-        </w:tc>
-        <w:tc>
-          <w:tcPr>
-            <w:tcW w:type="dxa" w:w="2351"/>
-          </w:tcPr>
-          <w:p>
-            <w:r/>
-            <w:r>
-              <w:rPr>
-                <w:rFonts w:ascii="Microsoft YaHei" w:hAnsi="Microsoft YaHei" w:eastAsia="Microsoft YaHei"/>
-                <w:b w:val="0"/>
-                <w:sz w:val="18"/>
-              </w:rPr>
-              <w:t>通过</w:t>
-            </w:r>
-          </w:p>
-        </w:tc>
-      </w:tr>
-      <w:tr>
-        <w:tc>
-          <w:tcPr>
-            <w:tcW w:type="dxa" w:w="2351"/>
-          </w:tcPr>
-          <w:p>
-            <w:r/>
-            <w:r>
-              <w:rPr>
-                <w:rFonts w:ascii="Microsoft YaHei" w:hAnsi="Microsoft YaHei" w:eastAsia="Microsoft YaHei"/>
-                <w:b w:val="0"/>
-                <w:sz w:val="18"/>
-              </w:rPr>
-              <w:t>冲突 Precision / Recall / F1</w:t>
-            </w:r>
-          </w:p>
-        </w:tc>
-        <w:tc>
-          <w:tcPr>
-            <w:tcW w:type="dxa" w:w="2351"/>
-          </w:tcPr>
-          <w:p>
-            <w:r/>
-            <w:r>
-              <w:rPr>
-                <w:rFonts w:ascii="Microsoft YaHei" w:hAnsi="Microsoft YaHei" w:eastAsia="Microsoft YaHei"/>
-                <w:b w:val="0"/>
-                <w:sz w:val="18"/>
-              </w:rPr>
-              <w:t>1.0 / 1.0 / 1.0</w:t>
-            </w:r>
-          </w:p>
-        </w:tc>
-        <w:tc>
-          <w:tcPr>
-            <w:tcW w:type="dxa" w:w="2351"/>
-          </w:tcPr>
-          <w:p>
-            <w:r/>
-            <w:r>
-              <w:rPr>
-                <w:rFonts w:ascii="Microsoft YaHei" w:hAnsi="Microsoft YaHei" w:eastAsia="Microsoft YaHei"/>
-                <w:b w:val="0"/>
-                <w:sz w:val="18"/>
-              </w:rPr>
-              <w:t>F1 ≥ 0.88</w:t>
-            </w:r>
-          </w:p>
-        </w:tc>
-        <w:tc>
-          <w:tcPr>
-            <w:tcW w:type="dxa" w:w="2351"/>
-          </w:tcPr>
-          <w:p>
-            <w:r/>
-            <w:r>
-              <w:rPr>
-                <w:rFonts w:ascii="Microsoft YaHei" w:hAnsi="Microsoft YaHei" w:eastAsia="Microsoft YaHei"/>
-                <w:b w:val="0"/>
-                <w:sz w:val="18"/>
-              </w:rPr>
-              <w:t>通过</w:t>
-            </w:r>
-          </w:p>
-        </w:tc>
-      </w:tr>
-      <w:tr>
-        <w:tc>
-          <w:tcPr>
-            <w:tcW w:type="dxa" w:w="2351"/>
-          </w:tcPr>
-          <w:p>
-            <w:r/>
-            <w:r>
-              <w:rPr>
-                <w:rFonts w:ascii="Microsoft YaHei" w:hAnsi="Microsoft YaHei" w:eastAsia="Microsoft YaHei"/>
-                <w:b w:val="0"/>
-                <w:sz w:val="18"/>
-              </w:rPr>
-              <w:t>遗忘 Precision / Recall / F1</w:t>
-            </w:r>
-          </w:p>
-        </w:tc>
-        <w:tc>
-          <w:tcPr>
-            <w:tcW w:type="dxa" w:w="2351"/>
-          </w:tcPr>
-          <w:p>
-            <w:r/>
-            <w:r>
-              <w:rPr>
-                <w:rFonts w:ascii="Microsoft YaHei" w:hAnsi="Microsoft YaHei" w:eastAsia="Microsoft YaHei"/>
-                <w:b w:val="0"/>
-                <w:sz w:val="18"/>
-              </w:rPr>
-              <w:t>1.0 / 1.0 / 1.0</w:t>
-            </w:r>
-          </w:p>
-        </w:tc>
-        <w:tc>
-          <w:tcPr>
-            <w:tcW w:type="dxa" w:w="2351"/>
-          </w:tcPr>
-          <w:p>
-            <w:r/>
-            <w:r>
-              <w:rPr>
-                <w:rFonts w:ascii="Microsoft YaHei" w:hAnsi="Microsoft YaHei" w:eastAsia="Microsoft YaHei"/>
-                <w:b w:val="0"/>
-                <w:sz w:val="18"/>
-              </w:rPr>
-              <w:t>F1 ≥ 0.85</w:t>
-            </w:r>
-          </w:p>
-        </w:tc>
-        <w:tc>
-          <w:tcPr>
-            <w:tcW w:type="dxa" w:w="2351"/>
-          </w:tcPr>
-          <w:p>
-            <w:r/>
-            <w:r>
-              <w:rPr>
-                <w:rFonts w:ascii="Microsoft YaHei" w:hAnsi="Microsoft YaHei" w:eastAsia="Microsoft YaHei"/>
-                <w:b w:val="0"/>
-                <w:sz w:val="18"/>
-              </w:rPr>
-              <w:t>通过</w:t>
-            </w:r>
-          </w:p>
-        </w:tc>
-      </w:tr>
-      <w:tr>
-        <w:tc>
-          <w:tcPr>
-            <w:tcW w:type="dxa" w:w="2351"/>
-          </w:tcPr>
-          <w:p>
-            <w:r/>
-            <w:r>
-              <w:rPr>
-                <w:rFonts w:ascii="Microsoft YaHei" w:hAnsi="Microsoft YaHei" w:eastAsia="Microsoft YaHei"/>
-                <w:b w:val="0"/>
-                <w:sz w:val="18"/>
-              </w:rPr>
-              <w:t>遗忘误删率</w:t>
-            </w:r>
-          </w:p>
-        </w:tc>
-        <w:tc>
-          <w:tcPr>
-            <w:tcW w:type="dxa" w:w="2351"/>
-          </w:tcPr>
-          <w:p>
-            <w:r/>
-            <w:r>
-              <w:rPr>
-                <w:rFonts w:ascii="Microsoft YaHei" w:hAnsi="Microsoft YaHei" w:eastAsia="Microsoft YaHei"/>
-                <w:b w:val="0"/>
-                <w:sz w:val="18"/>
-              </w:rPr>
-              <w:t>0</w:t>
-            </w:r>
-          </w:p>
-        </w:tc>
-        <w:tc>
-          <w:tcPr>
-            <w:tcW w:type="dxa" w:w="2351"/>
-          </w:tcPr>
-          <w:p>
-            <w:r/>
-            <w:r>
-              <w:rPr>
-                <w:rFonts w:ascii="Microsoft YaHei" w:hAnsi="Microsoft YaHei" w:eastAsia="Microsoft YaHei"/>
-                <w:b w:val="0"/>
-                <w:sz w:val="18"/>
-              </w:rPr>
-              <w:t>= 0</w:t>
-            </w:r>
-          </w:p>
-        </w:tc>
-        <w:tc>
-          <w:tcPr>
-            <w:tcW w:type="dxa" w:w="2351"/>
-          </w:tcPr>
-          <w:p>
-            <w:r/>
-            <w:r>
-              <w:rPr>
-                <w:rFonts w:ascii="Microsoft YaHei" w:hAnsi="Microsoft YaHei" w:eastAsia="Microsoft YaHei"/>
-                <w:b w:val="0"/>
-                <w:sz w:val="18"/>
-              </w:rPr>
-              <w:t>通过</w:t>
-            </w:r>
-          </w:p>
-        </w:tc>
-      </w:tr>
-    </w:tbl>
-    <w:p>
-      <w:pPr>
-        <w:spacing w:line="324" w:lineRule="auto"/>
-      </w:pPr>
-      <w:r>
-        <w:rPr>
-          <w:rFonts w:ascii="Microsoft YaHei" w:hAnsi="Microsoft YaHei" w:eastAsia="Microsoft YaHei"/>
-          <w:sz w:val="21"/>
-        </w:rPr>
-        <w:t>说明：合成标签上的 1.0 不能外推到开放真实数据。检索 Precision 目标较低，是因为每条查询只标注一个期望标题而 top-K 最多返回三项；真实盲测应补充完整相关性分级并重设阈值。</w:t>
-      </w:r>
-    </w:p>
-    <w:p>
-      <w:pPr>
-        <w:pStyle w:val="Heading2"/>
-      </w:pPr>
-      <w:r>
-        <w:t>7. 规模性能结果</w:t>
-      </w:r>
-    </w:p>
-    <w:tbl>
-      <w:tblPr>
-        <w:tblStyle w:val="TableGrid"/>
-        <w:tblW w:type="auto" w:w="0"/>
-        <w:tblLook w:firstColumn="1" w:firstRow="1" w:lastColumn="0" w:lastRow="0" w:noHBand="0" w:noVBand="1" w:val="04A0"/>
-      </w:tblPr>
-      <w:tblGrid>
-        <w:gridCol w:w="941"/>
-        <w:gridCol w:w="941"/>
-        <w:gridCol w:w="941"/>
-        <w:gridCol w:w="941"/>
-        <w:gridCol w:w="941"/>
-        <w:gridCol w:w="941"/>
-        <w:gridCol w:w="941"/>
-        <w:gridCol w:w="941"/>
-        <w:gridCol w:w="941"/>
-        <w:gridCol w:w="941"/>
-      </w:tblGrid>
-      <w:tr>
-        <w:tc>
-          <w:tcPr>
-            <w:tcW w:type="dxa" w:w="941"/>
-          </w:tcPr>
-          <w:p>
-            <w:r/>
-            <w:r>
-              <w:rPr>
-                <w:rFonts w:ascii="Microsoft YaHei" w:hAnsi="Microsoft YaHei" w:eastAsia="Microsoft YaHei"/>
-                <w:b/>
-                <w:sz w:val="18"/>
-              </w:rPr>
-              <w:t>记录数</w:t>
-            </w:r>
-          </w:p>
-        </w:tc>
-        <w:tc>
-          <w:tcPr>
-            <w:tcW w:type="dxa" w:w="941"/>
-          </w:tcPr>
-          <w:p>
-            <w:r/>
-            <w:r>
-              <w:rPr>
-                <w:rFonts w:ascii="Microsoft YaHei" w:hAnsi="Microsoft YaHei" w:eastAsia="Microsoft YaHei"/>
-                <w:b/>
-                <w:sz w:val="18"/>
-              </w:rPr>
-              <w:t>建索引 ms</w:t>
-            </w:r>
-          </w:p>
-        </w:tc>
-        <w:tc>
-          <w:tcPr>
-            <w:tcW w:type="dxa" w:w="941"/>
+            <w:tcW w:type="dxa" w:w="1881"/>
           </w:tcPr>
           <w:p>
             <w:r/>
@@ -3493,39 +2788,7 @@
         </w:tc>
         <w:tc>
           <w:tcPr>
-            <w:tcW w:type="dxa" w:w="941"/>
-          </w:tcPr>
-          <w:p>
-            <w:r/>
-            <w:r>
-              <w:rPr>
-                <w:rFonts w:ascii="Microsoft YaHei" w:hAnsi="Microsoft YaHei" w:eastAsia="Microsoft YaHei"/>
-                <w:b/>
-                <w:sz w:val="18"/>
-              </w:rPr>
-              <w:t>热 p50 ms</w:t>
-            </w:r>
-          </w:p>
-        </w:tc>
-        <w:tc>
-          <w:tcPr>
-            <w:tcW w:type="dxa" w:w="941"/>
-          </w:tcPr>
-          <w:p>
-            <w:r/>
-            <w:r>
-              <w:rPr>
-                <w:rFonts w:ascii="Microsoft YaHei" w:hAnsi="Microsoft YaHei" w:eastAsia="Microsoft YaHei"/>
-                <w:b/>
-                <w:sz w:val="18"/>
-              </w:rPr>
-              <w:t>热 p95 ms</w:t>
-            </w:r>
-          </w:p>
-        </w:tc>
-        <w:tc>
-          <w:tcPr>
-            <w:tcW w:type="dxa" w:w="941"/>
+            <w:tcW w:type="dxa" w:w="1881"/>
           </w:tcPr>
           <w:p>
             <w:r/>
@@ -3541,7 +2804,7 @@
         </w:tc>
         <w:tc>
           <w:tcPr>
-            <w:tcW w:type="dxa" w:w="941"/>
+            <w:tcW w:type="dxa" w:w="1881"/>
           </w:tcPr>
           <w:p>
             <w:r/>
@@ -3551,29 +2814,13 @@
                 <w:b/>
                 <w:sz w:val="18"/>
               </w:rPr>
-              <w:t>QPS</w:t>
+              <w:t>Python 峰值 MB</w:t>
             </w:r>
           </w:p>
         </w:tc>
         <w:tc>
           <w:tcPr>
-            <w:tcW w:type="dxa" w:w="941"/>
-          </w:tcPr>
-          <w:p>
-            <w:r/>
-            <w:r>
-              <w:rPr>
-                <w:rFonts w:ascii="Microsoft YaHei" w:hAnsi="Microsoft YaHei" w:eastAsia="Microsoft YaHei"/>
-                <w:b/>
-                <w:sz w:val="18"/>
-              </w:rPr>
-              <w:t>峰值内存 MB</w:t>
-            </w:r>
-          </w:p>
-        </w:tc>
-        <w:tc>
-          <w:tcPr>
-            <w:tcW w:type="dxa" w:w="941"/>
+            <w:tcW w:type="dxa" w:w="1881"/>
           </w:tcPr>
           <w:p>
             <w:r/>
@@ -3587,27 +2834,11 @@
             </w:r>
           </w:p>
         </w:tc>
-        <w:tc>
-          <w:tcPr>
-            <w:tcW w:type="dxa" w:w="941"/>
-          </w:tcPr>
-          <w:p>
-            <w:r/>
-            <w:r>
-              <w:rPr>
-                <w:rFonts w:ascii="Microsoft YaHei" w:hAnsi="Microsoft YaHei" w:eastAsia="Microsoft YaHei"/>
-                <w:b/>
-                <w:sz w:val="18"/>
-              </w:rPr>
-              <w:t>500ms</w:t>
-            </w:r>
-          </w:p>
-        </w:tc>
       </w:tr>
       <w:tr>
         <w:tc>
           <w:tcPr>
-            <w:tcW w:type="dxa" w:w="941"/>
+            <w:tcW w:type="dxa" w:w="1881"/>
           </w:tcPr>
           <w:p>
             <w:r/>
@@ -3623,7 +2854,7 @@
         </w:tc>
         <w:tc>
           <w:tcPr>
-            <w:tcW w:type="dxa" w:w="941"/>
+            <w:tcW w:type="dxa" w:w="1881"/>
           </w:tcPr>
           <w:p>
             <w:r/>
@@ -3633,13 +2864,13 @@
                 <w:b w:val="0"/>
                 <w:sz w:val="18"/>
               </w:rPr>
-              <w:t>94.781</w:t>
+              <w:t>11.548</w:t>
             </w:r>
           </w:p>
         </w:tc>
         <w:tc>
           <w:tcPr>
-            <w:tcW w:type="dxa" w:w="941"/>
+            <w:tcW w:type="dxa" w:w="1881"/>
           </w:tcPr>
           <w:p>
             <w:r/>
@@ -3649,13 +2880,13 @@
                 <w:b w:val="0"/>
                 <w:sz w:val="18"/>
               </w:rPr>
-              <w:t>4.653</w:t>
+              <w:t>11.653</w:t>
             </w:r>
           </w:p>
         </w:tc>
         <w:tc>
           <w:tcPr>
-            <w:tcW w:type="dxa" w:w="941"/>
+            <w:tcW w:type="dxa" w:w="1881"/>
           </w:tcPr>
           <w:p>
             <w:r/>
@@ -3665,13 +2896,13 @@
                 <w:b w:val="0"/>
                 <w:sz w:val="18"/>
               </w:rPr>
-              <w:t>4.434</w:t>
+              <w:t>1.999</w:t>
             </w:r>
           </w:p>
         </w:tc>
         <w:tc>
           <w:tcPr>
-            <w:tcW w:type="dxa" w:w="941"/>
+            <w:tcW w:type="dxa" w:w="1881"/>
           </w:tcPr>
           <w:p>
             <w:r/>
@@ -3681,13 +2912,15 @@
                 <w:b w:val="0"/>
                 <w:sz w:val="18"/>
               </w:rPr>
-              <w:t>5.395</w:t>
+              <w:t>0.449</w:t>
             </w:r>
           </w:p>
         </w:tc>
+      </w:tr>
+      <w:tr>
         <w:tc>
           <w:tcPr>
-            <w:tcW w:type="dxa" w:w="941"/>
+            <w:tcW w:type="dxa" w:w="1881"/>
           </w:tcPr>
           <w:p>
             <w:r/>
@@ -3697,13 +2930,13 @@
                 <w:b w:val="0"/>
                 <w:sz w:val="18"/>
               </w:rPr>
-              <w:t>6.035</w:t>
+              <w:t>1000</w:t>
             </w:r>
           </w:p>
         </w:tc>
         <w:tc>
           <w:tcPr>
-            <w:tcW w:type="dxa" w:w="941"/>
+            <w:tcW w:type="dxa" w:w="1881"/>
           </w:tcPr>
           <w:p>
             <w:r/>
@@ -3713,13 +2946,13 @@
                 <w:b w:val="0"/>
                 <w:sz w:val="18"/>
               </w:rPr>
-              <w:t>220.27</w:t>
+              <w:t>19.82</w:t>
             </w:r>
           </w:p>
         </w:tc>
         <w:tc>
           <w:tcPr>
-            <w:tcW w:type="dxa" w:w="941"/>
+            <w:tcW w:type="dxa" w:w="1881"/>
           </w:tcPr>
           <w:p>
             <w:r/>
@@ -3729,13 +2962,13 @@
                 <w:b w:val="0"/>
                 <w:sz w:val="18"/>
               </w:rPr>
-              <w:t>1.782</w:t>
+              <w:t>25.8</w:t>
             </w:r>
           </w:p>
         </w:tc>
         <w:tc>
           <w:tcPr>
-            <w:tcW w:type="dxa" w:w="941"/>
+            <w:tcW w:type="dxa" w:w="1881"/>
           </w:tcPr>
           <w:p>
             <w:r/>
@@ -3745,13 +2978,13 @@
                 <w:b w:val="0"/>
                 <w:sz w:val="18"/>
               </w:rPr>
-              <w:t>0.441</w:t>
+              <w:t>16.987</w:t>
             </w:r>
           </w:p>
         </w:tc>
         <w:tc>
           <w:tcPr>
-            <w:tcW w:type="dxa" w:w="941"/>
+            <w:tcW w:type="dxa" w:w="1881"/>
           </w:tcPr>
           <w:p>
             <w:r/>
@@ -3761,7 +2994,7 @@
                 <w:b w:val="0"/>
                 <w:sz w:val="18"/>
               </w:rPr>
-              <w:t>是</w:t>
+              <w:t>4.047</w:t>
             </w:r>
           </w:p>
         </w:tc>
@@ -3769,7 +3002,7 @@
       <w:tr>
         <w:tc>
           <w:tcPr>
-            <w:tcW w:type="dxa" w:w="941"/>
+            <w:tcW w:type="dxa" w:w="1881"/>
           </w:tcPr>
           <w:p>
             <w:r/>
@@ -3779,13 +3012,13 @@
                 <w:b w:val="0"/>
                 <w:sz w:val="18"/>
               </w:rPr>
-              <w:t>1,000</w:t>
+              <w:t>5000</w:t>
             </w:r>
           </w:p>
         </w:tc>
         <w:tc>
           <w:tcPr>
-            <w:tcW w:type="dxa" w:w="941"/>
+            <w:tcW w:type="dxa" w:w="1881"/>
           </w:tcPr>
           <w:p>
             <w:r/>
@@ -3795,13 +3028,13 @@
                 <w:b w:val="0"/>
                 <w:sz w:val="18"/>
               </w:rPr>
-              <w:t>974.794</w:t>
+              <w:t>51.003</w:t>
             </w:r>
           </w:p>
         </w:tc>
         <w:tc>
           <w:tcPr>
-            <w:tcW w:type="dxa" w:w="941"/>
+            <w:tcW w:type="dxa" w:w="1881"/>
           </w:tcPr>
           <w:p>
             <w:r/>
@@ -3811,13 +3044,13 @@
                 <w:b w:val="0"/>
                 <w:sz w:val="18"/>
               </w:rPr>
-              <w:t>9.092</w:t>
+              <w:t>53.761</w:t>
             </w:r>
           </w:p>
         </w:tc>
         <w:tc>
           <w:tcPr>
-            <w:tcW w:type="dxa" w:w="941"/>
+            <w:tcW w:type="dxa" w:w="1881"/>
           </w:tcPr>
           <w:p>
             <w:r/>
@@ -3827,13 +3060,13 @@
                 <w:b w:val="0"/>
                 <w:sz w:val="18"/>
               </w:rPr>
-              <w:t>9.057</w:t>
+              <w:t>100.58</w:t>
             </w:r>
           </w:p>
         </w:tc>
         <w:tc>
           <w:tcPr>
-            <w:tcW w:type="dxa" w:w="941"/>
+            <w:tcW w:type="dxa" w:w="1881"/>
           </w:tcPr>
           <w:p>
             <w:r/>
@@ -3843,13 +3076,15 @@
                 <w:b w:val="0"/>
                 <w:sz w:val="18"/>
               </w:rPr>
-              <w:t>11.038</w:t>
+              <w:t>20.02</w:t>
             </w:r>
           </w:p>
         </w:tc>
+      </w:tr>
+      <w:tr>
         <w:tc>
           <w:tcPr>
-            <w:tcW w:type="dxa" w:w="941"/>
+            <w:tcW w:type="dxa" w:w="1881"/>
           </w:tcPr>
           <w:p>
             <w:r/>
@@ -3859,13 +3094,13 @@
                 <w:b w:val="0"/>
                 <w:sz w:val="18"/>
               </w:rPr>
-              <w:t>12.398</w:t>
+              <w:t>10000</w:t>
             </w:r>
           </w:p>
         </w:tc>
         <w:tc>
           <w:tcPr>
-            <w:tcW w:type="dxa" w:w="941"/>
+            <w:tcW w:type="dxa" w:w="1881"/>
           </w:tcPr>
           <w:p>
             <w:r/>
@@ -3875,13 +3110,13 @@
                 <w:b w:val="0"/>
                 <w:sz w:val="18"/>
               </w:rPr>
-              <w:t>107.08</w:t>
+              <w:t>96.972</w:t>
             </w:r>
           </w:p>
         </w:tc>
         <w:tc>
           <w:tcPr>
-            <w:tcW w:type="dxa" w:w="941"/>
+            <w:tcW w:type="dxa" w:w="1881"/>
           </w:tcPr>
           <w:p>
             <w:r/>
@@ -3891,13 +3126,13 @@
                 <w:b w:val="0"/>
                 <w:sz w:val="18"/>
               </w:rPr>
-              <w:t>15.327</w:t>
+              <w:t>129.045</w:t>
             </w:r>
           </w:p>
         </w:tc>
         <w:tc>
           <w:tcPr>
-            <w:tcW w:type="dxa" w:w="941"/>
+            <w:tcW w:type="dxa" w:w="1881"/>
           </w:tcPr>
           <w:p>
             <w:r/>
@@ -3907,13 +3142,13 @@
                 <w:b w:val="0"/>
                 <w:sz w:val="18"/>
               </w:rPr>
-              <w:t>4.039</w:t>
+              <w:t>178.782</w:t>
             </w:r>
           </w:p>
         </w:tc>
         <w:tc>
           <w:tcPr>
-            <w:tcW w:type="dxa" w:w="941"/>
+            <w:tcW w:type="dxa" w:w="1881"/>
           </w:tcPr>
           <w:p>
             <w:r/>
@@ -3923,7 +3158,132 @@
                 <w:b w:val="0"/>
                 <w:sz w:val="18"/>
               </w:rPr>
-              <w:t>是</w:t>
+              <w:t>39.984</w:t>
+            </w:r>
+          </w:p>
+        </w:tc>
+      </w:tr>
+    </w:tbl>
+    <w:p>
+      <w:pPr>
+        <w:spacing w:line="324" w:lineRule="auto"/>
+      </w:pPr>
+      <w:r>
+        <w:rPr>
+          <w:rFonts w:ascii="Microsoft YaHei" w:hAnsi="Microsoft YaHei" w:eastAsia="Microsoft YaHei"/>
+          <w:sz w:val="21"/>
+        </w:rPr>
+        <w:t>上表是 Windows + HashEmbedding 检索规模基准；新增实际服务负载另计生命周期、冲突、SQLite 和 HTTP：</w:t>
+      </w:r>
+    </w:p>
+    <w:tbl>
+      <w:tblPr>
+        <w:tblStyle w:val="TableGrid"/>
+        <w:tblW w:type="auto" w:w="0"/>
+        <w:tblLook w:firstColumn="1" w:firstRow="1" w:lastColumn="0" w:lastRow="0" w:noHBand="0" w:noVBand="1" w:val="04A0"/>
+      </w:tblPr>
+      <w:tblGrid>
+        <w:gridCol w:w="1568"/>
+        <w:gridCol w:w="1568"/>
+        <w:gridCol w:w="1568"/>
+        <w:gridCol w:w="1568"/>
+        <w:gridCol w:w="1568"/>
+        <w:gridCol w:w="1568"/>
+      </w:tblGrid>
+      <w:tr>
+        <w:tc>
+          <w:tcPr>
+            <w:tcW w:type="dxa" w:w="1568"/>
+          </w:tcPr>
+          <w:p>
+            <w:r/>
+            <w:r>
+              <w:rPr>
+                <w:rFonts w:ascii="Microsoft YaHei" w:hAnsi="Microsoft YaHei" w:eastAsia="Microsoft YaHei"/>
+                <w:b/>
+                <w:sz w:val="18"/>
+              </w:rPr>
+              <w:t>初始知识</w:t>
+            </w:r>
+          </w:p>
+        </w:tc>
+        <w:tc>
+          <w:tcPr>
+            <w:tcW w:type="dxa" w:w="1568"/>
+          </w:tcPr>
+          <w:p>
+            <w:r/>
+            <w:r>
+              <w:rPr>
+                <w:rFonts w:ascii="Microsoft YaHei" w:hAnsi="Microsoft YaHei" w:eastAsia="Microsoft YaHei"/>
+                <w:b/>
+                <w:sz w:val="18"/>
+              </w:rPr>
+              <w:t>批量接入 ms</w:t>
+            </w:r>
+          </w:p>
+        </w:tc>
+        <w:tc>
+          <w:tcPr>
+            <w:tcW w:type="dxa" w:w="1568"/>
+          </w:tcPr>
+          <w:p>
+            <w:r/>
+            <w:r>
+              <w:rPr>
+                <w:rFonts w:ascii="Microsoft YaHei" w:hAnsi="Microsoft YaHei" w:eastAsia="Microsoft YaHei"/>
+                <w:b/>
+                <w:sz w:val="18"/>
+              </w:rPr>
+              <w:t>单条追加 ms</w:t>
+            </w:r>
+          </w:p>
+        </w:tc>
+        <w:tc>
+          <w:tcPr>
+            <w:tcW w:type="dxa" w:w="1568"/>
+          </w:tcPr>
+          <w:p>
+            <w:r/>
+            <w:r>
+              <w:rPr>
+                <w:rFonts w:ascii="Microsoft YaHei" w:hAnsi="Microsoft YaHei" w:eastAsia="Microsoft YaHei"/>
+                <w:b/>
+                <w:sz w:val="18"/>
+              </w:rPr>
+              <w:t>重启加载 ms</w:t>
+            </w:r>
+          </w:p>
+        </w:tc>
+        <w:tc>
+          <w:tcPr>
+            <w:tcW w:type="dxa" w:w="1568"/>
+          </w:tcPr>
+          <w:p>
+            <w:r/>
+            <w:r>
+              <w:rPr>
+                <w:rFonts w:ascii="Microsoft YaHei" w:hAnsi="Microsoft YaHei" w:eastAsia="Microsoft YaHei"/>
+                <w:b/>
+                <w:sz w:val="18"/>
+              </w:rPr>
+              <w:t>混合查询 p99 ms</w:t>
+            </w:r>
+          </w:p>
+        </w:tc>
+        <w:tc>
+          <w:tcPr>
+            <w:tcW w:type="dxa" w:w="1568"/>
+          </w:tcPr>
+          <w:p>
+            <w:r/>
+            <w:r>
+              <w:rPr>
+                <w:rFonts w:ascii="Microsoft YaHei" w:hAnsi="Microsoft YaHei" w:eastAsia="Microsoft YaHei"/>
+                <w:b/>
+                <w:sz w:val="18"/>
+              </w:rPr>
+              <w:t>HTTP p99 ms</w:t>
             </w:r>
           </w:p>
         </w:tc>
@@ -3931,7 +3291,7 @@
       <w:tr>
         <w:tc>
           <w:tcPr>
-            <w:tcW w:type="dxa" w:w="941"/>
+            <w:tcW w:type="dxa" w:w="1568"/>
           </w:tcPr>
           <w:p>
             <w:r/>
@@ -3941,13 +3301,13 @@
                 <w:b w:val="0"/>
                 <w:sz w:val="18"/>
               </w:rPr>
-              <w:t>5,000</w:t>
+              <w:t>100</w:t>
             </w:r>
           </w:p>
         </w:tc>
         <w:tc>
           <w:tcPr>
-            <w:tcW w:type="dxa" w:w="941"/>
+            <w:tcW w:type="dxa" w:w="1568"/>
           </w:tcPr>
           <w:p>
             <w:r/>
@@ -3957,13 +3317,13 @@
                 <w:b w:val="0"/>
                 <w:sz w:val="18"/>
               </w:rPr>
-              <w:t>7,463.104</w:t>
+              <w:t>179.808</w:t>
             </w:r>
           </w:p>
         </w:tc>
         <w:tc>
           <w:tcPr>
-            <w:tcW w:type="dxa" w:w="941"/>
+            <w:tcW w:type="dxa" w:w="1568"/>
           </w:tcPr>
           <w:p>
             <w:r/>
@@ -3973,13 +3333,13 @@
                 <w:b w:val="0"/>
                 <w:sz w:val="18"/>
               </w:rPr>
-              <w:t>37.034</w:t>
+              <w:t>49.313</w:t>
             </w:r>
           </w:p>
         </w:tc>
         <w:tc>
           <w:tcPr>
-            <w:tcW w:type="dxa" w:w="941"/>
+            <w:tcW w:type="dxa" w:w="1568"/>
           </w:tcPr>
           <w:p>
             <w:r/>
@@ -3989,13 +3349,13 @@
                 <w:b w:val="0"/>
                 <w:sz w:val="18"/>
               </w:rPr>
-              <w:t>46.273</w:t>
+              <w:t>30.5</w:t>
             </w:r>
           </w:p>
         </w:tc>
         <w:tc>
           <w:tcPr>
-            <w:tcW w:type="dxa" w:w="941"/>
+            <w:tcW w:type="dxa" w:w="1568"/>
           </w:tcPr>
           <w:p>
             <w:r/>
@@ -4005,13 +3365,13 @@
                 <w:b w:val="0"/>
                 <w:sz w:val="18"/>
               </w:rPr>
-              <w:t>66.981</w:t>
+              <w:t>3.106</w:t>
             </w:r>
           </w:p>
         </w:tc>
         <w:tc>
           <w:tcPr>
-            <w:tcW w:type="dxa" w:w="941"/>
+            <w:tcW w:type="dxa" w:w="1568"/>
           </w:tcPr>
           <w:p>
             <w:r/>
@@ -4021,13 +3381,15 @@
                 <w:b w:val="0"/>
                 <w:sz w:val="18"/>
               </w:rPr>
-              <w:t>70.032</w:t>
+              <w:t>33.248</w:t>
             </w:r>
           </w:p>
         </w:tc>
+      </w:tr>
+      <w:tr>
         <w:tc>
           <w:tcPr>
-            <w:tcW w:type="dxa" w:w="941"/>
+            <w:tcW w:type="dxa" w:w="1568"/>
           </w:tcPr>
           <w:p>
             <w:r/>
@@ -4037,13 +3399,13 @@
                 <w:b w:val="0"/>
                 <w:sz w:val="18"/>
               </w:rPr>
-              <w:t>22.03</w:t>
+              <w:t>1000</w:t>
             </w:r>
           </w:p>
         </w:tc>
         <w:tc>
           <w:tcPr>
-            <w:tcW w:type="dxa" w:w="941"/>
+            <w:tcW w:type="dxa" w:w="1568"/>
           </w:tcPr>
           <w:p>
             <w:r/>
@@ -4053,13 +3415,13 @@
                 <w:b w:val="0"/>
                 <w:sz w:val="18"/>
               </w:rPr>
-              <w:t>90.723</w:t>
+              <w:t>4152.665</w:t>
             </w:r>
           </w:p>
         </w:tc>
         <w:tc>
           <w:tcPr>
-            <w:tcW w:type="dxa" w:w="941"/>
+            <w:tcW w:type="dxa" w:w="1568"/>
           </w:tcPr>
           <w:p>
             <w:r/>
@@ -4069,13 +3431,13 @@
                 <w:b w:val="0"/>
                 <w:sz w:val="18"/>
               </w:rPr>
-              <w:t>20.012</w:t>
+              <w:t>300.196</w:t>
             </w:r>
           </w:p>
         </w:tc>
         <w:tc>
           <w:tcPr>
-            <w:tcW w:type="dxa" w:w="941"/>
+            <w:tcW w:type="dxa" w:w="1568"/>
           </w:tcPr>
           <w:p>
             <w:r/>
@@ -4085,15 +3447,13 @@
                 <w:b w:val="0"/>
                 <w:sz w:val="18"/>
               </w:rPr>
-              <w:t>是</w:t>
+              <w:t>183.747</w:t>
             </w:r>
           </w:p>
         </w:tc>
-      </w:tr>
-      <w:tr>
         <w:tc>
           <w:tcPr>
-            <w:tcW w:type="dxa" w:w="941"/>
+            <w:tcW w:type="dxa" w:w="1568"/>
           </w:tcPr>
           <w:p>
             <w:r/>
@@ -4103,13 +3463,13 @@
                 <w:b w:val="0"/>
                 <w:sz w:val="18"/>
               </w:rPr>
-              <w:t>10,000</w:t>
+              <w:t>8.707</w:t>
             </w:r>
           </w:p>
         </w:tc>
         <w:tc>
           <w:tcPr>
-            <w:tcW w:type="dxa" w:w="941"/>
+            <w:tcW w:type="dxa" w:w="1568"/>
           </w:tcPr>
           <w:p>
             <w:r/>
@@ -4119,13 +3479,187 @@
                 <w:b w:val="0"/>
                 <w:sz w:val="18"/>
               </w:rPr>
-              <w:t>16,066.888</w:t>
+              <w:t>33.692</w:t>
+            </w:r>
+          </w:p>
+        </w:tc>
+      </w:tr>
+    </w:tbl>
+    <w:p>
+      <w:pPr>
+        <w:spacing w:line="324" w:lineRule="auto"/>
+      </w:pPr>
+      <w:r>
+        <w:rPr>
+          <w:rFonts w:ascii="Microsoft YaHei" w:hAnsi="Microsoft YaHei" w:eastAsia="Microsoft YaHei"/>
+          <w:sz w:val="21"/>
+        </w:rPr>
+        <w:t>实际服务负载使用 4 线程混合读写，检查重启后记录数与查询非空；非空不等于检索准确。</w:t>
+      </w:r>
+    </w:p>
+    <w:p>
+      <w:pPr>
+        <w:spacing w:line="324" w:lineRule="auto"/>
+      </w:pPr>
+      <w:r>
+        <w:rPr>
+          <w:rFonts w:ascii="Microsoft YaHei" w:hAnsi="Microsoft YaHei" w:eastAsia="Microsoft YaHei"/>
+          <w:sz w:val="21"/>
+        </w:rPr>
+        <w:t>p99 为少量采样经验值，不是生产 SLA。当前事务为单进程串行写，增量落盘仍需比较当前状态，</w:t>
+      </w:r>
+    </w:p>
+    <w:p>
+      <w:pPr>
+        <w:spacing w:line="324" w:lineRule="auto"/>
+      </w:pPr>
+      <w:r>
+        <w:rPr>
+          <w:rFonts w:ascii="Microsoft YaHei" w:hAnsi="Microsoft YaHei" w:eastAsia="Microsoft YaHei"/>
+          <w:sz w:val="21"/>
+        </w:rPr>
+        <w:t>回滚快照有内存成本；多个进程同时写同一数据库尚不支持。</w:t>
+      </w:r>
+    </w:p>
+    <w:p>
+      <w:pPr>
+        <w:pStyle w:val="Heading2"/>
+      </w:pPr>
+      <w:r>
+        <w:t>复现与证据</w:t>
+      </w:r>
+    </w:p>
+    <w:p>
+      <w:pPr>
+        <w:pStyle w:val="NoSpacing"/>
+      </w:pPr>
+      <w:r>
+        <w:rPr>
+          <w:rFonts w:ascii="Consolas" w:hAnsi="Consolas"/>
+          <w:sz w:val="16"/>
+        </w:rPr>
+        <w:t>python -S -m unittest discover -s tests -v</w:t>
+        <w:br/>
+        <w:t>python scripts/check_source.py</w:t>
+        <w:br/>
+        <w:t>node scripts/check_dashboard.cjs</w:t>
+        <w:br/>
+        <w:t>python scripts/evaluate_v3.py --embedding-config config/embedding.hash.json</w:t>
+        <w:br/>
+        <w:t>python scripts/benchmark_service.py --sizes 100,1000 --rounds 30</w:t>
+        <w:br/>
+        <w:t>python scripts/verify_release.py --artifact-dir artifacts/runtime/verification --sizes 100,1000,5000,10000 --rounds 30</w:t>
+      </w:r>
+    </w:p>
+    <w:p>
+      <w:pPr>
+        <w:spacing w:line="324" w:lineRule="auto"/>
+      </w:pPr>
+      <w:r>
+        <w:rPr>
+          <w:rFonts w:ascii="Microsoft YaHei" w:hAnsi="Microsoft YaHei" w:eastAsia="Microsoft YaHei"/>
+          <w:sz w:val="21"/>
+        </w:rPr>
+        <w:t>固定证据：artifacts/verification/round2/；服务基准：round2_service_after.json。</w:t>
+      </w:r>
+    </w:p>
+    <w:p>
+      <w:pPr>
+        <w:spacing w:line="324" w:lineRule="auto"/>
+      </w:pPr>
+      <w:r>
+        <w:rPr>
+          <w:rFonts w:ascii="Microsoft YaHei" w:hAnsi="Microsoft YaHei" w:eastAsia="Microsoft YaHei"/>
+          <w:sz w:val="21"/>
+        </w:rPr>
+        <w:t>CI 配置覆盖 Windows/Linux 与 Python 3.10/3.14；配置存在不等于所有远端任务已通过，以 GitHub Actions 实际结果为准。</w:t>
+      </w:r>
+    </w:p>
+    <w:p>
+      <w:pPr>
+        <w:spacing w:line="324" w:lineRule="auto"/>
+      </w:pPr>
+      <w:r>
+        <w:rPr>
+          <w:rFonts w:ascii="Microsoft YaHei" w:hAnsi="Microsoft YaHei" w:eastAsia="Microsoft YaHei"/>
+          <w:sz w:val="21"/>
+        </w:rPr>
+        <w:t>Python 3.10 语法检查及本机完整测试、wheel 构建独立记录。</w:t>
+      </w:r>
+    </w:p>
+    <w:p>
+      <w:pPr>
+        <w:pStyle w:val="Heading2"/>
+      </w:pPr>
+      <w:r>
+        <w:t>功能与证据对应</w:t>
+      </w:r>
+    </w:p>
+    <w:tbl>
+      <w:tblPr>
+        <w:tblStyle w:val="TableGrid"/>
+        <w:tblW w:type="auto" w:w="0"/>
+        <w:tblLook w:firstColumn="1" w:firstRow="1" w:lastColumn="0" w:lastRow="0" w:noHBand="0" w:noVBand="1" w:val="04A0"/>
+      </w:tblPr>
+      <w:tblGrid>
+        <w:gridCol w:w="3135"/>
+        <w:gridCol w:w="3135"/>
+        <w:gridCol w:w="3135"/>
+      </w:tblGrid>
+      <w:tr>
+        <w:tc>
+          <w:tcPr>
+            <w:tcW w:type="dxa" w:w="3135"/>
+          </w:tcPr>
+          <w:p>
+            <w:r/>
+            <w:r>
+              <w:rPr>
+                <w:rFonts w:ascii="Microsoft YaHei" w:hAnsi="Microsoft YaHei" w:eastAsia="Microsoft YaHei"/>
+                <w:b/>
+                <w:sz w:val="18"/>
+              </w:rPr>
+              <w:t>设计</w:t>
             </w:r>
           </w:p>
         </w:tc>
         <w:tc>
           <w:tcPr>
-            <w:tcW w:type="dxa" w:w="941"/>
+            <w:tcW w:type="dxa" w:w="3135"/>
+          </w:tcPr>
+          <w:p>
+            <w:r/>
+            <w:r>
+              <w:rPr>
+                <w:rFonts w:ascii="Microsoft YaHei" w:hAnsi="Microsoft YaHei" w:eastAsia="Microsoft YaHei"/>
+                <w:b/>
+                <w:sz w:val="18"/>
+              </w:rPr>
+              <w:t>证据</w:t>
+            </w:r>
+          </w:p>
+        </w:tc>
+        <w:tc>
+          <w:tcPr>
+            <w:tcW w:type="dxa" w:w="3135"/>
+          </w:tcPr>
+          <w:p>
+            <w:r/>
+            <w:r>
+              <w:rPr>
+                <w:rFonts w:ascii="Microsoft YaHei" w:hAnsi="Microsoft YaHei" w:eastAsia="Microsoft YaHei"/>
+                <w:b/>
+                <w:sz w:val="18"/>
+              </w:rPr>
+              <w:t>适用边界</w:t>
+            </w:r>
+          </w:p>
+        </w:tc>
+      </w:tr>
+      <w:tr>
+        <w:tc>
+          <w:tcPr>
+            <w:tcW w:type="dxa" w:w="3135"/>
           </w:tcPr>
           <w:p>
             <w:r/>
@@ -4135,13 +3669,13 @@
                 <w:b w:val="0"/>
                 <w:sz w:val="18"/>
               </w:rPr>
-              <w:t>87.620</w:t>
+              <w:t>晋升、有效期、删除、回滚</w:t>
             </w:r>
           </w:p>
         </w:tc>
         <w:tc>
           <w:tcPr>
-            <w:tcW w:type="dxa" w:w="941"/>
+            <w:tcW w:type="dxa" w:w="3135"/>
           </w:tcPr>
           <w:p>
             <w:r/>
@@ -4151,13 +3685,13 @@
                 <w:b w:val="0"/>
                 <w:sz w:val="18"/>
               </w:rPr>
-              <w:t>80.604</w:t>
+              <w:t>test_round2.py</w:t>
             </w:r>
           </w:p>
         </w:tc>
         <w:tc>
           <w:tcPr>
-            <w:tcW w:type="dxa" w:w="941"/>
+            <w:tcW w:type="dxa" w:w="3135"/>
           </w:tcPr>
           <w:p>
             <w:r/>
@@ -4167,13 +3701,15 @@
                 <w:b w:val="0"/>
                 <w:sz w:val="18"/>
               </w:rPr>
-              <w:t>107.486</w:t>
+              <w:t>合成回归</w:t>
             </w:r>
           </w:p>
         </w:tc>
+      </w:tr>
+      <w:tr>
         <w:tc>
           <w:tcPr>
-            <w:tcW w:type="dxa" w:w="941"/>
+            <w:tcW w:type="dxa" w:w="3135"/>
           </w:tcPr>
           <w:p>
             <w:r/>
@@ -4183,13 +3719,13 @@
                 <w:b w:val="0"/>
                 <w:sz w:val="18"/>
               </w:rPr>
-              <w:t>112.732</w:t>
+              <w:t>增量与重启幂等</w:t>
             </w:r>
           </w:p>
         </w:tc>
         <w:tc>
           <w:tcPr>
-            <w:tcW w:type="dxa" w:w="941"/>
+            <w:tcW w:type="dxa" w:w="3135"/>
           </w:tcPr>
           <w:p>
             <w:r/>
@@ -4199,13 +3735,13 @@
                 <w:b w:val="0"/>
                 <w:sz w:val="18"/>
               </w:rPr>
-              <w:t>12.14</w:t>
+              <w:t>test_incremental.py</w:t>
             </w:r>
           </w:p>
         </w:tc>
         <w:tc>
           <w:tcPr>
-            <w:tcW w:type="dxa" w:w="941"/>
+            <w:tcW w:type="dxa" w:w="3135"/>
           </w:tcPr>
           <w:p>
             <w:r/>
@@ -4215,13 +3751,15 @@
                 <w:b w:val="0"/>
                 <w:sz w:val="18"/>
               </w:rPr>
-              <w:t>161.160</w:t>
+              <w:t>单进程写入</w:t>
             </w:r>
           </w:p>
         </w:tc>
+      </w:tr>
+      <w:tr>
         <w:tc>
           <w:tcPr>
-            <w:tcW w:type="dxa" w:w="941"/>
+            <w:tcW w:type="dxa" w:w="3135"/>
           </w:tcPr>
           <w:p>
             <w:r/>
@@ -4231,13 +3769,13 @@
                 <w:b w:val="0"/>
                 <w:sz w:val="18"/>
               </w:rPr>
-              <w:t>39.977</w:t>
+              <w:t>检索候选与条件冲突</w:t>
             </w:r>
           </w:p>
         </w:tc>
         <w:tc>
           <w:tcPr>
-            <w:tcW w:type="dxa" w:w="941"/>
+            <w:tcW w:type="dxa" w:w="3135"/>
           </w:tcPr>
           <w:p>
             <w:r/>
@@ -4247,374 +3785,178 @@
                 <w:b w:val="0"/>
                 <w:sz w:val="18"/>
               </w:rPr>
-              <w:t>是</w:t>
+              <w:t>test_retrieval_hard_cases.py、ablations.json</w:t>
+            </w:r>
+          </w:p>
+        </w:tc>
+        <w:tc>
+          <w:tcPr>
+            <w:tcW w:type="dxa" w:w="3135"/>
+          </w:tcPr>
+          <w:p>
+            <w:r/>
+            <w:r>
+              <w:rPr>
+                <w:rFonts w:ascii="Microsoft YaHei" w:hAnsi="Microsoft YaHei" w:eastAsia="Microsoft YaHei"/>
+                <w:b w:val="0"/>
+                <w:sz w:val="18"/>
+              </w:rPr>
+              <w:t>规则与近似候选</w:t>
+            </w:r>
+          </w:p>
+        </w:tc>
+      </w:tr>
+      <w:tr>
+        <w:tc>
+          <w:tcPr>
+            <w:tcW w:type="dxa" w:w="3135"/>
+          </w:tcPr>
+          <w:p>
+            <w:r/>
+            <w:r>
+              <w:rPr>
+                <w:rFonts w:ascii="Microsoft YaHei" w:hAnsi="Microsoft YaHei" w:eastAsia="Microsoft YaHei"/>
+                <w:b w:val="0"/>
+                <w:sz w:val="18"/>
+              </w:rPr>
+              <w:t>SDK 配置/缓存/超时</w:t>
+            </w:r>
+          </w:p>
+        </w:tc>
+        <w:tc>
+          <w:tcPr>
+            <w:tcW w:type="dxa" w:w="3135"/>
+          </w:tcPr>
+          <w:p>
+            <w:r/>
+            <w:r>
+              <w:rPr>
+                <w:rFonts w:ascii="Microsoft YaHei" w:hAnsi="Microsoft YaHei" w:eastAsia="Microsoft YaHei"/>
+                <w:b w:val="0"/>
+                <w:sz w:val="18"/>
+              </w:rPr>
+              <w:t>test_provider_config.py</w:t>
+            </w:r>
+          </w:p>
+        </w:tc>
+        <w:tc>
+          <w:tcPr>
+            <w:tcW w:type="dxa" w:w="3135"/>
+          </w:tcPr>
+          <w:p>
+            <w:r/>
+            <w:r>
+              <w:rPr>
+                <w:rFonts w:ascii="Microsoft YaHei" w:hAnsi="Microsoft YaHei" w:eastAsia="Microsoft YaHei"/>
+                <w:b w:val="0"/>
+                <w:sz w:val="18"/>
+              </w:rPr>
+              <w:t>模拟适配器，无真实 SDK</w:t>
+            </w:r>
+          </w:p>
+        </w:tc>
+      </w:tr>
+      <w:tr>
+        <w:tc>
+          <w:tcPr>
+            <w:tcW w:type="dxa" w:w="3135"/>
+          </w:tcPr>
+          <w:p>
+            <w:r/>
+            <w:r>
+              <w:rPr>
+                <w:rFonts w:ascii="Microsoft YaHei" w:hAnsi="Microsoft YaHei" w:eastAsia="Microsoft YaHei"/>
+                <w:b w:val="0"/>
+                <w:sz w:val="18"/>
+              </w:rPr>
+              <w:t>演示与作用域</w:t>
+            </w:r>
+          </w:p>
+        </w:tc>
+        <w:tc>
+          <w:tcPr>
+            <w:tcW w:type="dxa" w:w="3135"/>
+          </w:tcPr>
+          <w:p>
+            <w:r/>
+            <w:r>
+              <w:rPr>
+                <w:rFonts w:ascii="Microsoft YaHei" w:hAnsi="Microsoft YaHei" w:eastAsia="Microsoft YaHei"/>
+                <w:b w:val="0"/>
+                <w:sz w:val="18"/>
+              </w:rPr>
+              <w:t>test_web_server.py</w:t>
+            </w:r>
+          </w:p>
+        </w:tc>
+        <w:tc>
+          <w:tcPr>
+            <w:tcW w:type="dxa" w:w="3135"/>
+          </w:tcPr>
+          <w:p>
+            <w:r/>
+            <w:r>
+              <w:rPr>
+                <w:rFonts w:ascii="Microsoft YaHei" w:hAnsi="Microsoft YaHei" w:eastAsia="Microsoft YaHei"/>
+                <w:b w:val="0"/>
+                <w:sz w:val="18"/>
+              </w:rPr>
+              <w:t>localhost 可信上层，无登录认证</w:t>
+            </w:r>
+          </w:p>
+        </w:tc>
+      </w:tr>
+      <w:tr>
+        <w:tc>
+          <w:tcPr>
+            <w:tcW w:type="dxa" w:w="3135"/>
+          </w:tcPr>
+          <w:p>
+            <w:r/>
+            <w:r>
+              <w:rPr>
+                <w:rFonts w:ascii="Microsoft YaHei" w:hAnsi="Microsoft YaHei" w:eastAsia="Microsoft YaHei"/>
+                <w:b w:val="0"/>
+                <w:sz w:val="18"/>
+              </w:rPr>
+              <w:t>可交付性</w:t>
+            </w:r>
+          </w:p>
+        </w:tc>
+        <w:tc>
+          <w:tcPr>
+            <w:tcW w:type="dxa" w:w="3135"/>
+          </w:tcPr>
+          <w:p>
+            <w:r/>
+            <w:r>
+              <w:rPr>
+                <w:rFonts w:ascii="Microsoft YaHei" w:hAnsi="Microsoft YaHei" w:eastAsia="Microsoft YaHei"/>
+                <w:b w:val="0"/>
+                <w:sz w:val="18"/>
+              </w:rPr>
+              <w:t>test_packaging.py、test_archive_submission.py</w:t>
+            </w:r>
+          </w:p>
+        </w:tc>
+        <w:tc>
+          <w:tcPr>
+            <w:tcW w:type="dxa" w:w="3135"/>
+          </w:tcPr>
+          <w:p>
+            <w:r/>
+            <w:r>
+              <w:rPr>
+                <w:rFonts w:ascii="Microsoft YaHei" w:hAnsi="Microsoft YaHei" w:eastAsia="Microsoft YaHei"/>
+                <w:b w:val="0"/>
+                <w:sz w:val="18"/>
+              </w:rPr>
+              <w:t>INCOMPLETE 草案</w:t>
             </w:r>
           </w:p>
         </w:tc>
       </w:tr>
     </w:tbl>
-    <w:p>
-      <w:pPr>
-        <w:spacing w:line="324" w:lineRule="auto"/>
-      </w:pPr>
-      <w:r>
-        <w:rPr>
-          <w:rFonts w:ascii="Microsoft YaHei" w:hAnsi="Microsoft YaHei" w:eastAsia="Microsoft YaHei"/>
-          <w:sz w:val="21"/>
-        </w:rPr>
-        <w:t>原始报告：artifacts/verification/performance_windows_dev.json。当前使用合成记录和 HashEmbedding，真实 SDK 可能有不同的模型加载、批处理、内存和时延特征。</w:t>
-      </w:r>
-    </w:p>
-    <w:p>
-      <w:pPr>
-        <w:pStyle w:val="Heading2"/>
-      </w:pPr>
-      <w:r>
-        <w:t>8. 自动化测试结果</w:t>
-      </w:r>
-    </w:p>
-    <w:p>
-      <w:pPr>
-        <w:pStyle w:val="NoSpacing"/>
-      </w:pPr>
-      <w:r>
-        <w:rPr>
-          <w:rFonts w:ascii="Consolas" w:hAnsi="Consolas"/>
-          <w:sz w:val="16"/>
-        </w:rPr>
-        <w:t>$env:PYTHONPATH="$PWD\src"</w:t>
-        <w:br/>
-        <w:t>python -m unittest discover -s tests -v</w:t>
-      </w:r>
-    </w:p>
-    <w:p>
-      <w:pPr>
-        <w:spacing w:line="324" w:lineRule="auto"/>
-      </w:pPr>
-      <w:r>
-        <w:rPr>
-          <w:rFonts w:ascii="Microsoft YaHei" w:hAnsi="Microsoft YaHei" w:eastAsia="Microsoft YaHei"/>
-          <w:sz w:val="21"/>
-        </w:rPr>
-        <w:t>截至本报告生成时共 65 项，全部通过，覆盖核心单元、SQLite 迁移、服务集成、HTTP 端到端、指标、性能报告、环境/演示预检、隐私扫描、提交包边界，以及跨租户、提示注入、失败工具、硬删除和嵌套凭证等安全对抗。详细映射见 docs/06_测试矩阵.md。</w:t>
-      </w:r>
-    </w:p>
-    <w:p>
-      <w:pPr>
-        <w:pStyle w:val="Heading2"/>
-      </w:pPr>
-      <w:r>
-        <w:t>9. 复现步骤</w:t>
-      </w:r>
-    </w:p>
-    <w:p>
-      <w:pPr>
-        <w:pStyle w:val="NoSpacing"/>
-      </w:pPr>
-      <w:r>
-        <w:rPr>
-          <w:rFonts w:ascii="Consolas" w:hAnsi="Consolas"/>
-          <w:sz w:val="16"/>
-        </w:rPr>
-        <w:t>$env:PYTHONPATH="$PWD\src"</w:t>
-        <w:br/>
-        <w:t>python -m unittest discover -s tests -v</w:t>
-        <w:br/>
-        <w:t>python -m os_agent_memory.cli evaluate --suite ".\data\eval\office_memory_eval_v2.json" --split test --top-k 3 --summary-only --output ".\artifacts\runtime\latest_evaluation.json"</w:t>
-        <w:br/>
-        <w:t>python -m os_agent_memory.cli benchmark --sizes 100,1000,5000,10000 --rounds 30 --top-k 5 --output-json ".\artifacts\runtime\performance.json" --output-md ".\artifacts\runtime\performance.md"</w:t>
-        <w:br/>
-        <w:t>powershell -NoProfile -ExecutionPolicy Bypass -File ".\scripts\run_demo.ps1" -NoServer</w:t>
-      </w:r>
-    </w:p>
-    <w:p>
-      <w:pPr>
-        <w:pStyle w:val="Heading2"/>
-      </w:pPr>
-      <w:r>
-        <w:t>10. 已发现并修复的关键问题</w:t>
-      </w:r>
-    </w:p>
-    <w:p>
-      <w:pPr>
-        <w:pStyle w:val="ListNumber"/>
-      </w:pPr>
-      <w:r>
-        <w:rPr>
-          <w:rFonts w:ascii="Microsoft YaHei" w:hAnsi="Microsoft YaHei" w:eastAsia="Microsoft YaHei"/>
-          <w:sz w:val="21"/>
-        </w:rPr>
-        <w:t>复合偏好只保留单值：改为多维键。</w:t>
-      </w:r>
-    </w:p>
-    <w:p>
-      <w:pPr>
-        <w:pStyle w:val="ListNumber"/>
-      </w:pPr>
-      <w:r>
-        <w:rPr>
-          <w:rFonts w:ascii="Microsoft YaHei" w:hAnsi="Microsoft YaHei" w:eastAsia="Microsoft YaHei"/>
-          <w:sz w:val="21"/>
-        </w:rPr>
-        <w:t>失败工具被学习为首选：失败/取消结果排除并降权。</w:t>
-      </w:r>
-    </w:p>
-    <w:p>
-      <w:pPr>
-        <w:pStyle w:val="ListNumber"/>
-      </w:pPr>
-      <w:r>
-        <w:rPr>
-          <w:rFonts w:ascii="Microsoft YaHei" w:hAnsi="Microsoft YaHei" w:eastAsia="Microsoft YaHei"/>
-          <w:sz w:val="21"/>
-        </w:rPr>
-        <w:t>输入顺序覆盖事件时间：以有效时间和权重决策。</w:t>
-      </w:r>
-    </w:p>
-    <w:p>
-      <w:pPr>
-        <w:pStyle w:val="ListNumber"/>
-      </w:pPr>
-      <w:r>
-        <w:rPr>
-          <w:rFonts w:ascii="Microsoft YaHei" w:hAnsi="Microsoft YaHei" w:eastAsia="Microsoft YaHei"/>
-          <w:sz w:val="21"/>
-        </w:rPr>
-        <w:t>未决冲突参与回答：默认隔离。</w:t>
-      </w:r>
-    </w:p>
-    <w:p>
-      <w:pPr>
-        <w:pStyle w:val="ListNumber"/>
-      </w:pPr>
-      <w:r>
-        <w:rPr>
-          <w:rFonts w:ascii="Microsoft YaHei" w:hAnsi="Microsoft YaHei" w:eastAsia="Microsoft YaHei"/>
-          <w:sz w:val="21"/>
-        </w:rPr>
-        <w:t>矛盾文本直接拼接：改为证据合并和胜出决策。</w:t>
-      </w:r>
-    </w:p>
-    <w:p>
-      <w:pPr>
-        <w:pStyle w:val="ListNumber"/>
-      </w:pPr>
-      <w:r>
-        <w:rPr>
-          <w:rFonts w:ascii="Microsoft YaHei" w:hAnsi="Microsoft YaHei" w:eastAsia="Microsoft YaHei"/>
-          <w:sz w:val="21"/>
-        </w:rPr>
-        <w:t>查询重复计算文档向量：改为入库缓存、候选重排。</w:t>
-      </w:r>
-    </w:p>
-    <w:p>
-      <w:pPr>
-        <w:pStyle w:val="ListNumber"/>
-      </w:pPr>
-      <w:r>
-        <w:rPr>
-          <w:rFonts w:ascii="Microsoft YaHei" w:hAnsi="Microsoft YaHei" w:eastAsia="Microsoft YaHei"/>
-          <w:sz w:val="21"/>
-        </w:rPr>
-        <w:t>多租户缺少作用域：歧义时拒绝，并增加越权测试。</w:t>
-      </w:r>
-    </w:p>
-    <w:p>
-      <w:pPr>
-        <w:pStyle w:val="ListNumber"/>
-      </w:pPr>
-      <w:r>
-        <w:rPr>
-          <w:rFonts w:ascii="Microsoft YaHei" w:hAnsi="Microsoft YaHei" w:eastAsia="Microsoft YaHei"/>
-          <w:sz w:val="21"/>
-        </w:rPr>
-        <w:t>遗忘直接执行：改为预览、确认、过期令牌和审计。</w:t>
-      </w:r>
-    </w:p>
-    <w:p>
-      <w:pPr>
-        <w:pStyle w:val="ListNumber"/>
-      </w:pPr>
-      <w:r>
-        <w:rPr>
-          <w:rFonts w:ascii="Microsoft YaHei" w:hAnsi="Microsoft YaHei" w:eastAsia="Microsoft YaHei"/>
-          <w:sz w:val="21"/>
-        </w:rPr>
-        <w:t>误删指标只检查少量保留标题：改为授权外任何删除均处罚。</w:t>
-      </w:r>
-    </w:p>
-    <w:p>
-      <w:pPr>
-        <w:pStyle w:val="ListNumber"/>
-      </w:pPr>
-      <w:r>
-        <w:rPr>
-          <w:rFonts w:ascii="Microsoft YaHei" w:hAnsi="Microsoft YaHei" w:eastAsia="Microsoft YaHei"/>
-          <w:sz w:val="21"/>
-        </w:rPr>
-        <w:t>冲突淘汰被误算为本次遗忘：按本次 affected IDs 计分。</w:t>
-      </w:r>
-    </w:p>
-    <w:p>
-      <w:pPr>
-        <w:pStyle w:val="Heading2"/>
-      </w:pPr>
-      <w:r>
-        <w:t>11. 未完成与风险</w:t>
-      </w:r>
-    </w:p>
-    <w:p>
-      <w:pPr>
-        <w:pStyle w:val="ListBullet"/>
-      </w:pPr>
-      <w:r>
-        <w:rPr>
-          <w:rFonts w:ascii="Microsoft YaHei" w:hAnsi="Microsoft YaHei" w:eastAsia="Microsoft YaHei"/>
-          <w:sz w:val="21"/>
-        </w:rPr>
-        <w:t>未获得发榜单位真实 embedding SDK、模型、测试数据和接口文档。</w:t>
-      </w:r>
-    </w:p>
-    <w:p>
-      <w:pPr>
-        <w:pStyle w:val="ListBullet"/>
-      </w:pPr>
-      <w:r>
-        <w:rPr>
-          <w:rFonts w:ascii="Microsoft YaHei" w:hAnsi="Microsoft YaHei" w:eastAsia="Microsoft YaHei"/>
-          <w:sz w:val="21"/>
-        </w:rPr>
-        <w:t>未在真实银河麒麟桌面系统运行安装、功能、性能和资源测试。</w:t>
-      </w:r>
-    </w:p>
-    <w:p>
-      <w:pPr>
-        <w:pStyle w:val="ListBullet"/>
-      </w:pPr>
-      <w:r>
-        <w:rPr>
-          <w:rFonts w:ascii="Microsoft YaHei" w:hAnsi="Microsoft YaHei" w:eastAsia="Microsoft YaHei"/>
-          <w:sz w:val="21"/>
-        </w:rPr>
-        <w:t>未完成由独立评测者持有标签的盲测。</w:t>
-      </w:r>
-    </w:p>
-    <w:p>
-      <w:pPr>
-        <w:pStyle w:val="ListBullet"/>
-      </w:pPr>
-      <w:r>
-        <w:rPr>
-          <w:rFonts w:ascii="Microsoft YaHei" w:hAnsi="Microsoft YaHei" w:eastAsia="Microsoft YaHei"/>
-          <w:sz w:val="21"/>
-        </w:rPr>
-        <w:t>未完成经参与者书面同意的真实办公案例。</w:t>
-      </w:r>
-    </w:p>
-    <w:p>
-      <w:pPr>
-        <w:pStyle w:val="ListBullet"/>
-      </w:pPr>
-      <w:r>
-        <w:rPr>
-          <w:rFonts w:ascii="Microsoft YaHei" w:hAnsi="Microsoft YaHei" w:eastAsia="Microsoft YaHei"/>
-          <w:sz w:val="21"/>
-        </w:rPr>
-        <w:t>未人工录制最终视频，也未确认平台审核、盖章报名表和邮件回执。</w:t>
-      </w:r>
-    </w:p>
-    <w:p>
-      <w:pPr>
-        <w:pStyle w:val="ListBullet"/>
-      </w:pPr>
-      <w:r>
-        <w:rPr>
-          <w:rFonts w:ascii="Microsoft YaHei" w:hAnsi="Microsoft YaHei" w:eastAsia="Microsoft YaHei"/>
-          <w:sz w:val="21"/>
-        </w:rPr>
-        <w:t>Web 服务为本地演示用途，不具备生产级认证、TLS 和并发写事务治理。</w:t>
-      </w:r>
-    </w:p>
-    <w:p>
-      <w:pPr>
-        <w:pStyle w:val="Heading2"/>
-      </w:pPr>
-      <w:r>
-        <w:t>12. 最终判定</w:t>
-      </w:r>
-    </w:p>
-    <w:p>
-      <w:pPr>
-        <w:spacing w:line="324" w:lineRule="auto"/>
-      </w:pPr>
-      <w:r>
-        <w:rPr>
-          <w:rFonts w:ascii="Microsoft YaHei" w:hAnsi="Microsoft YaHei" w:eastAsia="Microsoft YaHei"/>
-          <w:sz w:val="21"/>
-        </w:rPr>
-        <w:t>开发机核心原型：通过。</w:t>
-      </w:r>
-    </w:p>
-    <w:p>
-      <w:pPr>
-        <w:spacing w:line="324" w:lineRule="auto"/>
-      </w:pPr>
-      <w:r>
-        <w:rPr>
-          <w:rFonts w:ascii="Microsoft YaHei" w:hAnsi="Microsoft YaHei" w:eastAsia="Microsoft YaHei"/>
-          <w:sz w:val="21"/>
-        </w:rPr>
-        <w:t>仓库内自动化回归：通过。</w:t>
-      </w:r>
-    </w:p>
-    <w:p>
-      <w:pPr>
-        <w:spacing w:line="324" w:lineRule="auto"/>
-      </w:pPr>
-      <w:r>
-        <w:rPr>
-          <w:rFonts w:ascii="Microsoft YaHei" w:hAnsi="Microsoft YaHei" w:eastAsia="Microsoft YaHei"/>
-          <w:sz w:val="21"/>
-        </w:rPr>
-        <w:t>合成 test 分区：通过。</w:t>
-      </w:r>
-    </w:p>
-    <w:p>
-      <w:pPr>
-        <w:spacing w:line="324" w:lineRule="auto"/>
-      </w:pPr>
-      <w:r>
-        <w:rPr>
-          <w:rFonts w:ascii="Microsoft YaHei" w:hAnsi="Microsoft YaHei" w:eastAsia="Microsoft YaHei"/>
-          <w:sz w:val="21"/>
-        </w:rPr>
-        <w:t>开发机 10,000 条 HashEmbedding 性能：通过。</w:t>
-      </w:r>
-    </w:p>
-    <w:p>
-      <w:pPr>
-        <w:spacing w:line="324" w:lineRule="auto"/>
-      </w:pPr>
-      <w:r>
-        <w:rPr>
-          <w:rFonts w:ascii="Microsoft YaHei" w:hAnsi="Microsoft YaHei" w:eastAsia="Microsoft YaHei"/>
-          <w:sz w:val="21"/>
-        </w:rPr>
-        <w:t>真实银河麒麟 + 真实 SDK 赛题环境：未验证。</w:t>
-      </w:r>
-    </w:p>
-    <w:p>
-      <w:pPr>
-        <w:spacing w:line="324" w:lineRule="auto"/>
-      </w:pPr>
-      <w:r>
-        <w:rPr>
-          <w:rFonts w:ascii="Microsoft YaHei" w:hAnsi="Microsoft YaHei" w:eastAsia="Microsoft YaHei"/>
-          <w:sz w:val="21"/>
-        </w:rPr>
-        <w:t>正式比赛全部交付条件：尚未满足，需完成第 11 节外部事项。</w:t>
-      </w:r>
-    </w:p>
     <w:sectPr>
       <w:pgSz w:w="12240" w:h="15840"/>
       <w:pgMar w:top="1361" w:right="1417" w:bottom="1247" w:left="1417" w:header="720" w:footer="720" w:gutter="0"/>

</xml_diff>

<commit_message>
docs: synchronize third round metrics and disclose quality latency tradeoff
</commit_message>
<xml_diff>
--- a/deliverables/doc/OS_Agent_记忆优化_技术方案与测试报告.docx
+++ b/deliverables/doc/OS_Agent_记忆优化_技术方案与测试报告.docx
@@ -147,7 +147,7 @@
           <w:rFonts w:ascii="Microsoft YaHei" w:hAnsi="Microsoft YaHei" w:eastAsia="Microsoft YaHei"/>
           <w:sz w:val="21"/>
         </w:rPr>
-        <w:t>当前仓库已形成标准库原型、增量 SQLite 持久化、统一生命周期服务、本地场景演示、分区评测和规模基准。第二轮测试数及性能统一由 artifacts/verification/round2/evidence_summary.json 生成，见《第二轮验收报告》。数据使用 Windows 和 HashEmbedding，不替代真实银河麒麟 embedding SDK 验收。</w:t>
+        <w:t>当前仓库已形成标准库原型、增量 SQLite 持久化、统一生命周期服务、本地场景演示、分区评测和规模基准。第三轮测试数及性能统一由 artifacts/verification/round3/evidence_summary.json 生成，见《第三轮验收报告》。数据使用 Windows 和 HashEmbedding，不替代真实银河麒麟 embedding SDK 验收。</w:t>
       </w:r>
     </w:p>
     <w:p>
@@ -1296,7 +1296,7 @@
           <w:rFonts w:ascii="Microsoft YaHei" w:hAnsi="Microsoft YaHei" w:eastAsia="Microsoft YaHei"/>
           <w:sz w:val="21"/>
         </w:rPr>
-        <w:t>入库缓存文档向量并建立词法及有符号向量维度倒排。查询按作用域、状态、有效期和场景过滤，合并词法候选与近似语义候选，查询向量只编码一次后重排；近似语义召回可能引入干扰，需要对照实验。融合分数：</w:t>
+        <w:t>入库缓存文档向量并建立词法、汉字及有符号向量维度倒排。查询先按作用域、状态、有效期和场景过滤，合并词法、汉字、近似语义三路候选，查询向量只编码一次后重排；近似语义召回可能引入干扰，需要对照实验。中文融合分数：</w:t>
       </w:r>
     </w:p>
     <w:p>
@@ -1308,7 +1308,7 @@
           <w:rFonts w:ascii="Consolas" w:hAnsi="Consolas"/>
           <w:sz w:val="16"/>
         </w:rPr>
-        <w:t>score = 0.65 × semantic + 0.30 × lexical + 0.05 × authority</w:t>
+        <w:t>score = 0.25 × semantic + 0.25 × lexical + 0.45 × character + 0.05 × authority</w:t>
       </w:r>
     </w:p>
     <w:p>
@@ -1320,7 +1320,7 @@
           <w:rFonts w:ascii="Microsoft YaHei" w:hAnsi="Microsoft YaHei" w:eastAsia="Microsoft YaHei"/>
           <w:sz w:val="21"/>
         </w:rPr>
-        <w:t>低于 min_score 不返回，允许明确无答案。向量随 SQLite v2 持久化，遗忘时同步清理索引和向量。</w:t>
+        <w:t>无中文证据时使用原向量 0.65、词法 0.30、权威度 0.05 配方。低于 min_score（默认 0.265）不返回，允许明确无答案。向量随 SQLite v2 持久化，遗忘时同步清理全部索引和向量。</w:t>
       </w:r>
     </w:p>
     <w:p>
@@ -1496,7 +1496,7 @@
           <w:rFonts w:ascii="Microsoft YaHei" w:hAnsi="Microsoft YaHei" w:eastAsia="Microsoft YaHei"/>
           <w:sz w:val="21"/>
         </w:rPr>
-        <w:t>只用 dev 选择统一阈值再报告 test；词法、向量和混合各自按同一规则选阈值。当前混合检索未稳定优于词法基线，两个 ≥0.85 质量目标仍未全部满足。不能沿用旧版 1.0，也不能把工程回归通过说成质量目标全部达成。</w:t>
+        <w:t>第三轮增加正文汉字覆盖及候选路径。中文评分为向量 0.25、词法 0.25、汉字覆盖 0.45、权威度 0.05；元数据不提供汉字证据，作用域与删除状态先过滤。仅用 dev 的两項均 ≥85% 最宽连续阈值区间中心定参数，不可行时报告平衡分回退。混合阈值为 0.265，服务与 HTTP 默认一致；test 正例 11/12（91.67%）、无答案 6/6（100%），两项目标达到。首次 0.225 的未通过结果仍保留；不能沿用旧 v1/v2 的 1.0。</w:t>
       </w:r>
     </w:p>
     <w:p>
@@ -1508,7 +1508,7 @@
           <w:rFonts w:ascii="Microsoft YaHei" w:hAnsi="Microsoft YaHei" w:eastAsia="Microsoft YaHei"/>
           <w:sz w:val="21"/>
         </w:rPr>
-        <w:t>规模检索与实际服务负载分别报告，后者包含接入、SQLite、重启及混合读写和 HTTP。当前数据统一见 docs/18_第二轮验收报告.md 和 artifacts/verification/round2/；公开 test 被开发者接触，不能视为独立盲测。</w:t>
+        <w:t>规模检索与实际服务负载分别报告，后者包含接入、SQLite、重启及混合读写和 HTTP。当前数据统一见 docs/22_第三轮验收报告.md 和 artifacts/verification/round3/；公开 test 被开发者多次接触，不能视为独立盲测。10k 热查询 p99 362.265ms，内存峰值 245.124MB；增加汉字索引后较第二轮延迟与内存上升，仍满足本次 500ms 门槛，不宣称性能全面提升或真实 SDK 泛化。</w:t>
       </w:r>
     </w:p>
     <w:p>
@@ -2115,7 +2115,7 @@
         <w:pStyle w:val="Heading1"/>
       </w:pPr>
       <w:r>
-        <w:t>第二轮本地工程与评测报告</w:t>
+        <w:t>第三轮本地质量验收报告</w:t>
       </w:r>
     </w:p>
     <w:p>
@@ -2127,7 +2127,7 @@
           <w:rFonts w:ascii="Microsoft YaHei" w:hAnsi="Microsoft YaHei" w:eastAsia="Microsoft YaHei"/>
           <w:sz w:val="21"/>
         </w:rPr>
-        <w:t>固定证据生成时间（UTC）：2026-09-06T09:32:22+00:00。本报告与 PPT 共用 evidence_summary.json。</w:t>
+        <w:t>固定证据生成时间（UTC）：2026-09-06T13:38:53+00:00。本报告与 PPT 共用 evidence_summary.json。</w:t>
       </w:r>
     </w:p>
     <w:p>
@@ -2147,7 +2147,7 @@
           <w:rFonts w:ascii="Microsoft YaHei" w:hAnsi="Microsoft YaHei" w:eastAsia="Microsoft YaHei"/>
           <w:sz w:val="21"/>
         </w:rPr>
-        <w:t>工程检查通过：True；自动化测试 86 项全部通过。</w:t>
+        <w:t>工程检查通过：True；自动化测试 91 项全部通过。</w:t>
       </w:r>
     </w:p>
     <w:p>
@@ -2159,7 +2159,7 @@
           <w:rFonts w:ascii="Microsoft YaHei" w:hAnsi="Microsoft YaHei" w:eastAsia="Microsoft YaHei"/>
           <w:sz w:val="21"/>
         </w:rPr>
-        <w:t>内部质量目标全部满足：False；正式赛事就绪：False。</w:t>
+        <w:t>内部质量目标全部满足：True；正式赛事就绪：False。</w:t>
       </w:r>
     </w:p>
     <w:p>
@@ -2179,7 +2179,7 @@
         <w:pStyle w:val="Heading2"/>
       </w:pPr>
       <w:r>
-        <w:t>第二轮实质改造</w:t>
+        <w:t>已具备的工程能力与本轮改造</w:t>
       </w:r>
     </w:p>
     <w:p>
@@ -2256,6 +2256,54 @@
     </w:p>
     <w:p>
       <w:pPr>
+        <w:spacing w:line="324" w:lineRule="auto"/>
+      </w:pPr>
+      <w:r>
+        <w:rPr>
+          <w:rFonts w:ascii="Microsoft YaHei" w:hAnsi="Microsoft YaHei" w:eastAsia="Microsoft YaHei"/>
+          <w:sz w:val="21"/>
+        </w:rPr>
+        <w:t>本轮新增正文汉字倒排与精确覆盖分数；中文混合评分为向量 0.25、二字词法 0.25、汉字 0.45、权威度 0.05。</w:t>
+      </w:r>
+    </w:p>
+    <w:p>
+      <w:pPr>
+        <w:spacing w:line="324" w:lineRule="auto"/>
+      </w:pPr>
+      <w:r>
+        <w:rPr>
+          <w:rFonts w:ascii="Microsoft YaHei" w:hAnsi="Microsoft YaHei" w:eastAsia="Microsoft YaHei"/>
+          <w:sz w:val="21"/>
+        </w:rPr>
+        <w:t>汉字仅取标题与正文，不取元数据；独立向量候选仍保留。无中文证据时沿用原混合评分。</w:t>
+      </w:r>
+    </w:p>
+    <w:p>
+      <w:pPr>
+        <w:spacing w:line="324" w:lineRule="auto"/>
+      </w:pPr>
+      <w:r>
+        <w:rPr>
+          <w:rFonts w:ascii="Microsoft YaHei" w:hAnsi="Microsoft YaHei" w:eastAsia="Microsoft YaHei"/>
+          <w:sz w:val="21"/>
+        </w:rPr>
+        <w:t>dev 网格步长 0.01，取两项均 ≥85% 的最宽连续区间中心；若不可行，报告失败并保留平衡分回退。</w:t>
+      </w:r>
+    </w:p>
+    <w:p>
+      <w:pPr>
+        <w:spacing w:line="324" w:lineRule="auto"/>
+      </w:pPr>
+      <w:r>
+        <w:rPr>
+          <w:rFonts w:ascii="Microsoft YaHei" w:hAnsi="Microsoft YaHei" w:eastAsia="Microsoft YaHei"/>
+          <w:sz w:val="21"/>
+        </w:rPr>
+        <w:t>统一阈值已同步服务和 HTTP 默认入口；CI 与完整发布验收均检查两项 85% 门槛。</w:t>
+      </w:r>
+    </w:p>
+    <w:p>
+      <w:pPr>
         <w:pStyle w:val="Heading2"/>
       </w:pPr>
       <w:r>
@@ -2307,7 +2355,7 @@
           <w:rFonts w:ascii="Microsoft YaHei" w:hAnsi="Microsoft YaHei" w:eastAsia="Microsoft YaHei"/>
           <w:sz w:val="21"/>
         </w:rPr>
-        <w:t>仅用 dev 选择统一阈值 0.24，然后测试。配置及 dev 摘要见 evaluation_v3.json。</w:t>
+        <w:t>仅用 dev 选择统一阈值 0.265，然后测试。配置及 dev 摘要见 evaluation_v3.json。</w:t>
       </w:r>
     </w:p>
     <w:p>
@@ -2502,7 +2550,7 @@
                 <w:b w:val="0"/>
                 <w:sz w:val="18"/>
               </w:rPr>
-              <w:t>0.12</w:t>
+              <w:t>0.115</w:t>
             </w:r>
           </w:p>
         </w:tc>
@@ -2618,7 +2666,7 @@
                 <w:b w:val="0"/>
                 <w:sz w:val="18"/>
               </w:rPr>
-              <w:t>0.8333</w:t>
+              <w:t>0.9167</w:t>
             </w:r>
           </w:p>
         </w:tc>
@@ -2634,7 +2682,7 @@
                 <w:b w:val="0"/>
                 <w:sz w:val="18"/>
               </w:rPr>
-              <w:t>0.8333</w:t>
+              <w:t>1.0000</w:t>
             </w:r>
           </w:p>
         </w:tc>
@@ -2650,7 +2698,7 @@
                 <w:b w:val="0"/>
                 <w:sz w:val="18"/>
               </w:rPr>
-              <w:t>0.8333</w:t>
+              <w:t>0.9583</w:t>
             </w:r>
           </w:p>
         </w:tc>
@@ -2666,7 +2714,7 @@
                 <w:b w:val="0"/>
                 <w:sz w:val="18"/>
               </w:rPr>
-              <w:t>0.24</w:t>
+              <w:t>0.265</w:t>
             </w:r>
           </w:p>
         </w:tc>
@@ -2693,7 +2741,7 @@
           <w:rFonts w:ascii="Microsoft YaHei" w:hAnsi="Microsoft YaHei" w:eastAsia="Microsoft YaHei"/>
           <w:sz w:val="21"/>
         </w:rPr>
-        <w:t>当前混合方案没有稳定胜过词法基线，不应宣称算法全面领先。语义候选覆盖更广，但也引入干扰。</w:t>
+        <w:t>本次混合结果在这份小样本内部回归上改善，不代表开放域或真实 SDK 全面领先。</w:t>
       </w:r>
     </w:p>
     <w:p>
@@ -2705,7 +2753,43 @@
           <w:rFonts w:ascii="Microsoft YaHei" w:hAnsi="Microsoft YaHei" w:eastAsia="Microsoft YaHei"/>
           <w:sz w:val="21"/>
         </w:rPr>
-        <w:t>质量目标仍为两项各 ≥0.85；未达目标如实保留，不通过降低门槛把结果标绿。</w:t>
+        <w:t>质量目标两项各 ≥0.85，本次全部满足：True。</w:t>
+      </w:r>
+    </w:p>
+    <w:p>
+      <w:pPr>
+        <w:spacing w:line="324" w:lineRule="auto"/>
+      </w:pPr>
+      <w:r>
+        <w:rPr>
+          <w:rFonts w:ascii="Microsoft YaHei" w:hAnsi="Microsoft YaHei" w:eastAsia="Microsoft YaHei"/>
+          <w:sz w:val="21"/>
+        </w:rPr>
+        <w:t>正例完整召回 11/12；无答案正确 6/6。</w:t>
+      </w:r>
+    </w:p>
+    <w:p>
+      <w:pPr>
+        <w:spacing w:line="324" w:lineRule="auto"/>
+      </w:pPr>
+      <w:r>
+        <w:rPr>
+          <w:rFonts w:ascii="Microsoft YaHei" w:hAnsi="Microsoft YaHei" w:eastAsia="Microsoft YaHei"/>
+          <w:sz w:val="21"/>
+        </w:rPr>
+        <w:t>首次 0.225 阈值复测得到 11/12 与 5/6，保留 calibration_first_probe.json；之后按 dev 可用区间 0.22–0.31 冻结中心 0.265。</w:t>
+      </w:r>
+    </w:p>
+    <w:p>
+      <w:pPr>
+        <w:spacing w:line="324" w:lineRule="auto"/>
+      </w:pPr>
+      <w:r>
+        <w:rPr>
+          <w:rFonts w:ascii="Microsoft YaHei" w:hAnsi="Microsoft YaHei" w:eastAsia="Microsoft YaHei"/>
+          <w:sz w:val="21"/>
+        </w:rPr>
+        <w:t>数据、标签和分母未改变；test 被重复接触，本次属于开发者内部回归，不能称为盲测。</w:t>
       </w:r>
     </w:p>
     <w:p>
@@ -2864,7 +2948,7 @@
                 <w:b w:val="0"/>
                 <w:sz w:val="18"/>
               </w:rPr>
-              <w:t>11.548</w:t>
+              <w:t>13.517</w:t>
             </w:r>
           </w:p>
         </w:tc>
@@ -2880,7 +2964,7 @@
                 <w:b w:val="0"/>
                 <w:sz w:val="18"/>
               </w:rPr>
-              <w:t>11.653</w:t>
+              <w:t>35.164</w:t>
             </w:r>
           </w:p>
         </w:tc>
@@ -2896,7 +2980,7 @@
                 <w:b w:val="0"/>
                 <w:sz w:val="18"/>
               </w:rPr>
-              <w:t>1.999</w:t>
+              <w:t>2.776</w:t>
             </w:r>
           </w:p>
         </w:tc>
@@ -2946,7 +3030,7 @@
                 <w:b w:val="0"/>
                 <w:sz w:val="18"/>
               </w:rPr>
-              <w:t>19.82</w:t>
+              <w:t>61.599</w:t>
             </w:r>
           </w:p>
         </w:tc>
@@ -2962,7 +3046,7 @@
                 <w:b w:val="0"/>
                 <w:sz w:val="18"/>
               </w:rPr>
-              <w:t>25.8</w:t>
+              <w:t>97.627</w:t>
             </w:r>
           </w:p>
         </w:tc>
@@ -2978,7 +3062,7 @@
                 <w:b w:val="0"/>
                 <w:sz w:val="18"/>
               </w:rPr>
-              <w:t>16.987</w:t>
+              <w:t>22.835</w:t>
             </w:r>
           </w:p>
         </w:tc>
@@ -3028,7 +3112,7 @@
                 <w:b w:val="0"/>
                 <w:sz w:val="18"/>
               </w:rPr>
-              <w:t>51.003</w:t>
+              <w:t>140.515</w:t>
             </w:r>
           </w:p>
         </w:tc>
@@ -3044,7 +3128,7 @@
                 <w:b w:val="0"/>
                 <w:sz w:val="18"/>
               </w:rPr>
-              <w:t>53.761</w:t>
+              <w:t>176.329</w:t>
             </w:r>
           </w:p>
         </w:tc>
@@ -3060,7 +3144,7 @@
                 <w:b w:val="0"/>
                 <w:sz w:val="18"/>
               </w:rPr>
-              <w:t>100.58</w:t>
+              <w:t>143.642</w:t>
             </w:r>
           </w:p>
         </w:tc>
@@ -3110,7 +3194,7 @@
                 <w:b w:val="0"/>
                 <w:sz w:val="18"/>
               </w:rPr>
-              <w:t>96.972</w:t>
+              <w:t>246.796</w:t>
             </w:r>
           </w:p>
         </w:tc>
@@ -3126,7 +3210,7 @@
                 <w:b w:val="0"/>
                 <w:sz w:val="18"/>
               </w:rPr>
-              <w:t>129.045</w:t>
+              <w:t>362.265</w:t>
             </w:r>
           </w:p>
         </w:tc>
@@ -3142,7 +3226,7 @@
                 <w:b w:val="0"/>
                 <w:sz w:val="18"/>
               </w:rPr>
-              <w:t>178.782</w:t>
+              <w:t>245.124</w:t>
             </w:r>
           </w:p>
         </w:tc>
@@ -3317,7 +3401,7 @@
                 <w:b w:val="0"/>
                 <w:sz w:val="18"/>
               </w:rPr>
-              <w:t>179.808</w:t>
+              <w:t>194.493</w:t>
             </w:r>
           </w:p>
         </w:tc>
@@ -3333,7 +3417,7 @@
                 <w:b w:val="0"/>
                 <w:sz w:val="18"/>
               </w:rPr>
-              <w:t>49.313</w:t>
+              <w:t>50.869</w:t>
             </w:r>
           </w:p>
         </w:tc>
@@ -3349,7 +3433,7 @@
                 <w:b w:val="0"/>
                 <w:sz w:val="18"/>
               </w:rPr>
-              <w:t>30.5</w:t>
+              <w:t>36.737</w:t>
             </w:r>
           </w:p>
         </w:tc>
@@ -3365,7 +3449,7 @@
                 <w:b w:val="0"/>
                 <w:sz w:val="18"/>
               </w:rPr>
-              <w:t>3.106</w:t>
+              <w:t>3.975</w:t>
             </w:r>
           </w:p>
         </w:tc>
@@ -3381,7 +3465,7 @@
                 <w:b w:val="0"/>
                 <w:sz w:val="18"/>
               </w:rPr>
-              <w:t>33.248</w:t>
+              <w:t>22.705</w:t>
             </w:r>
           </w:p>
         </w:tc>
@@ -3415,7 +3499,7 @@
                 <w:b w:val="0"/>
                 <w:sz w:val="18"/>
               </w:rPr>
-              <w:t>4152.665</w:t>
+              <w:t>4478.732</w:t>
             </w:r>
           </w:p>
         </w:tc>
@@ -3431,7 +3515,7 @@
                 <w:b w:val="0"/>
                 <w:sz w:val="18"/>
               </w:rPr>
-              <w:t>300.196</w:t>
+              <w:t>325.806</w:t>
             </w:r>
           </w:p>
         </w:tc>
@@ -3447,7 +3531,7 @@
                 <w:b w:val="0"/>
                 <w:sz w:val="18"/>
               </w:rPr>
-              <w:t>183.747</w:t>
+              <w:t>235.462</w:t>
             </w:r>
           </w:p>
         </w:tc>
@@ -3463,7 +3547,7 @@
                 <w:b w:val="0"/>
                 <w:sz w:val="18"/>
               </w:rPr>
-              <w:t>8.707</w:t>
+              <w:t>12.898</w:t>
             </w:r>
           </w:p>
         </w:tc>
@@ -3479,7 +3563,7 @@
                 <w:b w:val="0"/>
                 <w:sz w:val="18"/>
               </w:rPr>
-              <w:t>33.692</w:t>
+              <w:t>32.438</w:t>
             </w:r>
           </w:p>
         </w:tc>
@@ -3507,6 +3591,18 @@
           <w:sz w:val="21"/>
         </w:rPr>
         <w:t>p99 为少量采样经验值，不是生产 SLA。当前事务为单进程串行写，增量落盘仍需比较当前状态，</w:t>
+      </w:r>
+    </w:p>
+    <w:p>
+      <w:pPr>
+        <w:spacing w:line="324" w:lineRule="auto"/>
+      </w:pPr>
+      <w:r>
+        <w:rPr>
+          <w:rFonts w:ascii="Microsoft YaHei" w:hAnsi="Microsoft YaHei" w:eastAsia="Microsoft YaHei"/>
+          <w:sz w:val="21"/>
+        </w:rPr>
+        <w:t>相较第二轮 10k 热查询 p99 129.045ms、峰值 178.782MB，本轮增加汉字索引后延迟与内存均上升；质量达标不意味着性能也提升。</w:t>
       </w:r>
     </w:p>
     <w:p>
@@ -3544,7 +3640,7 @@
         <w:br/>
         <w:t>node scripts/check_dashboard.cjs</w:t>
         <w:br/>
-        <w:t>python scripts/evaluate_v3.py --embedding-config config/embedding.hash.json</w:t>
+        <w:t>python scripts/evaluate_v3.py --require-quality --embedding-config config/embedding.hash.json</w:t>
         <w:br/>
         <w:t>python scripts/benchmark_service.py --sizes 100,1000 --rounds 30</w:t>
         <w:br/>
@@ -3560,7 +3656,7 @@
           <w:rFonts w:ascii="Microsoft YaHei" w:hAnsi="Microsoft YaHei" w:eastAsia="Microsoft YaHei"/>
           <w:sz w:val="21"/>
         </w:rPr>
-        <w:t>固定证据：artifacts/verification/round2/；服务基准：round2_service_after.json。</w:t>
+        <w:t>固定证据：artifacts/verification/round3/；服务基准：service_workload.json。第二轮目录保留为历史。</w:t>
       </w:r>
     </w:p>
     <w:p>

</xml_diff>

<commit_message>
chore(resume): preserve interrupted round4 work and acceptance todo
</commit_message>
<xml_diff>
--- a/deliverables/doc/OS_Agent_记忆优化_技术方案与测试报告.docx
+++ b/deliverables/doc/OS_Agent_记忆优化_技术方案与测试报告.docx
@@ -40,7 +40,7 @@
         </w:rPr>
         <w:t>对应赛题：XA-202612</w:t>
         <w:br/>
-        <w:t>第二轮证据日期：2026-09-06</w:t>
+        <w:t>第四轮证据日期：2026-09-07</w:t>
       </w:r>
     </w:p>
     <w:p>
@@ -54,7 +54,7 @@
           <w:b/>
           <w:sz w:val="20"/>
         </w:rPr>
-        <w:t>边界：Windows + HashEmbedding 本地结果；真实银河麒麟与真实 SDK 尚未验证</w:t>
+        <w:t>边界：官方五项指标尚未全达成；V11虚拟机、真实SDK与独立评测分别记录</w:t>
       </w:r>
     </w:p>
     <w:p>
@@ -79,7 +79,7 @@
           <w:rFonts w:ascii="Microsoft YaHei" w:hAnsi="Microsoft YaHei" w:eastAsia="Microsoft YaHei"/>
           <w:sz w:val="21"/>
         </w:rPr>
-        <w:t>版本：第二轮（开发机交付草案）</w:t>
+        <w:t>版本：第四轮（官方口径整改草案）</w:t>
       </w:r>
     </w:p>
     <w:p>
@@ -91,7 +91,7 @@
           <w:rFonts w:ascii="Microsoft YaHei" w:hAnsi="Microsoft YaHei" w:eastAsia="Microsoft YaHei"/>
           <w:sz w:val="21"/>
         </w:rPr>
-        <w:t>更新时间：2026-09-06</w:t>
+        <w:t>更新时间：2026-09-07</w:t>
       </w:r>
     </w:p>
     <w:p>
@@ -147,7 +147,19 @@
           <w:rFonts w:ascii="Microsoft YaHei" w:hAnsi="Microsoft YaHei" w:eastAsia="Microsoft YaHei"/>
           <w:sz w:val="21"/>
         </w:rPr>
-        <w:t>当前仓库已形成标准库原型、增量 SQLite 持久化、统一生命周期服务、本地场景演示、分区评测和规模基准。第三轮测试数及性能统一由 artifacts/verification/round3/evidence_summary.json 生成，见《第三轮验收报告》。数据使用 Windows 和 HashEmbedding，不替代真实银河麒麟 embedding SDK 验收。</w:t>
+        <w:t>当前仓库已形成标准库原型、增量 SQLite 持久化、统一生命周期服务、本地场景演示、分区评测和规模基准。第四轮新增Markdown/YAML授权记忆、按需召回、逐项确认遗忘、50轮行动评测框架与真实Embedding C ABI适配。当前证据见 artifacts/verification/round4/evidence_summary.json 和《第四轮验收报告》；第三轮数据保留为历史内部回归。</w:t>
+      </w:r>
+    </w:p>
+    <w:p>
+      <w:pPr>
+        <w:spacing w:line="324" w:lineRule="auto"/>
+      </w:pPr>
+      <w:r>
+        <w:rPr>
+          <w:rFonts w:ascii="Microsoft YaHei" w:hAnsi="Microsoft YaHei" w:eastAsia="Microsoft YaHei"/>
+          <w:sz w:val="21"/>
+        </w:rPr>
+        <w:t>官方强制部署为银河麒麟V11；目标为偏好准确率≥85%、知识召回率≥85%、冲突正确率≥88%、检索P95≤500ms、敏感识别F1≥90%，每项至少50独立请求。SDK属于推荐项。当前偏好准确率及部分样本数仍不足，行动替身自检不能替代真实Agent或独立Judge成绩。</w:t>
       </w:r>
     </w:p>
     <w:p>
@@ -1452,7 +1464,7 @@
           <w:rFonts w:ascii="Microsoft YaHei" w:hAnsi="Microsoft YaHei" w:eastAsia="Microsoft YaHei"/>
           <w:sz w:val="21"/>
         </w:rPr>
-        <w:t>KylinEmbeddingProvider 支持配置 SDK 模块、工厂、参数、方法名和嵌套返回路径，并验证向量非空、数值有限和归一化。自检不回显参数值。环境报告分别判断开发运行条件、真实银河麒麟识别、真实 SDK 和赛题环境整体就绪。</w:t>
+        <w:t>KylinEmbeddingProvider 保留为通用Python模块适配支架；新增kylin-native依据公开C ABI调用真实共享库，使用独立子进程限制超时和崩溃，校验维度及有限非零向量，最终释放会话与结果。不会静默回退为HashEmbedding。向量数据库公开接口是C++客户端，当前真实服务桥接未完成。环境严格识别银河麒麟V11，库存在、Embedding连通、向量数据库连通及正式就绪分别报告。</w:t>
       </w:r>
     </w:p>
     <w:p>
@@ -2115,7 +2127,7 @@
         <w:pStyle w:val="Heading1"/>
       </w:pPr>
       <w:r>
-        <w:t>第三轮本地质量验收报告</w:t>
+        <w:t>第四轮：官方口径与隔离环境验收</w:t>
       </w:r>
     </w:p>
     <w:p>
@@ -2127,59 +2139,7 @@
           <w:rFonts w:ascii="Microsoft YaHei" w:hAnsi="Microsoft YaHei" w:eastAsia="Microsoft YaHei"/>
           <w:sz w:val="21"/>
         </w:rPr>
-        <w:t>固定证据生成时间（UTC）：2026-09-06T13:38:53+00:00。本报告与 PPT 共用 evidence_summary.json。</w:t>
-      </w:r>
-    </w:p>
-    <w:p>
-      <w:pPr>
-        <w:pStyle w:val="Heading2"/>
-      </w:pPr>
-      <w:r>
-        <w:t>验收结论</w:t>
-      </w:r>
-    </w:p>
-    <w:p>
-      <w:pPr>
-        <w:pStyle w:val="ListBullet"/>
-      </w:pPr>
-      <w:r>
-        <w:rPr>
-          <w:rFonts w:ascii="Microsoft YaHei" w:hAnsi="Microsoft YaHei" w:eastAsia="Microsoft YaHei"/>
-          <w:sz w:val="21"/>
-        </w:rPr>
-        <w:t>工程检查通过：True；自动化测试 91 项全部通过。</w:t>
-      </w:r>
-    </w:p>
-    <w:p>
-      <w:pPr>
-        <w:pStyle w:val="ListBullet"/>
-      </w:pPr>
-      <w:r>
-        <w:rPr>
-          <w:rFonts w:ascii="Microsoft YaHei" w:hAnsi="Microsoft YaHei" w:eastAsia="Microsoft YaHei"/>
-          <w:sz w:val="21"/>
-        </w:rPr>
-        <w:t>内部质量目标全部满足：True；正式赛事就绪：False。</w:t>
-      </w:r>
-    </w:p>
-    <w:p>
-      <w:pPr>
-        <w:pStyle w:val="ListBullet"/>
-      </w:pPr>
-      <w:r>
-        <w:rPr>
-          <w:rFonts w:ascii="Microsoft YaHei" w:hAnsi="Microsoft YaHei" w:eastAsia="Microsoft YaHei"/>
-          <w:sz w:val="21"/>
-        </w:rPr>
-        <w:t>真实 SDK、麒麟、盲测、授权案例、视频和赛事凭证仍未取得；本轮仅验收本地任务。</w:t>
-      </w:r>
-    </w:p>
-    <w:p>
-      <w:pPr>
-        <w:pStyle w:val="Heading2"/>
-      </w:pPr>
-      <w:r>
-        <w:t>已具备的工程能力与本轮改造</w:t>
+        <w:t>更新时间：2026-09-07T06:26:02+00:00</w:t>
       </w:r>
     </w:p>
     <w:p>
@@ -2191,191 +2151,7 @@
           <w:rFonts w:ascii="Microsoft YaHei" w:hAnsi="Microsoft YaHei" w:eastAsia="Microsoft YaHei"/>
           <w:sz w:val="21"/>
         </w:rPr>
-        <w:t>服务、CLI 与评测统一经过生命周期门槛；检索检查有效期；软删除重启后不恢复向量；</w:t>
-      </w:r>
-    </w:p>
-    <w:p>
-      <w:pPr>
-        <w:spacing w:line="324" w:lineRule="auto"/>
-      </w:pPr>
-      <w:r>
-        <w:rPr>
-          <w:rFonts w:ascii="Microsoft YaHei" w:hAnsi="Microsoft YaHei" w:eastAsia="Microsoft YaHei"/>
-          <w:sz w:val="21"/>
-        </w:rPr>
-        <w:t>持久化失败回滚内存、阶段证据和确认状态。SQLite 按主键增量写入，跨请求/重启去重，</w:t>
-      </w:r>
-    </w:p>
-    <w:p>
-      <w:pPr>
-        <w:spacing w:line="324" w:lineRule="auto"/>
-      </w:pPr>
-      <w:r>
-        <w:rPr>
-          <w:rFonts w:ascii="Microsoft YaHei" w:hAnsi="Microsoft YaHei" w:eastAsia="Microsoft YaHei"/>
-          <w:sz w:val="21"/>
-        </w:rPr>
-        <w:t>确认回执幂等，删除同时清理阶段证据。冲突/遗忘确认绑定租户与用户。</w:t>
-      </w:r>
-    </w:p>
-    <w:p>
-      <w:pPr>
-        <w:spacing w:line="324" w:lineRule="auto"/>
-      </w:pPr>
-      <w:r>
-        <w:rPr>
-          <w:rFonts w:ascii="Microsoft YaHei" w:hAnsi="Microsoft YaHei" w:eastAsia="Microsoft YaHei"/>
-          <w:sz w:val="21"/>
-        </w:rPr>
-        <w:t>词法倒排候选与近似语义候选合并，冲突补数字、条件、场景判断。</w:t>
-      </w:r>
-    </w:p>
-    <w:p>
-      <w:pPr>
-        <w:spacing w:line="324" w:lineRule="auto"/>
-      </w:pPr>
-      <w:r>
-        <w:rPr>
-          <w:rFonts w:ascii="Microsoft YaHei" w:hAnsi="Microsoft YaHei" w:eastAsia="Microsoft YaHei"/>
-          <w:sz w:val="21"/>
-        </w:rPr>
-        <w:t>embedding 配置贯穿服务、评测与基准，模型版本/维度变化时重建缓存，限制超时调用。</w:t>
-      </w:r>
-    </w:p>
-    <w:p>
-      <w:pPr>
-        <w:spacing w:line="324" w:lineRule="auto"/>
-      </w:pPr>
-      <w:r>
-        <w:rPr>
-          <w:rFonts w:ascii="Microsoft YaHei" w:hAnsi="Microsoft YaHei" w:eastAsia="Microsoft YaHei"/>
-          <w:sz w:val="21"/>
-        </w:rPr>
-        <w:t>界面新增合成场景、偏好历史、冲突前后对照、目标预览与演示租户恢复。</w:t>
-      </w:r>
-    </w:p>
-    <w:p>
-      <w:pPr>
-        <w:spacing w:line="324" w:lineRule="auto"/>
-      </w:pPr>
-      <w:r>
-        <w:rPr>
-          <w:rFonts w:ascii="Microsoft YaHei" w:hAnsi="Microsoft YaHei" w:eastAsia="Microsoft YaHei"/>
-          <w:sz w:val="21"/>
-        </w:rPr>
-        <w:t>本轮新增正文汉字倒排与精确覆盖分数；中文混合评分为向量 0.25、二字词法 0.25、汉字 0.45、权威度 0.05。</w:t>
-      </w:r>
-    </w:p>
-    <w:p>
-      <w:pPr>
-        <w:spacing w:line="324" w:lineRule="auto"/>
-      </w:pPr>
-      <w:r>
-        <w:rPr>
-          <w:rFonts w:ascii="Microsoft YaHei" w:hAnsi="Microsoft YaHei" w:eastAsia="Microsoft YaHei"/>
-          <w:sz w:val="21"/>
-        </w:rPr>
-        <w:t>汉字仅取标题与正文，不取元数据；独立向量候选仍保留。无中文证据时沿用原混合评分。</w:t>
-      </w:r>
-    </w:p>
-    <w:p>
-      <w:pPr>
-        <w:spacing w:line="324" w:lineRule="auto"/>
-      </w:pPr>
-      <w:r>
-        <w:rPr>
-          <w:rFonts w:ascii="Microsoft YaHei" w:hAnsi="Microsoft YaHei" w:eastAsia="Microsoft YaHei"/>
-          <w:sz w:val="21"/>
-        </w:rPr>
-        <w:t>dev 网格步长 0.01，取两项均 ≥85% 的最宽连续区间中心；若不可行，报告失败并保留平衡分回退。</w:t>
-      </w:r>
-    </w:p>
-    <w:p>
-      <w:pPr>
-        <w:spacing w:line="324" w:lineRule="auto"/>
-      </w:pPr>
-      <w:r>
-        <w:rPr>
-          <w:rFonts w:ascii="Microsoft YaHei" w:hAnsi="Microsoft YaHei" w:eastAsia="Microsoft YaHei"/>
-          <w:sz w:val="21"/>
-        </w:rPr>
-        <w:t>统一阈值已同步服务和 HTTP 默认入口；CI 与完整发布验收均检查两项 85% 门槛。</w:t>
-      </w:r>
-    </w:p>
-    <w:p>
-      <w:pPr>
-        <w:pStyle w:val="Heading2"/>
-      </w:pPr>
-      <w:r>
-        <w:t>数据与协议</w:t>
-      </w:r>
-    </w:p>
-    <w:p>
-      <w:pPr>
-        <w:spacing w:line="324" w:lineRule="auto"/>
-      </w:pPr>
-      <w:r>
-        <w:rPr>
-          <w:rFonts w:ascii="Microsoft YaHei" w:hAnsi="Microsoft YaHei" w:eastAsia="Microsoft YaHei"/>
-          <w:sz w:val="21"/>
-        </w:rPr>
-        <w:t>v3 含 42 个输入事件、18 个办公主题、54 个查询。每分区 14 个事件和 18 个查询，</w:t>
-      </w:r>
-    </w:p>
-    <w:p>
-      <w:pPr>
-        <w:spacing w:line="324" w:lineRule="auto"/>
-      </w:pPr>
-      <w:r>
-        <w:rPr>
-          <w:rFonts w:ascii="Microsoft YaHei" w:hAnsi="Microsoft YaHei" w:eastAsia="Microsoft YaHei"/>
-          <w:sz w:val="21"/>
-        </w:rPr>
-        <w:t>其中 12 个正例、6 个无答案。正文、模板族跨分区交集均为零，含改写及跨用户干扰。</w:t>
-      </w:r>
-    </w:p>
-    <w:p>
-      <w:pPr>
-        <w:spacing w:line="324" w:lineRule="auto"/>
-      </w:pPr>
-      <w:r>
-        <w:rPr>
-          <w:rFonts w:ascii="Microsoft YaHei" w:hAnsi="Microsoft YaHei" w:eastAsia="Microsoft YaHei"/>
-          <w:sz w:val="21"/>
-        </w:rPr>
-        <w:t>全部为开发者持有标签的合成内部评测，不是独立盲测；题量不足以证明开放域泛化。</w:t>
-      </w:r>
-    </w:p>
-    <w:p>
-      <w:pPr>
-        <w:spacing w:line="324" w:lineRule="auto"/>
-      </w:pPr>
-      <w:r>
-        <w:rPr>
-          <w:rFonts w:ascii="Microsoft YaHei" w:hAnsi="Microsoft YaHei" w:eastAsia="Microsoft YaHei"/>
-          <w:sz w:val="21"/>
-        </w:rPr>
-        <w:t>仅用 dev 选择统一阈值 0.265，然后测试。配置及 dev 摘要见 evaluation_v3.json。</w:t>
-      </w:r>
-    </w:p>
-    <w:p>
-      <w:pPr>
-        <w:spacing w:line="324" w:lineRule="auto"/>
-      </w:pPr>
-      <w:r>
-        <w:rPr>
-          <w:rFonts w:ascii="Microsoft YaHei" w:hAnsi="Microsoft YaHei" w:eastAsia="Microsoft YaHei"/>
-          <w:sz w:val="21"/>
-        </w:rPr>
-        <w:t>测试标签在开发过程中可见，后续修改必须如实注明再次接触 test；本轮不能称为盲测。</w:t>
-      </w:r>
-    </w:p>
-    <w:p>
-      <w:pPr>
-        <w:pStyle w:val="Heading2"/>
-      </w:pPr>
-      <w:r>
-        <w:t>检索对照</w:t>
+        <w:t>官方强制部署环境为银河麒麟 V11；SDK 为推荐项。下表是开发者持有公开合成标签的内部诊断，不能当作独立盲测或官方认证。</w:t>
       </w:r>
     </w:p>
     <w:tbl>
@@ -2404,7 +2180,7 @@
                 <w:b/>
                 <w:sz w:val="18"/>
               </w:rPr>
-              <w:t>模式</w:t>
+              <w:t>官方指标</w:t>
             </w:r>
           </w:p>
         </w:tc>
@@ -2420,7 +2196,7 @@
                 <w:b/>
                 <w:sz w:val="18"/>
               </w:rPr>
-              <w:t>正例 Recall@3</w:t>
+              <w:t>目标</w:t>
             </w:r>
           </w:p>
         </w:tc>
@@ -2436,7 +2212,7 @@
                 <w:b/>
                 <w:sz w:val="18"/>
               </w:rPr>
-              <w:t>无答案正确率</w:t>
+              <w:t>当前内部值</w:t>
             </w:r>
           </w:p>
         </w:tc>
@@ -2452,7 +2228,7 @@
                 <w:b/>
                 <w:sz w:val="18"/>
               </w:rPr>
-              <w:t>平衡得分</w:t>
+              <w:t>分母</w:t>
             </w:r>
           </w:p>
         </w:tc>
@@ -2468,7 +2244,7 @@
                 <w:b/>
                 <w:sz w:val="18"/>
               </w:rPr>
-              <w:t>dev 阈值</w:t>
+              <w:t>限制</w:t>
             </w:r>
           </w:p>
         </w:tc>
@@ -2486,7 +2262,7 @@
                 <w:b w:val="0"/>
                 <w:sz w:val="18"/>
               </w:rPr>
-              <w:t>lexical</w:t>
+              <w:t>偏好提取准确率</w:t>
             </w:r>
           </w:p>
         </w:tc>
@@ -2502,7 +2278,7 @@
                 <w:b w:val="0"/>
                 <w:sz w:val="18"/>
               </w:rPr>
-              <w:t>0.8333</w:t>
+              <w:t>≥85%</w:t>
             </w:r>
           </w:p>
         </w:tc>
@@ -2518,7 +2294,7 @@
                 <w:b w:val="0"/>
                 <w:sz w:val="18"/>
               </w:rPr>
-              <w:t>1.0000</w:t>
+              <w:t>46.15%</w:t>
             </w:r>
           </w:p>
         </w:tc>
@@ -2534,7 +2310,7 @@
                 <w:b w:val="0"/>
                 <w:sz w:val="18"/>
               </w:rPr>
-              <w:t>0.9167</w:t>
+              <w:t>13</w:t>
             </w:r>
           </w:p>
         </w:tc>
@@ -2550,7 +2326,7 @@
                 <w:b w:val="0"/>
                 <w:sz w:val="18"/>
               </w:rPr>
-              <w:t>0.115</w:t>
+              <w:t>旧v2持久偏好槽位；非独立请求，未达目标</w:t>
             </w:r>
           </w:p>
         </w:tc>
@@ -2568,7 +2344,7 @@
                 <w:b w:val="0"/>
                 <w:sz w:val="18"/>
               </w:rPr>
-              <w:t>semantic</w:t>
+              <w:t>知识检索召回率</w:t>
             </w:r>
           </w:p>
         </w:tc>
@@ -2584,7 +2360,7 @@
                 <w:b w:val="0"/>
                 <w:sz w:val="18"/>
               </w:rPr>
-              <w:t>1.0000</w:t>
+              <w:t>≥85%</w:t>
             </w:r>
           </w:p>
         </w:tc>
@@ -2600,7 +2376,7 @@
                 <w:b w:val="0"/>
                 <w:sz w:val="18"/>
               </w:rPr>
-              <w:t>0.5000</w:t>
+              <w:t>91.67%</w:t>
             </w:r>
           </w:p>
         </w:tc>
@@ -2616,7 +2392,7 @@
                 <w:b w:val="0"/>
                 <w:sz w:val="18"/>
               </w:rPr>
-              <w:t>0.7500</w:t>
+              <w:t>12</w:t>
             </w:r>
           </w:p>
         </w:tc>
@@ -2632,7 +2408,7 @@
                 <w:b w:val="0"/>
                 <w:sz w:val="18"/>
               </w:rPr>
-              <w:t>0.2</w:t>
+              <w:t>v3正例Recall@3，少于50请求</w:t>
             </w:r>
           </w:p>
         </w:tc>
@@ -2650,7 +2426,7 @@
                 <w:b w:val="0"/>
                 <w:sz w:val="18"/>
               </w:rPr>
-              <w:t>hybrid</w:t>
+              <w:t>知识冲突处理正确率</w:t>
             </w:r>
           </w:p>
         </w:tc>
@@ -2666,7 +2442,7 @@
                 <w:b w:val="0"/>
                 <w:sz w:val="18"/>
               </w:rPr>
-              <w:t>0.9167</w:t>
+              <w:t>≥88%</w:t>
             </w:r>
           </w:p>
         </w:tc>
@@ -2682,7 +2458,7 @@
                 <w:b w:val="0"/>
                 <w:sz w:val="18"/>
               </w:rPr>
-              <w:t>1.0000</w:t>
+              <w:t>100.00%</w:t>
             </w:r>
           </w:p>
         </w:tc>
@@ -2698,7 +2474,7 @@
                 <w:b w:val="0"/>
                 <w:sz w:val="18"/>
               </w:rPr>
-              <w:t>0.9583</w:t>
+              <w:t>2</w:t>
             </w:r>
           </w:p>
         </w:tc>
@@ -2714,207 +2490,7 @@
                 <w:b w:val="0"/>
                 <w:sz w:val="18"/>
               </w:rPr>
-              <w:t>0.265</w:t>
-            </w:r>
-          </w:p>
-        </w:tc>
-      </w:tr>
-    </w:tbl>
-    <w:p>
-      <w:pPr>
-        <w:spacing w:line="324" w:lineRule="auto"/>
-      </w:pPr>
-      <w:r>
-        <w:rPr>
-          <w:rFonts w:ascii="Microsoft YaHei" w:hAnsi="Microsoft YaHei" w:eastAsia="Microsoft YaHei"/>
-          <w:sz w:val="21"/>
-        </w:rPr>
-        <w:t>平衡得分为正例召回与无答案正确率的平均值，各模式分别在 dev 定阈值。</w:t>
-      </w:r>
-    </w:p>
-    <w:p>
-      <w:pPr>
-        <w:spacing w:line="324" w:lineRule="auto"/>
-      </w:pPr>
-      <w:r>
-        <w:rPr>
-          <w:rFonts w:ascii="Microsoft YaHei" w:hAnsi="Microsoft YaHei" w:eastAsia="Microsoft YaHei"/>
-          <w:sz w:val="21"/>
-        </w:rPr>
-        <w:t>本次混合结果在这份小样本内部回归上改善，不代表开放域或真实 SDK 全面领先。</w:t>
-      </w:r>
-    </w:p>
-    <w:p>
-      <w:pPr>
-        <w:spacing w:line="324" w:lineRule="auto"/>
-      </w:pPr>
-      <w:r>
-        <w:rPr>
-          <w:rFonts w:ascii="Microsoft YaHei" w:hAnsi="Microsoft YaHei" w:eastAsia="Microsoft YaHei"/>
-          <w:sz w:val="21"/>
-        </w:rPr>
-        <w:t>质量目标两项各 ≥0.85，本次全部满足：True。</w:t>
-      </w:r>
-    </w:p>
-    <w:p>
-      <w:pPr>
-        <w:spacing w:line="324" w:lineRule="auto"/>
-      </w:pPr>
-      <w:r>
-        <w:rPr>
-          <w:rFonts w:ascii="Microsoft YaHei" w:hAnsi="Microsoft YaHei" w:eastAsia="Microsoft YaHei"/>
-          <w:sz w:val="21"/>
-        </w:rPr>
-        <w:t>正例完整召回 11/12；无答案正确 6/6。</w:t>
-      </w:r>
-    </w:p>
-    <w:p>
-      <w:pPr>
-        <w:spacing w:line="324" w:lineRule="auto"/>
-      </w:pPr>
-      <w:r>
-        <w:rPr>
-          <w:rFonts w:ascii="Microsoft YaHei" w:hAnsi="Microsoft YaHei" w:eastAsia="Microsoft YaHei"/>
-          <w:sz w:val="21"/>
-        </w:rPr>
-        <w:t>首次 0.225 阈值复测得到 11/12 与 5/6，保留 calibration_first_probe.json；之后按 dev 可用区间 0.22–0.31 冻结中心 0.265。</w:t>
-      </w:r>
-    </w:p>
-    <w:p>
-      <w:pPr>
-        <w:spacing w:line="324" w:lineRule="auto"/>
-      </w:pPr>
-      <w:r>
-        <w:rPr>
-          <w:rFonts w:ascii="Microsoft YaHei" w:hAnsi="Microsoft YaHei" w:eastAsia="Microsoft YaHei"/>
-          <w:sz w:val="21"/>
-        </w:rPr>
-        <w:t>数据、标签和分母未改变；test 被重复接触，本次属于开发者内部回归，不能称为盲测。</w:t>
-      </w:r>
-    </w:p>
-    <w:p>
-      <w:pPr>
-        <w:spacing w:line="324" w:lineRule="auto"/>
-      </w:pPr>
-      <w:r>
-        <w:rPr>
-          <w:rFonts w:ascii="Microsoft YaHei" w:hAnsi="Microsoft YaHei" w:eastAsia="Microsoft YaHei"/>
-          <w:sz w:val="21"/>
-        </w:rPr>
-        <w:t>缓存消融统计编码次数并核对返回结果一致；衰减诊断出现持平也保留，单一诊断不等于统计提升。</w:t>
-      </w:r>
-    </w:p>
-    <w:p>
-      <w:pPr>
-        <w:spacing w:line="324" w:lineRule="auto"/>
-      </w:pPr>
-      <w:r>
-        <w:rPr>
-          <w:rFonts w:ascii="Microsoft YaHei" w:hAnsi="Microsoft YaHei" w:eastAsia="Microsoft YaHei"/>
-          <w:sz w:val="21"/>
-        </w:rPr>
-        <w:t>旧 v1/v2 标签包含一次性低证据：门控后存在漏报和目标未满足，旧版 1.0 不再作为当前成绩。</w:t>
-      </w:r>
-    </w:p>
-    <w:p>
-      <w:pPr>
-        <w:pStyle w:val="Heading2"/>
-      </w:pPr>
-      <w:r>
-        <w:t>性能</w:t>
-      </w:r>
-    </w:p>
-    <w:tbl>
-      <w:tblPr>
-        <w:tblStyle w:val="TableGrid"/>
-        <w:tblW w:type="auto" w:w="0"/>
-        <w:tblLook w:firstColumn="1" w:firstRow="1" w:lastColumn="0" w:lastRow="0" w:noHBand="0" w:noVBand="1" w:val="04A0"/>
-      </w:tblPr>
-      <w:tblGrid>
-        <w:gridCol w:w="1881"/>
-        <w:gridCol w:w="1881"/>
-        <w:gridCol w:w="1881"/>
-        <w:gridCol w:w="1881"/>
-        <w:gridCol w:w="1881"/>
-      </w:tblGrid>
-      <w:tr>
-        <w:tc>
-          <w:tcPr>
-            <w:tcW w:type="dxa" w:w="1881"/>
-          </w:tcPr>
-          <w:p>
-            <w:r/>
-            <w:r>
-              <w:rPr>
-                <w:rFonts w:ascii="Microsoft YaHei" w:hAnsi="Microsoft YaHei" w:eastAsia="Microsoft YaHei"/>
-                <w:b/>
-                <w:sz w:val="18"/>
-              </w:rPr>
-              <w:t>规模</w:t>
-            </w:r>
-          </w:p>
-        </w:tc>
-        <w:tc>
-          <w:tcPr>
-            <w:tcW w:type="dxa" w:w="1881"/>
-          </w:tcPr>
-          <w:p>
-            <w:r/>
-            <w:r>
-              <w:rPr>
-                <w:rFonts w:ascii="Microsoft YaHei" w:hAnsi="Microsoft YaHei" w:eastAsia="Microsoft YaHei"/>
-                <w:b/>
-                <w:sz w:val="18"/>
-              </w:rPr>
-              <w:t>冷查询 ms</w:t>
-            </w:r>
-          </w:p>
-        </w:tc>
-        <w:tc>
-          <w:tcPr>
-            <w:tcW w:type="dxa" w:w="1881"/>
-          </w:tcPr>
-          <w:p>
-            <w:r/>
-            <w:r>
-              <w:rPr>
-                <w:rFonts w:ascii="Microsoft YaHei" w:hAnsi="Microsoft YaHei" w:eastAsia="Microsoft YaHei"/>
-                <w:b/>
-                <w:sz w:val="18"/>
-              </w:rPr>
-              <w:t>热 p99 ms</w:t>
-            </w:r>
-          </w:p>
-        </w:tc>
-        <w:tc>
-          <w:tcPr>
-            <w:tcW w:type="dxa" w:w="1881"/>
-          </w:tcPr>
-          <w:p>
-            <w:r/>
-            <w:r>
-              <w:rPr>
-                <w:rFonts w:ascii="Microsoft YaHei" w:hAnsi="Microsoft YaHei" w:eastAsia="Microsoft YaHei"/>
-                <w:b/>
-                <w:sz w:val="18"/>
-              </w:rPr>
-              <w:t>Python 峰值 MB</w:t>
-            </w:r>
-          </w:p>
-        </w:tc>
-        <w:tc>
-          <w:tcPr>
-            <w:tcW w:type="dxa" w:w="1881"/>
-          </w:tcPr>
-          <w:p>
-            <w:r/>
-            <w:r>
-              <w:rPr>
-                <w:rFonts w:ascii="Microsoft YaHei" w:hAnsi="Microsoft YaHei" w:eastAsia="Microsoft YaHei"/>
-                <w:b/>
-                <w:sz w:val="18"/>
-              </w:rPr>
-              <w:t>SQLite MB</w:t>
+              <w:t>仅2个旧集案例，少于50请求</w:t>
             </w:r>
           </w:p>
         </w:tc>
@@ -2932,7 +2508,7 @@
                 <w:b w:val="0"/>
                 <w:sz w:val="18"/>
               </w:rPr>
-              <w:t>100</w:t>
+              <w:t>检索响应延迟P95</w:t>
             </w:r>
           </w:p>
         </w:tc>
@@ -2948,7 +2524,7 @@
                 <w:b w:val="0"/>
                 <w:sz w:val="18"/>
               </w:rPr>
-              <w:t>13.517</w:t>
+              <w:t>≤500ms</w:t>
             </w:r>
           </w:p>
         </w:tc>
@@ -2964,7 +2540,7 @@
                 <w:b w:val="0"/>
                 <w:sz w:val="18"/>
               </w:rPr>
-              <w:t>35.164</w:t>
+              <w:t>190.565ms</w:t>
             </w:r>
           </w:p>
         </w:tc>
@@ -2980,7 +2556,7 @@
                 <w:b w:val="0"/>
                 <w:sz w:val="18"/>
               </w:rPr>
-              <w:t>2.776</w:t>
+              <w:t>50</w:t>
             </w:r>
           </w:p>
         </w:tc>
@@ -2996,7 +2572,7 @@
                 <w:b w:val="0"/>
                 <w:sz w:val="18"/>
               </w:rPr>
-              <w:t>0.449</w:t>
+              <w:t>HashEmbedding，进程内，合成主题模板</w:t>
             </w:r>
           </w:p>
         </w:tc>
@@ -3014,7 +2590,7 @@
                 <w:b w:val="0"/>
                 <w:sz w:val="18"/>
               </w:rPr>
-              <w:t>1000</w:t>
+              <w:t>敏感信息识别F1</w:t>
             </w:r>
           </w:p>
         </w:tc>
@@ -3030,7 +2606,7 @@
                 <w:b w:val="0"/>
                 <w:sz w:val="18"/>
               </w:rPr>
-              <w:t>61.599</w:t>
+              <w:t>≥90%</w:t>
             </w:r>
           </w:p>
         </w:tc>
@@ -3046,7 +2622,7 @@
                 <w:b w:val="0"/>
                 <w:sz w:val="18"/>
               </w:rPr>
-              <w:t>97.627</w:t>
+              <w:t>100.00%</w:t>
             </w:r>
           </w:p>
         </w:tc>
@@ -3062,7 +2638,7 @@
                 <w:b w:val="0"/>
                 <w:sz w:val="18"/>
               </w:rPr>
-              <w:t>22.835</w:t>
+              <w:t>50</w:t>
             </w:r>
           </w:p>
         </w:tc>
@@ -3078,171 +2654,7 @@
                 <w:b w:val="0"/>
                 <w:sz w:val="18"/>
               </w:rPr>
-              <w:t>4.047</w:t>
-            </w:r>
-          </w:p>
-        </w:tc>
-      </w:tr>
-      <w:tr>
-        <w:tc>
-          <w:tcPr>
-            <w:tcW w:type="dxa" w:w="1881"/>
-          </w:tcPr>
-          <w:p>
-            <w:r/>
-            <w:r>
-              <w:rPr>
-                <w:rFonts w:ascii="Microsoft YaHei" w:hAnsi="Microsoft YaHei" w:eastAsia="Microsoft YaHei"/>
-                <w:b w:val="0"/>
-                <w:sz w:val="18"/>
-              </w:rPr>
-              <w:t>5000</w:t>
-            </w:r>
-          </w:p>
-        </w:tc>
-        <w:tc>
-          <w:tcPr>
-            <w:tcW w:type="dxa" w:w="1881"/>
-          </w:tcPr>
-          <w:p>
-            <w:r/>
-            <w:r>
-              <w:rPr>
-                <w:rFonts w:ascii="Microsoft YaHei" w:hAnsi="Microsoft YaHei" w:eastAsia="Microsoft YaHei"/>
-                <w:b w:val="0"/>
-                <w:sz w:val="18"/>
-              </w:rPr>
-              <w:t>140.515</w:t>
-            </w:r>
-          </w:p>
-        </w:tc>
-        <w:tc>
-          <w:tcPr>
-            <w:tcW w:type="dxa" w:w="1881"/>
-          </w:tcPr>
-          <w:p>
-            <w:r/>
-            <w:r>
-              <w:rPr>
-                <w:rFonts w:ascii="Microsoft YaHei" w:hAnsi="Microsoft YaHei" w:eastAsia="Microsoft YaHei"/>
-                <w:b w:val="0"/>
-                <w:sz w:val="18"/>
-              </w:rPr>
-              <w:t>176.329</w:t>
-            </w:r>
-          </w:p>
-        </w:tc>
-        <w:tc>
-          <w:tcPr>
-            <w:tcW w:type="dxa" w:w="1881"/>
-          </w:tcPr>
-          <w:p>
-            <w:r/>
-            <w:r>
-              <w:rPr>
-                <w:rFonts w:ascii="Microsoft YaHei" w:hAnsi="Microsoft YaHei" w:eastAsia="Microsoft YaHei"/>
-                <w:b w:val="0"/>
-                <w:sz w:val="18"/>
-              </w:rPr>
-              <w:t>143.642</w:t>
-            </w:r>
-          </w:p>
-        </w:tc>
-        <w:tc>
-          <w:tcPr>
-            <w:tcW w:type="dxa" w:w="1881"/>
-          </w:tcPr>
-          <w:p>
-            <w:r/>
-            <w:r>
-              <w:rPr>
-                <w:rFonts w:ascii="Microsoft YaHei" w:hAnsi="Microsoft YaHei" w:eastAsia="Microsoft YaHei"/>
-                <w:b w:val="0"/>
-                <w:sz w:val="18"/>
-              </w:rPr>
-              <w:t>20.02</w:t>
-            </w:r>
-          </w:p>
-        </w:tc>
-      </w:tr>
-      <w:tr>
-        <w:tc>
-          <w:tcPr>
-            <w:tcW w:type="dxa" w:w="1881"/>
-          </w:tcPr>
-          <w:p>
-            <w:r/>
-            <w:r>
-              <w:rPr>
-                <w:rFonts w:ascii="Microsoft YaHei" w:hAnsi="Microsoft YaHei" w:eastAsia="Microsoft YaHei"/>
-                <w:b w:val="0"/>
-                <w:sz w:val="18"/>
-              </w:rPr>
-              <w:t>10000</w:t>
-            </w:r>
-          </w:p>
-        </w:tc>
-        <w:tc>
-          <w:tcPr>
-            <w:tcW w:type="dxa" w:w="1881"/>
-          </w:tcPr>
-          <w:p>
-            <w:r/>
-            <w:r>
-              <w:rPr>
-                <w:rFonts w:ascii="Microsoft YaHei" w:hAnsi="Microsoft YaHei" w:eastAsia="Microsoft YaHei"/>
-                <w:b w:val="0"/>
-                <w:sz w:val="18"/>
-              </w:rPr>
-              <w:t>246.796</w:t>
-            </w:r>
-          </w:p>
-        </w:tc>
-        <w:tc>
-          <w:tcPr>
-            <w:tcW w:type="dxa" w:w="1881"/>
-          </w:tcPr>
-          <w:p>
-            <w:r/>
-            <w:r>
-              <w:rPr>
-                <w:rFonts w:ascii="Microsoft YaHei" w:hAnsi="Microsoft YaHei" w:eastAsia="Microsoft YaHei"/>
-                <w:b w:val="0"/>
-                <w:sz w:val="18"/>
-              </w:rPr>
-              <w:t>362.265</w:t>
-            </w:r>
-          </w:p>
-        </w:tc>
-        <w:tc>
-          <w:tcPr>
-            <w:tcW w:type="dxa" w:w="1881"/>
-          </w:tcPr>
-          <w:p>
-            <w:r/>
-            <w:r>
-              <w:rPr>
-                <w:rFonts w:ascii="Microsoft YaHei" w:hAnsi="Microsoft YaHei" w:eastAsia="Microsoft YaHei"/>
-                <w:b w:val="0"/>
-                <w:sz w:val="18"/>
-              </w:rPr>
-              <w:t>245.124</w:t>
-            </w:r>
-          </w:p>
-        </w:tc>
-        <w:tc>
-          <w:tcPr>
-            <w:tcW w:type="dxa" w:w="1881"/>
-          </w:tcPr>
-          <w:p>
-            <w:r/>
-            <w:r>
-              <w:rPr>
-                <w:rFonts w:ascii="Microsoft YaHei" w:hAnsi="Microsoft YaHei" w:eastAsia="Microsoft YaHei"/>
-                <w:b w:val="0"/>
-                <w:sz w:val="18"/>
-              </w:rPr>
-              <w:t>39.984</w:t>
+              <w:t>50公开合成请求；请求级分类，非实体级F1</w:t>
             </w:r>
           </w:p>
         </w:tc>
@@ -3257,328 +2669,7 @@
           <w:rFonts w:ascii="Microsoft YaHei" w:hAnsi="Microsoft YaHei" w:eastAsia="Microsoft YaHei"/>
           <w:sz w:val="21"/>
         </w:rPr>
-        <w:t>上表是 Windows + HashEmbedding 检索规模基准；新增实际服务负载另计生命周期、冲突、SQLite 和 HTTP：</w:t>
-      </w:r>
-    </w:p>
-    <w:tbl>
-      <w:tblPr>
-        <w:tblStyle w:val="TableGrid"/>
-        <w:tblW w:type="auto" w:w="0"/>
-        <w:tblLook w:firstColumn="1" w:firstRow="1" w:lastColumn="0" w:lastRow="0" w:noHBand="0" w:noVBand="1" w:val="04A0"/>
-      </w:tblPr>
-      <w:tblGrid>
-        <w:gridCol w:w="1568"/>
-        <w:gridCol w:w="1568"/>
-        <w:gridCol w:w="1568"/>
-        <w:gridCol w:w="1568"/>
-        <w:gridCol w:w="1568"/>
-        <w:gridCol w:w="1568"/>
-      </w:tblGrid>
-      <w:tr>
-        <w:tc>
-          <w:tcPr>
-            <w:tcW w:type="dxa" w:w="1568"/>
-          </w:tcPr>
-          <w:p>
-            <w:r/>
-            <w:r>
-              <w:rPr>
-                <w:rFonts w:ascii="Microsoft YaHei" w:hAnsi="Microsoft YaHei" w:eastAsia="Microsoft YaHei"/>
-                <w:b/>
-                <w:sz w:val="18"/>
-              </w:rPr>
-              <w:t>初始知识</w:t>
-            </w:r>
-          </w:p>
-        </w:tc>
-        <w:tc>
-          <w:tcPr>
-            <w:tcW w:type="dxa" w:w="1568"/>
-          </w:tcPr>
-          <w:p>
-            <w:r/>
-            <w:r>
-              <w:rPr>
-                <w:rFonts w:ascii="Microsoft YaHei" w:hAnsi="Microsoft YaHei" w:eastAsia="Microsoft YaHei"/>
-                <w:b/>
-                <w:sz w:val="18"/>
-              </w:rPr>
-              <w:t>批量接入 ms</w:t>
-            </w:r>
-          </w:p>
-        </w:tc>
-        <w:tc>
-          <w:tcPr>
-            <w:tcW w:type="dxa" w:w="1568"/>
-          </w:tcPr>
-          <w:p>
-            <w:r/>
-            <w:r>
-              <w:rPr>
-                <w:rFonts w:ascii="Microsoft YaHei" w:hAnsi="Microsoft YaHei" w:eastAsia="Microsoft YaHei"/>
-                <w:b/>
-                <w:sz w:val="18"/>
-              </w:rPr>
-              <w:t>单条追加 ms</w:t>
-            </w:r>
-          </w:p>
-        </w:tc>
-        <w:tc>
-          <w:tcPr>
-            <w:tcW w:type="dxa" w:w="1568"/>
-          </w:tcPr>
-          <w:p>
-            <w:r/>
-            <w:r>
-              <w:rPr>
-                <w:rFonts w:ascii="Microsoft YaHei" w:hAnsi="Microsoft YaHei" w:eastAsia="Microsoft YaHei"/>
-                <w:b/>
-                <w:sz w:val="18"/>
-              </w:rPr>
-              <w:t>重启加载 ms</w:t>
-            </w:r>
-          </w:p>
-        </w:tc>
-        <w:tc>
-          <w:tcPr>
-            <w:tcW w:type="dxa" w:w="1568"/>
-          </w:tcPr>
-          <w:p>
-            <w:r/>
-            <w:r>
-              <w:rPr>
-                <w:rFonts w:ascii="Microsoft YaHei" w:hAnsi="Microsoft YaHei" w:eastAsia="Microsoft YaHei"/>
-                <w:b/>
-                <w:sz w:val="18"/>
-              </w:rPr>
-              <w:t>混合查询 p99 ms</w:t>
-            </w:r>
-          </w:p>
-        </w:tc>
-        <w:tc>
-          <w:tcPr>
-            <w:tcW w:type="dxa" w:w="1568"/>
-          </w:tcPr>
-          <w:p>
-            <w:r/>
-            <w:r>
-              <w:rPr>
-                <w:rFonts w:ascii="Microsoft YaHei" w:hAnsi="Microsoft YaHei" w:eastAsia="Microsoft YaHei"/>
-                <w:b/>
-                <w:sz w:val="18"/>
-              </w:rPr>
-              <w:t>HTTP p99 ms</w:t>
-            </w:r>
-          </w:p>
-        </w:tc>
-      </w:tr>
-      <w:tr>
-        <w:tc>
-          <w:tcPr>
-            <w:tcW w:type="dxa" w:w="1568"/>
-          </w:tcPr>
-          <w:p>
-            <w:r/>
-            <w:r>
-              <w:rPr>
-                <w:rFonts w:ascii="Microsoft YaHei" w:hAnsi="Microsoft YaHei" w:eastAsia="Microsoft YaHei"/>
-                <w:b w:val="0"/>
-                <w:sz w:val="18"/>
-              </w:rPr>
-              <w:t>100</w:t>
-            </w:r>
-          </w:p>
-        </w:tc>
-        <w:tc>
-          <w:tcPr>
-            <w:tcW w:type="dxa" w:w="1568"/>
-          </w:tcPr>
-          <w:p>
-            <w:r/>
-            <w:r>
-              <w:rPr>
-                <w:rFonts w:ascii="Microsoft YaHei" w:hAnsi="Microsoft YaHei" w:eastAsia="Microsoft YaHei"/>
-                <w:b w:val="0"/>
-                <w:sz w:val="18"/>
-              </w:rPr>
-              <w:t>194.493</w:t>
-            </w:r>
-          </w:p>
-        </w:tc>
-        <w:tc>
-          <w:tcPr>
-            <w:tcW w:type="dxa" w:w="1568"/>
-          </w:tcPr>
-          <w:p>
-            <w:r/>
-            <w:r>
-              <w:rPr>
-                <w:rFonts w:ascii="Microsoft YaHei" w:hAnsi="Microsoft YaHei" w:eastAsia="Microsoft YaHei"/>
-                <w:b w:val="0"/>
-                <w:sz w:val="18"/>
-              </w:rPr>
-              <w:t>50.869</w:t>
-            </w:r>
-          </w:p>
-        </w:tc>
-        <w:tc>
-          <w:tcPr>
-            <w:tcW w:type="dxa" w:w="1568"/>
-          </w:tcPr>
-          <w:p>
-            <w:r/>
-            <w:r>
-              <w:rPr>
-                <w:rFonts w:ascii="Microsoft YaHei" w:hAnsi="Microsoft YaHei" w:eastAsia="Microsoft YaHei"/>
-                <w:b w:val="0"/>
-                <w:sz w:val="18"/>
-              </w:rPr>
-              <w:t>36.737</w:t>
-            </w:r>
-          </w:p>
-        </w:tc>
-        <w:tc>
-          <w:tcPr>
-            <w:tcW w:type="dxa" w:w="1568"/>
-          </w:tcPr>
-          <w:p>
-            <w:r/>
-            <w:r>
-              <w:rPr>
-                <w:rFonts w:ascii="Microsoft YaHei" w:hAnsi="Microsoft YaHei" w:eastAsia="Microsoft YaHei"/>
-                <w:b w:val="0"/>
-                <w:sz w:val="18"/>
-              </w:rPr>
-              <w:t>3.975</w:t>
-            </w:r>
-          </w:p>
-        </w:tc>
-        <w:tc>
-          <w:tcPr>
-            <w:tcW w:type="dxa" w:w="1568"/>
-          </w:tcPr>
-          <w:p>
-            <w:r/>
-            <w:r>
-              <w:rPr>
-                <w:rFonts w:ascii="Microsoft YaHei" w:hAnsi="Microsoft YaHei" w:eastAsia="Microsoft YaHei"/>
-                <w:b w:val="0"/>
-                <w:sz w:val="18"/>
-              </w:rPr>
-              <w:t>22.705</w:t>
-            </w:r>
-          </w:p>
-        </w:tc>
-      </w:tr>
-      <w:tr>
-        <w:tc>
-          <w:tcPr>
-            <w:tcW w:type="dxa" w:w="1568"/>
-          </w:tcPr>
-          <w:p>
-            <w:r/>
-            <w:r>
-              <w:rPr>
-                <w:rFonts w:ascii="Microsoft YaHei" w:hAnsi="Microsoft YaHei" w:eastAsia="Microsoft YaHei"/>
-                <w:b w:val="0"/>
-                <w:sz w:val="18"/>
-              </w:rPr>
-              <w:t>1000</w:t>
-            </w:r>
-          </w:p>
-        </w:tc>
-        <w:tc>
-          <w:tcPr>
-            <w:tcW w:type="dxa" w:w="1568"/>
-          </w:tcPr>
-          <w:p>
-            <w:r/>
-            <w:r>
-              <w:rPr>
-                <w:rFonts w:ascii="Microsoft YaHei" w:hAnsi="Microsoft YaHei" w:eastAsia="Microsoft YaHei"/>
-                <w:b w:val="0"/>
-                <w:sz w:val="18"/>
-              </w:rPr>
-              <w:t>4478.732</w:t>
-            </w:r>
-          </w:p>
-        </w:tc>
-        <w:tc>
-          <w:tcPr>
-            <w:tcW w:type="dxa" w:w="1568"/>
-          </w:tcPr>
-          <w:p>
-            <w:r/>
-            <w:r>
-              <w:rPr>
-                <w:rFonts w:ascii="Microsoft YaHei" w:hAnsi="Microsoft YaHei" w:eastAsia="Microsoft YaHei"/>
-                <w:b w:val="0"/>
-                <w:sz w:val="18"/>
-              </w:rPr>
-              <w:t>325.806</w:t>
-            </w:r>
-          </w:p>
-        </w:tc>
-        <w:tc>
-          <w:tcPr>
-            <w:tcW w:type="dxa" w:w="1568"/>
-          </w:tcPr>
-          <w:p>
-            <w:r/>
-            <w:r>
-              <w:rPr>
-                <w:rFonts w:ascii="Microsoft YaHei" w:hAnsi="Microsoft YaHei" w:eastAsia="Microsoft YaHei"/>
-                <w:b w:val="0"/>
-                <w:sz w:val="18"/>
-              </w:rPr>
-              <w:t>235.462</w:t>
-            </w:r>
-          </w:p>
-        </w:tc>
-        <w:tc>
-          <w:tcPr>
-            <w:tcW w:type="dxa" w:w="1568"/>
-          </w:tcPr>
-          <w:p>
-            <w:r/>
-            <w:r>
-              <w:rPr>
-                <w:rFonts w:ascii="Microsoft YaHei" w:hAnsi="Microsoft YaHei" w:eastAsia="Microsoft YaHei"/>
-                <w:b w:val="0"/>
-                <w:sz w:val="18"/>
-              </w:rPr>
-              <w:t>12.898</w:t>
-            </w:r>
-          </w:p>
-        </w:tc>
-        <w:tc>
-          <w:tcPr>
-            <w:tcW w:type="dxa" w:w="1568"/>
-          </w:tcPr>
-          <w:p>
-            <w:r/>
-            <w:r>
-              <w:rPr>
-                <w:rFonts w:ascii="Microsoft YaHei" w:hAnsi="Microsoft YaHei" w:eastAsia="Microsoft YaHei"/>
-                <w:b w:val="0"/>
-                <w:sz w:val="18"/>
-              </w:rPr>
-              <w:t>32.438</w:t>
-            </w:r>
-          </w:p>
-        </w:tc>
-      </w:tr>
-    </w:tbl>
-    <w:p>
-      <w:pPr>
-        <w:spacing w:line="324" w:lineRule="auto"/>
-      </w:pPr>
-      <w:r>
-        <w:rPr>
-          <w:rFonts w:ascii="Microsoft YaHei" w:hAnsi="Microsoft YaHei" w:eastAsia="Microsoft YaHei"/>
-          <w:sz w:val="21"/>
-        </w:rPr>
-        <w:t>实际服务负载使用 4 线程混合读写，检查重启后记录数与查询非空；非空不等于检索准确。</w:t>
+        <w:t>每项官方测试至少50次独立请求；当前偏好、召回、冲突的分母不足，不使用重复执行来凑数。偏好旧评测通过真实生命周期门槛，未降低授权或晋升要求来提高分数。</w:t>
       </w:r>
     </w:p>
     <w:p>
@@ -3590,7 +2681,7 @@
           <w:rFonts w:ascii="Microsoft YaHei" w:hAnsi="Microsoft YaHei" w:eastAsia="Microsoft YaHei"/>
           <w:sz w:val="21"/>
         </w:rPr>
-        <w:t>p99 为少量采样经验值，不是生产 SLA。当前事务为单进程串行写，增量落盘仍需比较当前状态，</w:t>
+        <w:t>Windows完整工程检查通过：True；测试数：115。原始记录见 round4/final_verification.json。</w:t>
       </w:r>
     </w:p>
     <w:p>
@@ -3602,7 +2693,7 @@
           <w:rFonts w:ascii="Microsoft YaHei" w:hAnsi="Microsoft YaHei" w:eastAsia="Microsoft YaHei"/>
           <w:sz w:val="21"/>
         </w:rPr>
-        <w:t>相较第二轮 10k 热查询 p99 129.045ms、峰值 178.782MB，本轮增加汉字索引后延迟与内存均上升；质量达标不意味着性能也提升。</w:t>
+        <w:t>V11专用虚拟机已安装：False；客户机回归通过：False。详情见 round4/kylin_vm.json（存在时）。</w:t>
       </w:r>
     </w:p>
     <w:p>
@@ -3614,7 +2705,7 @@
           <w:rFonts w:ascii="Microsoft YaHei" w:hAnsi="Microsoft YaHei" w:eastAsia="Microsoft YaHei"/>
           <w:sz w:val="21"/>
         </w:rPr>
-        <w:t>回滚快照有内存成本；多个进程同时写同一数据库尚不支持。</w:t>
+        <w:t>虚拟机实测不能自行证明赛事认可；架构与虚拟化信息随报告保存。真实SDK/模型/向量服务连接仍以独立诊断为准。</w:t>
       </w:r>
     </w:p>
     <w:p>
@@ -3622,7 +2713,99 @@
         <w:pStyle w:val="Heading2"/>
       </w:pPr>
       <w:r>
-        <w:t>复现与证据</w:t>
+        <w:t>本轮实现</w:t>
+      </w:r>
+    </w:p>
+    <w:p>
+      <w:pPr>
+        <w:pStyle w:val="ListBullet"/>
+      </w:pPr>
+      <w:r>
+        <w:rPr>
+          <w:rFonts w:ascii="Microsoft YaHei" w:hAnsi="Microsoft YaHei" w:eastAsia="Microsoft YaHei"/>
+          <w:sz w:val="21"/>
+        </w:rPr>
+        <w:t>官方五项指标、50请求门槛、V11严格识别；内部结果和正式就绪分离。</w:t>
+      </w:r>
+    </w:p>
+    <w:p>
+      <w:pPr>
+        <w:pStyle w:val="ListBullet"/>
+      </w:pPr>
+      <w:r>
+        <w:rPr>
+          <w:rFonts w:ascii="Microsoft YaHei" w:hAnsi="Microsoft YaHei" w:eastAsia="Microsoft YaHei"/>
+          <w:sz w:val="21"/>
+        </w:rPr>
+        <w:t>独立实验目录、venv与虚拟磁盘；镜像校验；赛后先核查、再可恢复撤除。</w:t>
+      </w:r>
+    </w:p>
+    <w:p>
+      <w:pPr>
+        <w:pStyle w:val="ListBullet"/>
+      </w:pPr>
+      <w:r>
+        <w:rPr>
+          <w:rFonts w:ascii="Microsoft YaHei" w:hAnsi="Microsoft YaHei" w:eastAsia="Microsoft YaHei"/>
+          <w:sz w:val="21"/>
+        </w:rPr>
+        <w:t>Markdown/YAML四类记忆、显式授权、版本更新、索引预算和失败回滚。</w:t>
+      </w:r>
+    </w:p>
+    <w:p>
+      <w:pPr>
+        <w:pStyle w:val="ListBullet"/>
+      </w:pPr>
+      <w:r>
+        <w:rPr>
+          <w:rFonts w:ascii="Microsoft YaHei" w:hAnsi="Microsoft YaHei" w:eastAsia="Microsoft YaHei"/>
+          <w:sz w:val="21"/>
+        </w:rPr>
+        <w:t>按需召回最多5条、超时及失败关闭、正文读取预算、歧义删除逐项确认。</w:t>
+      </w:r>
+    </w:p>
+    <w:p>
+      <w:pPr>
+        <w:pStyle w:val="ListBullet"/>
+      </w:pPr>
+      <w:r>
+        <w:rPr>
+          <w:rFonts w:ascii="Microsoft YaHei" w:hAnsi="Microsoft YaHei" w:eastAsia="Microsoft YaHei"/>
+          <w:sz w:val="21"/>
+        </w:rPr>
+        <w:t>否定与多字段偏好修正；5会话50轮行动评测，检查15个实际文件。</w:t>
+      </w:r>
+    </w:p>
+    <w:p>
+      <w:pPr>
+        <w:pStyle w:val="ListBullet"/>
+      </w:pPr>
+      <w:r>
+        <w:rPr>
+          <w:rFonts w:ascii="Microsoft YaHei" w:hAnsi="Microsoft YaHei" w:eastAsia="Microsoft YaHei"/>
+          <w:sz w:val="21"/>
+        </w:rPr>
+        <w:t>真实Embedding C ABI子进程适配；无库或错误输出时失败，不回退冒充接通。</w:t>
+      </w:r>
+    </w:p>
+    <w:p>
+      <w:pPr>
+        <w:spacing w:line="324" w:lineRule="auto"/>
+      </w:pPr>
+      <w:r>
+        <w:rPr>
+          <w:rFonts w:ascii="Microsoft YaHei" w:hAnsi="Microsoft YaHei" w:eastAsia="Microsoft YaHei"/>
+          <w:sz w:val="21"/>
+        </w:rPr>
+        <w:t>行动替身15/15仅是框架自检；真实KylinBot/模型、单样本容器与独立LLM Judge尚未完成。向量数据库C++服务接入也仍待完成。</w:t>
+      </w:r>
+    </w:p>
+    <w:p>
+      <w:pPr>
+        <w:pStyle w:val="Heading2"/>
+      </w:pPr>
+      <w:r>
+        <w:t>复现</w:t>
       </w:r>
     </w:p>
     <w:p>
@@ -3636,15 +2819,11 @@
         </w:rPr>
         <w:t>python -S -m unittest discover -s tests -v</w:t>
         <w:br/>
-        <w:t>python scripts/check_source.py</w:t>
+        <w:t>python -S scripts/evaluate_official.py --output artifacts/runtime/official.json --size 10000</w:t>
         <w:br/>
-        <w:t>node scripts/check_dashboard.cjs</w:t>
+        <w:t>python -S scripts/evaluate_official.py --output artifacts/runtime/official-required.json --require-official</w:t>
         <w:br/>
-        <w:t>python scripts/evaluate_v3.py --require-quality --embedding-config config/embedding.hash.json</w:t>
-        <w:br/>
-        <w:t>python scripts/benchmark_service.py --sizes 100,1000 --rounds 30</w:t>
-        <w:br/>
-        <w:t>python scripts/verify_release.py --artifact-dir artifacts/runtime/verification --sizes 100,1000,5000,10000 --rounds 30</w:t>
+        <w:t>python -S scripts/check_kylin_native.py --output artifacts/runtime/native-sdk.json</w:t>
       </w:r>
     </w:p>
     <w:p>
@@ -3656,7 +2835,7 @@
           <w:rFonts w:ascii="Microsoft YaHei" w:hAnsi="Microsoft YaHei" w:eastAsia="Microsoft YaHei"/>
           <w:sz w:val="21"/>
         </w:rPr>
-        <w:t>固定证据：artifacts/verification/round3/；服务基准：service_workload.json。第二轮目录保留为历史。</w:t>
+        <w:t>第二条只生成内部诊断；带 --require-official 的命令在证据不足时退出2；SDK诊断未实际连接时退出2。</w:t>
       </w:r>
     </w:p>
     <w:p>
@@ -3668,7 +2847,7 @@
           <w:rFonts w:ascii="Microsoft YaHei" w:hAnsi="Microsoft YaHei" w:eastAsia="Microsoft YaHei"/>
           <w:sz w:val="21"/>
         </w:rPr>
-        <w:t>CI 配置覆盖 Windows/Linux 与 Python 3.10/3.14；配置存在不等于所有远端任务已通过，以 GitHub Actions 实际结果为准。</w:t>
+        <w:t>当前材料为INCOMPLETE草案。独立盲测、授权案例、视频、赛事审核、报名与邮件回执仍需补齐。正式邮件不得由脚本自动发送。</w:t>
       </w:r>
     </w:p>
     <w:p>
@@ -3680,379 +2859,9 @@
           <w:rFonts w:ascii="Microsoft YaHei" w:hAnsi="Microsoft YaHei" w:eastAsia="Microsoft YaHei"/>
           <w:sz w:val="21"/>
         </w:rPr>
-        <w:t>Python 3.10 语法检查及本机完整测试、wheel 构建独立记录。</w:t>
+        <w:t>历史第三轮归档和原始报告保留；91.67%召回与100%无答案正确率是历史内部检索指标，不是官方两个85%均达成。</w:t>
       </w:r>
     </w:p>
-    <w:p>
-      <w:pPr>
-        <w:pStyle w:val="Heading2"/>
-      </w:pPr>
-      <w:r>
-        <w:t>功能与证据对应</w:t>
-      </w:r>
-    </w:p>
-    <w:tbl>
-      <w:tblPr>
-        <w:tblStyle w:val="TableGrid"/>
-        <w:tblW w:type="auto" w:w="0"/>
-        <w:tblLook w:firstColumn="1" w:firstRow="1" w:lastColumn="0" w:lastRow="0" w:noHBand="0" w:noVBand="1" w:val="04A0"/>
-      </w:tblPr>
-      <w:tblGrid>
-        <w:gridCol w:w="3135"/>
-        <w:gridCol w:w="3135"/>
-        <w:gridCol w:w="3135"/>
-      </w:tblGrid>
-      <w:tr>
-        <w:tc>
-          <w:tcPr>
-            <w:tcW w:type="dxa" w:w="3135"/>
-          </w:tcPr>
-          <w:p>
-            <w:r/>
-            <w:r>
-              <w:rPr>
-                <w:rFonts w:ascii="Microsoft YaHei" w:hAnsi="Microsoft YaHei" w:eastAsia="Microsoft YaHei"/>
-                <w:b/>
-                <w:sz w:val="18"/>
-              </w:rPr>
-              <w:t>设计</w:t>
-            </w:r>
-          </w:p>
-        </w:tc>
-        <w:tc>
-          <w:tcPr>
-            <w:tcW w:type="dxa" w:w="3135"/>
-          </w:tcPr>
-          <w:p>
-            <w:r/>
-            <w:r>
-              <w:rPr>
-                <w:rFonts w:ascii="Microsoft YaHei" w:hAnsi="Microsoft YaHei" w:eastAsia="Microsoft YaHei"/>
-                <w:b/>
-                <w:sz w:val="18"/>
-              </w:rPr>
-              <w:t>证据</w:t>
-            </w:r>
-          </w:p>
-        </w:tc>
-        <w:tc>
-          <w:tcPr>
-            <w:tcW w:type="dxa" w:w="3135"/>
-          </w:tcPr>
-          <w:p>
-            <w:r/>
-            <w:r>
-              <w:rPr>
-                <w:rFonts w:ascii="Microsoft YaHei" w:hAnsi="Microsoft YaHei" w:eastAsia="Microsoft YaHei"/>
-                <w:b/>
-                <w:sz w:val="18"/>
-              </w:rPr>
-              <w:t>适用边界</w:t>
-            </w:r>
-          </w:p>
-        </w:tc>
-      </w:tr>
-      <w:tr>
-        <w:tc>
-          <w:tcPr>
-            <w:tcW w:type="dxa" w:w="3135"/>
-          </w:tcPr>
-          <w:p>
-            <w:r/>
-            <w:r>
-              <w:rPr>
-                <w:rFonts w:ascii="Microsoft YaHei" w:hAnsi="Microsoft YaHei" w:eastAsia="Microsoft YaHei"/>
-                <w:b w:val="0"/>
-                <w:sz w:val="18"/>
-              </w:rPr>
-              <w:t>晋升、有效期、删除、回滚</w:t>
-            </w:r>
-          </w:p>
-        </w:tc>
-        <w:tc>
-          <w:tcPr>
-            <w:tcW w:type="dxa" w:w="3135"/>
-          </w:tcPr>
-          <w:p>
-            <w:r/>
-            <w:r>
-              <w:rPr>
-                <w:rFonts w:ascii="Microsoft YaHei" w:hAnsi="Microsoft YaHei" w:eastAsia="Microsoft YaHei"/>
-                <w:b w:val="0"/>
-                <w:sz w:val="18"/>
-              </w:rPr>
-              <w:t>test_round2.py</w:t>
-            </w:r>
-          </w:p>
-        </w:tc>
-        <w:tc>
-          <w:tcPr>
-            <w:tcW w:type="dxa" w:w="3135"/>
-          </w:tcPr>
-          <w:p>
-            <w:r/>
-            <w:r>
-              <w:rPr>
-                <w:rFonts w:ascii="Microsoft YaHei" w:hAnsi="Microsoft YaHei" w:eastAsia="Microsoft YaHei"/>
-                <w:b w:val="0"/>
-                <w:sz w:val="18"/>
-              </w:rPr>
-              <w:t>合成回归</w:t>
-            </w:r>
-          </w:p>
-        </w:tc>
-      </w:tr>
-      <w:tr>
-        <w:tc>
-          <w:tcPr>
-            <w:tcW w:type="dxa" w:w="3135"/>
-          </w:tcPr>
-          <w:p>
-            <w:r/>
-            <w:r>
-              <w:rPr>
-                <w:rFonts w:ascii="Microsoft YaHei" w:hAnsi="Microsoft YaHei" w:eastAsia="Microsoft YaHei"/>
-                <w:b w:val="0"/>
-                <w:sz w:val="18"/>
-              </w:rPr>
-              <w:t>增量与重启幂等</w:t>
-            </w:r>
-          </w:p>
-        </w:tc>
-        <w:tc>
-          <w:tcPr>
-            <w:tcW w:type="dxa" w:w="3135"/>
-          </w:tcPr>
-          <w:p>
-            <w:r/>
-            <w:r>
-              <w:rPr>
-                <w:rFonts w:ascii="Microsoft YaHei" w:hAnsi="Microsoft YaHei" w:eastAsia="Microsoft YaHei"/>
-                <w:b w:val="0"/>
-                <w:sz w:val="18"/>
-              </w:rPr>
-              <w:t>test_incremental.py</w:t>
-            </w:r>
-          </w:p>
-        </w:tc>
-        <w:tc>
-          <w:tcPr>
-            <w:tcW w:type="dxa" w:w="3135"/>
-          </w:tcPr>
-          <w:p>
-            <w:r/>
-            <w:r>
-              <w:rPr>
-                <w:rFonts w:ascii="Microsoft YaHei" w:hAnsi="Microsoft YaHei" w:eastAsia="Microsoft YaHei"/>
-                <w:b w:val="0"/>
-                <w:sz w:val="18"/>
-              </w:rPr>
-              <w:t>单进程写入</w:t>
-            </w:r>
-          </w:p>
-        </w:tc>
-      </w:tr>
-      <w:tr>
-        <w:tc>
-          <w:tcPr>
-            <w:tcW w:type="dxa" w:w="3135"/>
-          </w:tcPr>
-          <w:p>
-            <w:r/>
-            <w:r>
-              <w:rPr>
-                <w:rFonts w:ascii="Microsoft YaHei" w:hAnsi="Microsoft YaHei" w:eastAsia="Microsoft YaHei"/>
-                <w:b w:val="0"/>
-                <w:sz w:val="18"/>
-              </w:rPr>
-              <w:t>检索候选与条件冲突</w:t>
-            </w:r>
-          </w:p>
-        </w:tc>
-        <w:tc>
-          <w:tcPr>
-            <w:tcW w:type="dxa" w:w="3135"/>
-          </w:tcPr>
-          <w:p>
-            <w:r/>
-            <w:r>
-              <w:rPr>
-                <w:rFonts w:ascii="Microsoft YaHei" w:hAnsi="Microsoft YaHei" w:eastAsia="Microsoft YaHei"/>
-                <w:b w:val="0"/>
-                <w:sz w:val="18"/>
-              </w:rPr>
-              <w:t>test_retrieval_hard_cases.py、ablations.json</w:t>
-            </w:r>
-          </w:p>
-        </w:tc>
-        <w:tc>
-          <w:tcPr>
-            <w:tcW w:type="dxa" w:w="3135"/>
-          </w:tcPr>
-          <w:p>
-            <w:r/>
-            <w:r>
-              <w:rPr>
-                <w:rFonts w:ascii="Microsoft YaHei" w:hAnsi="Microsoft YaHei" w:eastAsia="Microsoft YaHei"/>
-                <w:b w:val="0"/>
-                <w:sz w:val="18"/>
-              </w:rPr>
-              <w:t>规则与近似候选</w:t>
-            </w:r>
-          </w:p>
-        </w:tc>
-      </w:tr>
-      <w:tr>
-        <w:tc>
-          <w:tcPr>
-            <w:tcW w:type="dxa" w:w="3135"/>
-          </w:tcPr>
-          <w:p>
-            <w:r/>
-            <w:r>
-              <w:rPr>
-                <w:rFonts w:ascii="Microsoft YaHei" w:hAnsi="Microsoft YaHei" w:eastAsia="Microsoft YaHei"/>
-                <w:b w:val="0"/>
-                <w:sz w:val="18"/>
-              </w:rPr>
-              <w:t>SDK 配置/缓存/超时</w:t>
-            </w:r>
-          </w:p>
-        </w:tc>
-        <w:tc>
-          <w:tcPr>
-            <w:tcW w:type="dxa" w:w="3135"/>
-          </w:tcPr>
-          <w:p>
-            <w:r/>
-            <w:r>
-              <w:rPr>
-                <w:rFonts w:ascii="Microsoft YaHei" w:hAnsi="Microsoft YaHei" w:eastAsia="Microsoft YaHei"/>
-                <w:b w:val="0"/>
-                <w:sz w:val="18"/>
-              </w:rPr>
-              <w:t>test_provider_config.py</w:t>
-            </w:r>
-          </w:p>
-        </w:tc>
-        <w:tc>
-          <w:tcPr>
-            <w:tcW w:type="dxa" w:w="3135"/>
-          </w:tcPr>
-          <w:p>
-            <w:r/>
-            <w:r>
-              <w:rPr>
-                <w:rFonts w:ascii="Microsoft YaHei" w:hAnsi="Microsoft YaHei" w:eastAsia="Microsoft YaHei"/>
-                <w:b w:val="0"/>
-                <w:sz w:val="18"/>
-              </w:rPr>
-              <w:t>模拟适配器，无真实 SDK</w:t>
-            </w:r>
-          </w:p>
-        </w:tc>
-      </w:tr>
-      <w:tr>
-        <w:tc>
-          <w:tcPr>
-            <w:tcW w:type="dxa" w:w="3135"/>
-          </w:tcPr>
-          <w:p>
-            <w:r/>
-            <w:r>
-              <w:rPr>
-                <w:rFonts w:ascii="Microsoft YaHei" w:hAnsi="Microsoft YaHei" w:eastAsia="Microsoft YaHei"/>
-                <w:b w:val="0"/>
-                <w:sz w:val="18"/>
-              </w:rPr>
-              <w:t>演示与作用域</w:t>
-            </w:r>
-          </w:p>
-        </w:tc>
-        <w:tc>
-          <w:tcPr>
-            <w:tcW w:type="dxa" w:w="3135"/>
-          </w:tcPr>
-          <w:p>
-            <w:r/>
-            <w:r>
-              <w:rPr>
-                <w:rFonts w:ascii="Microsoft YaHei" w:hAnsi="Microsoft YaHei" w:eastAsia="Microsoft YaHei"/>
-                <w:b w:val="0"/>
-                <w:sz w:val="18"/>
-              </w:rPr>
-              <w:t>test_web_server.py</w:t>
-            </w:r>
-          </w:p>
-        </w:tc>
-        <w:tc>
-          <w:tcPr>
-            <w:tcW w:type="dxa" w:w="3135"/>
-          </w:tcPr>
-          <w:p>
-            <w:r/>
-            <w:r>
-              <w:rPr>
-                <w:rFonts w:ascii="Microsoft YaHei" w:hAnsi="Microsoft YaHei" w:eastAsia="Microsoft YaHei"/>
-                <w:b w:val="0"/>
-                <w:sz w:val="18"/>
-              </w:rPr>
-              <w:t>localhost 可信上层，无登录认证</w:t>
-            </w:r>
-          </w:p>
-        </w:tc>
-      </w:tr>
-      <w:tr>
-        <w:tc>
-          <w:tcPr>
-            <w:tcW w:type="dxa" w:w="3135"/>
-          </w:tcPr>
-          <w:p>
-            <w:r/>
-            <w:r>
-              <w:rPr>
-                <w:rFonts w:ascii="Microsoft YaHei" w:hAnsi="Microsoft YaHei" w:eastAsia="Microsoft YaHei"/>
-                <w:b w:val="0"/>
-                <w:sz w:val="18"/>
-              </w:rPr>
-              <w:t>可交付性</w:t>
-            </w:r>
-          </w:p>
-        </w:tc>
-        <w:tc>
-          <w:tcPr>
-            <w:tcW w:type="dxa" w:w="3135"/>
-          </w:tcPr>
-          <w:p>
-            <w:r/>
-            <w:r>
-              <w:rPr>
-                <w:rFonts w:ascii="Microsoft YaHei" w:hAnsi="Microsoft YaHei" w:eastAsia="Microsoft YaHei"/>
-                <w:b w:val="0"/>
-                <w:sz w:val="18"/>
-              </w:rPr>
-              <w:t>test_packaging.py、test_archive_submission.py</w:t>
-            </w:r>
-          </w:p>
-        </w:tc>
-        <w:tc>
-          <w:tcPr>
-            <w:tcW w:type="dxa" w:w="3135"/>
-          </w:tcPr>
-          <w:p>
-            <w:r/>
-            <w:r>
-              <w:rPr>
-                <w:rFonts w:ascii="Microsoft YaHei" w:hAnsi="Microsoft YaHei" w:eastAsia="Microsoft YaHei"/>
-                <w:b w:val="0"/>
-                <w:sz w:val="18"/>
-              </w:rPr>
-              <w:t>INCOMPLETE 草案</w:t>
-            </w:r>
-          </w:p>
-        </w:tc>
-      </w:tr>
-    </w:tbl>
     <w:sectPr>
       <w:pgSz w:w="12240" w:h="15840"/>
       <w:pgMar w:top="1361" w:right="1417" w:bottom="1247" w:left="1417" w:header="720" w:footer="720" w:gutter="0"/>

</xml_diff>

<commit_message>
docs: synchronize fifth-round evidence and editable deliverables
</commit_message>
<xml_diff>
--- a/deliverables/doc/OS_Agent_记忆优化_技术方案与测试报告.docx
+++ b/deliverables/doc/OS_Agent_记忆优化_技术方案与测试报告.docx
@@ -26,7 +26,7 @@
           <w:b/>
           <w:sz w:val="32"/>
         </w:rPr>
-        <w:t>技术方案与测试报告（开发机交付版）</w:t>
+        <w:t>技术方案与测试报告（第五轮内部验证版）</w:t>
       </w:r>
     </w:p>
     <w:p>
@@ -40,7 +40,7 @@
         </w:rPr>
         <w:t>对应赛题：XA-202612</w:t>
         <w:br/>
-        <w:t>第四轮证据日期：2026-09-07</w:t>
+        <w:t>第五轮证据日期：2026-09-07</w:t>
       </w:r>
     </w:p>
     <w:p>
@@ -54,7 +54,7 @@
           <w:b/>
           <w:sz w:val="20"/>
         </w:rPr>
-        <w:t>边界：官方五项指标尚未全达成；V11虚拟机、真实SDK与独立评测分别记录</w:t>
+        <w:t>边界：Windows/V11公开合成回归五项达标；原生模型、独立盲测及赛事验收未完成。INCOMPLETE</w:t>
       </w:r>
     </w:p>
     <w:p>
@@ -79,7 +79,7 @@
           <w:rFonts w:ascii="Microsoft YaHei" w:hAnsi="Microsoft YaHei" w:eastAsia="Microsoft YaHei"/>
           <w:sz w:val="21"/>
         </w:rPr>
-        <w:t>版本：第四轮（官方口径整改草案）</w:t>
+        <w:t>版本：第五轮（逐请求与双环境内部验证）</w:t>
       </w:r>
     </w:p>
     <w:p>
@@ -147,7 +147,7 @@
           <w:rFonts w:ascii="Microsoft YaHei" w:hAnsi="Microsoft YaHei" w:eastAsia="Microsoft YaHei"/>
           <w:sz w:val="21"/>
         </w:rPr>
-        <w:t>当前仓库已形成标准库原型、增量 SQLite 持久化、统一生命周期服务、本地场景演示、分区评测和规模基准。第四轮新增Markdown/YAML授权记忆、按需召回、逐项确认遗忘、50轮行动评测框架与真实Embedding C ABI适配。当前证据见 artifacts/verification/round4/evidence_summary.json 和《第四轮验收报告》；第三轮数据保留为历史内部回归。</w:t>
+        <w:t>当前仓库已形成标准库原型、增量 SQLite 持久化、统一生命周期服务、本地场景演示、分区评测和规模基准，并支持Markdown/YAML授权记忆、按需召回、逐项确认遗忘、50轮行动评测框架与真实Embedding C ABI诊断。第五轮在Windows和已安装的V11虚拟机上执行冻结逐请求评测；原始证据见 artifacts/verification/round5/，第三、四轮数据保留为历史内部回归。</w:t>
       </w:r>
     </w:p>
     <w:p>
@@ -159,7 +159,7 @@
           <w:rFonts w:ascii="Microsoft YaHei" w:hAnsi="Microsoft YaHei" w:eastAsia="Microsoft YaHei"/>
           <w:sz w:val="21"/>
         </w:rPr>
-        <w:t>官方强制部署为银河麒麟V11；目标为偏好准确率≥85%、知识召回率≥85%、冲突正确率≥88%、检索P95≤500ms、敏感识别F1≥90%，每项至少50独立请求。SDK属于推荐项。当前偏好准确率及部分样本数仍不足，行动替身自检不能替代真实Agent或独立Judge成绩。</w:t>
+        <w:t>官方强制部署为银河麒麟V11；目标为偏好准确率≥85%、知识召回率≥85%、冲突正确率≥88%、检索P95≤500ms、敏感识别F1≥90%，每项至少50独立请求。SDK属于推荐项。五项内部回归已满足数值和请求数要求；标签由开发者持有，行动替身自检不能替代真实Agent或独立Judge成绩。</w:t>
       </w:r>
     </w:p>
     <w:p>
@@ -691,7 +691,7 @@
                 <w:b w:val="0"/>
                 <w:sz w:val="18"/>
               </w:rPr>
-              <w:t>10,000 条基准</w:t>
+              <w:t>Windows/V11的10,000条服务查询</w:t>
             </w:r>
           </w:p>
         </w:tc>
@@ -707,7 +707,7 @@
                 <w:b w:val="0"/>
                 <w:sz w:val="18"/>
               </w:rPr>
-              <w:t>真实 SDK/麒麟复测</w:t>
+              <w:t>原生模型复测与赛事部署认可</w:t>
             </w:r>
           </w:p>
         </w:tc>
@@ -1476,7 +1476,7 @@
           <w:rFonts w:ascii="Microsoft YaHei" w:hAnsi="Microsoft YaHei" w:eastAsia="Microsoft YaHei"/>
           <w:sz w:val="21"/>
         </w:rPr>
-        <w:t>当前真实系统和真实 SDK 均未验证，不能在答辩中宣称完成指定环境适配。</w:t>
+        <w:t>V11已在隔离VMware客户机中完成磁盘安装、系统识别、全量测试和五项请求评测，见 docs/31_麒麟V11客户机实测.md。已安装的旧ABI在有界启动AI Runtime后返回768维有限非零向量，单次13390.615ms；新ABI所需符号缺失，模型身份和版本未验证。该探针不进入业务provider自动回退，不证明原生P95或质量达标。向量服务active不等于已完成数据库往返；匹配开发依赖、真实Agent/容器/独立Judge及赛事部署认可继续待验收。</w:t>
       </w:r>
     </w:p>
     <w:p>
@@ -1496,7 +1496,7 @@
           <w:rFonts w:ascii="Microsoft YaHei" w:hAnsi="Microsoft YaHei" w:eastAsia="Microsoft YaHei"/>
           <w:sz w:val="21"/>
         </w:rPr>
-        <w:t>v1/v2 保留为历史标签诊断：这些标签含单条低证据，按当前服务晋升门槛执行后有目标未满足。v3 为正文及模板族隔离的 42 事件、18 主题、54 查询，包含正例改写、无答案及跨用户干扰。</w:t>
+        <w:t>当前验收使用 request_regression_v1.json，原始字节摘要冻结。偏好68请求按完整键值集合评分，多报和漏报都计错；60个知识正例以Recall@3评分，另查12个无答案及8个跨作用域请求；60组冲突联合检查检测与最终状态；敏感识别50请求使用实体类型及精确值的微平均F1。长期持久化授权、入库、无答案、跨域和脱敏泄漏分别作为安全硬门槛，不通过放松生命周期提高分数。</w:t>
       </w:r>
     </w:p>
     <w:p>
@@ -1508,9 +1508,515 @@
           <w:rFonts w:ascii="Microsoft YaHei" w:hAnsi="Microsoft YaHei" w:eastAsia="Microsoft YaHei"/>
           <w:sz w:val="21"/>
         </w:rPr>
-        <w:t>第三轮增加正文汉字覆盖及候选路径。中文评分为向量 0.25、词法 0.25、汉字覆盖 0.45、权威度 0.05；元数据不提供汉字证据，作用域与删除状态先过滤。仅用 dev 的两項均 ≥85% 最宽连续阈值区间中心定参数，不可行时报告平衡分回退。混合阈值为 0.265，服务与 HTTP 默认一致；test 正例 11/12（91.67%）、无答案 6/6（100%），两项目标达到。首次 0.225 的未通过结果仍保留；不能沿用旧 v1/v2 的 1.0。</w:t>
+        <w:t>公开合成冻结回归，不是第三方盲测或官方认证；两个环境均为 HashEmbedding 256 维、10,000 条记录、top_k=3、阈值 0.265，实际调用 MemoryService.search。</w:t>
       </w:r>
     </w:p>
+    <w:tbl>
+      <w:tblPr>
+        <w:tblStyle w:val="TableGrid"/>
+        <w:tblW w:type="auto" w:w="0"/>
+        <w:tblLook w:firstColumn="1" w:firstRow="1" w:lastColumn="0" w:lastRow="0" w:noHBand="0" w:noVBand="1" w:val="04A0"/>
+      </w:tblPr>
+      <w:tblGrid>
+        <w:gridCol w:w="1881"/>
+        <w:gridCol w:w="1881"/>
+        <w:gridCol w:w="1881"/>
+        <w:gridCol w:w="1881"/>
+        <w:gridCol w:w="1881"/>
+      </w:tblGrid>
+      <w:tr>
+        <w:tc>
+          <w:tcPr>
+            <w:tcW w:type="dxa" w:w="1881"/>
+          </w:tcPr>
+          <w:p>
+            <w:r/>
+            <w:r>
+              <w:rPr>
+                <w:rFonts w:ascii="Microsoft YaHei" w:hAnsi="Microsoft YaHei" w:eastAsia="Microsoft YaHei"/>
+                <w:b/>
+                <w:sz w:val="18"/>
+              </w:rPr>
+              <w:t>指标</w:t>
+            </w:r>
+          </w:p>
+        </w:tc>
+        <w:tc>
+          <w:tcPr>
+            <w:tcW w:type="dxa" w:w="1881"/>
+          </w:tcPr>
+          <w:p>
+            <w:r/>
+            <w:r>
+              <w:rPr>
+                <w:rFonts w:ascii="Microsoft YaHei" w:hAnsi="Microsoft YaHei" w:eastAsia="Microsoft YaHei"/>
+                <w:b/>
+                <w:sz w:val="18"/>
+              </w:rPr>
+              <w:t>门槛</w:t>
+            </w:r>
+          </w:p>
+        </w:tc>
+        <w:tc>
+          <w:tcPr>
+            <w:tcW w:type="dxa" w:w="1881"/>
+          </w:tcPr>
+          <w:p>
+            <w:r/>
+            <w:r>
+              <w:rPr>
+                <w:rFonts w:ascii="Microsoft YaHei" w:hAnsi="Microsoft YaHei" w:eastAsia="Microsoft YaHei"/>
+                <w:b/>
+                <w:sz w:val="18"/>
+              </w:rPr>
+              <w:t>Windows</w:t>
+            </w:r>
+          </w:p>
+        </w:tc>
+        <w:tc>
+          <w:tcPr>
+            <w:tcW w:type="dxa" w:w="1881"/>
+          </w:tcPr>
+          <w:p>
+            <w:r/>
+            <w:r>
+              <w:rPr>
+                <w:rFonts w:ascii="Microsoft YaHei" w:hAnsi="Microsoft YaHei" w:eastAsia="Microsoft YaHei"/>
+                <w:b/>
+                <w:sz w:val="18"/>
+              </w:rPr>
+              <w:t>麒麟 V11 虚拟机</w:t>
+            </w:r>
+          </w:p>
+        </w:tc>
+        <w:tc>
+          <w:tcPr>
+            <w:tcW w:type="dxa" w:w="1881"/>
+          </w:tcPr>
+          <w:p>
+            <w:r/>
+            <w:r>
+              <w:rPr>
+                <w:rFonts w:ascii="Microsoft YaHei" w:hAnsi="Microsoft YaHei" w:eastAsia="Microsoft YaHei"/>
+                <w:b/>
+                <w:sz w:val="18"/>
+              </w:rPr>
+              <w:t>请求数</w:t>
+            </w:r>
+          </w:p>
+        </w:tc>
+      </w:tr>
+      <w:tr>
+        <w:tc>
+          <w:tcPr>
+            <w:tcW w:type="dxa" w:w="1881"/>
+          </w:tcPr>
+          <w:p>
+            <w:r/>
+            <w:r>
+              <w:rPr>
+                <w:rFonts w:ascii="Microsoft YaHei" w:hAnsi="Microsoft YaHei" w:eastAsia="Microsoft YaHei"/>
+                <w:b w:val="0"/>
+                <w:sz w:val="18"/>
+              </w:rPr>
+              <w:t>偏好逐请求准确率</w:t>
+            </w:r>
+          </w:p>
+        </w:tc>
+        <w:tc>
+          <w:tcPr>
+            <w:tcW w:type="dxa" w:w="1881"/>
+          </w:tcPr>
+          <w:p>
+            <w:r/>
+            <w:r>
+              <w:rPr>
+                <w:rFonts w:ascii="Microsoft YaHei" w:hAnsi="Microsoft YaHei" w:eastAsia="Microsoft YaHei"/>
+                <w:b w:val="0"/>
+                <w:sz w:val="18"/>
+              </w:rPr>
+              <w:t>&gt;=85%</w:t>
+            </w:r>
+          </w:p>
+        </w:tc>
+        <w:tc>
+          <w:tcPr>
+            <w:tcW w:type="dxa" w:w="1881"/>
+          </w:tcPr>
+          <w:p>
+            <w:r/>
+            <w:r>
+              <w:rPr>
+                <w:rFonts w:ascii="Microsoft YaHei" w:hAnsi="Microsoft YaHei" w:eastAsia="Microsoft YaHei"/>
+                <w:b w:val="0"/>
+                <w:sz w:val="18"/>
+              </w:rPr>
+              <w:t>100.00%</w:t>
+            </w:r>
+          </w:p>
+        </w:tc>
+        <w:tc>
+          <w:tcPr>
+            <w:tcW w:type="dxa" w:w="1881"/>
+          </w:tcPr>
+          <w:p>
+            <w:r/>
+            <w:r>
+              <w:rPr>
+                <w:rFonts w:ascii="Microsoft YaHei" w:hAnsi="Microsoft YaHei" w:eastAsia="Microsoft YaHei"/>
+                <w:b w:val="0"/>
+                <w:sz w:val="18"/>
+              </w:rPr>
+              <w:t>100.00%</w:t>
+            </w:r>
+          </w:p>
+        </w:tc>
+        <w:tc>
+          <w:tcPr>
+            <w:tcW w:type="dxa" w:w="1881"/>
+          </w:tcPr>
+          <w:p>
+            <w:r/>
+            <w:r>
+              <w:rPr>
+                <w:rFonts w:ascii="Microsoft YaHei" w:hAnsi="Microsoft YaHei" w:eastAsia="Microsoft YaHei"/>
+                <w:b w:val="0"/>
+                <w:sz w:val="18"/>
+              </w:rPr>
+              <w:t>68</w:t>
+            </w:r>
+          </w:p>
+        </w:tc>
+      </w:tr>
+      <w:tr>
+        <w:tc>
+          <w:tcPr>
+            <w:tcW w:type="dxa" w:w="1881"/>
+          </w:tcPr>
+          <w:p>
+            <w:r/>
+            <w:r>
+              <w:rPr>
+                <w:rFonts w:ascii="Microsoft YaHei" w:hAnsi="Microsoft YaHei" w:eastAsia="Microsoft YaHei"/>
+                <w:b w:val="0"/>
+                <w:sz w:val="18"/>
+              </w:rPr>
+              <w:t>知识 Recall@3</w:t>
+            </w:r>
+          </w:p>
+        </w:tc>
+        <w:tc>
+          <w:tcPr>
+            <w:tcW w:type="dxa" w:w="1881"/>
+          </w:tcPr>
+          <w:p>
+            <w:r/>
+            <w:r>
+              <w:rPr>
+                <w:rFonts w:ascii="Microsoft YaHei" w:hAnsi="Microsoft YaHei" w:eastAsia="Microsoft YaHei"/>
+                <w:b w:val="0"/>
+                <w:sz w:val="18"/>
+              </w:rPr>
+              <w:t>&gt;=85%</w:t>
+            </w:r>
+          </w:p>
+        </w:tc>
+        <w:tc>
+          <w:tcPr>
+            <w:tcW w:type="dxa" w:w="1881"/>
+          </w:tcPr>
+          <w:p>
+            <w:r/>
+            <w:r>
+              <w:rPr>
+                <w:rFonts w:ascii="Microsoft YaHei" w:hAnsi="Microsoft YaHei" w:eastAsia="Microsoft YaHei"/>
+                <w:b w:val="0"/>
+                <w:sz w:val="18"/>
+              </w:rPr>
+              <w:t>100.00%</w:t>
+            </w:r>
+          </w:p>
+        </w:tc>
+        <w:tc>
+          <w:tcPr>
+            <w:tcW w:type="dxa" w:w="1881"/>
+          </w:tcPr>
+          <w:p>
+            <w:r/>
+            <w:r>
+              <w:rPr>
+                <w:rFonts w:ascii="Microsoft YaHei" w:hAnsi="Microsoft YaHei" w:eastAsia="Microsoft YaHei"/>
+                <w:b w:val="0"/>
+                <w:sz w:val="18"/>
+              </w:rPr>
+              <w:t>100.00%</w:t>
+            </w:r>
+          </w:p>
+        </w:tc>
+        <w:tc>
+          <w:tcPr>
+            <w:tcW w:type="dxa" w:w="1881"/>
+          </w:tcPr>
+          <w:p>
+            <w:r/>
+            <w:r>
+              <w:rPr>
+                <w:rFonts w:ascii="Microsoft YaHei" w:hAnsi="Microsoft YaHei" w:eastAsia="Microsoft YaHei"/>
+                <w:b w:val="0"/>
+                <w:sz w:val="18"/>
+              </w:rPr>
+              <w:t>60</w:t>
+            </w:r>
+          </w:p>
+        </w:tc>
+      </w:tr>
+      <w:tr>
+        <w:tc>
+          <w:tcPr>
+            <w:tcW w:type="dxa" w:w="1881"/>
+          </w:tcPr>
+          <w:p>
+            <w:r/>
+            <w:r>
+              <w:rPr>
+                <w:rFonts w:ascii="Microsoft YaHei" w:hAnsi="Microsoft YaHei" w:eastAsia="Microsoft YaHei"/>
+                <w:b w:val="0"/>
+                <w:sz w:val="18"/>
+              </w:rPr>
+              <w:t>冲突正确率</w:t>
+            </w:r>
+          </w:p>
+        </w:tc>
+        <w:tc>
+          <w:tcPr>
+            <w:tcW w:type="dxa" w:w="1881"/>
+          </w:tcPr>
+          <w:p>
+            <w:r/>
+            <w:r>
+              <w:rPr>
+                <w:rFonts w:ascii="Microsoft YaHei" w:hAnsi="Microsoft YaHei" w:eastAsia="Microsoft YaHei"/>
+                <w:b w:val="0"/>
+                <w:sz w:val="18"/>
+              </w:rPr>
+              <w:t>&gt;=88%</w:t>
+            </w:r>
+          </w:p>
+        </w:tc>
+        <w:tc>
+          <w:tcPr>
+            <w:tcW w:type="dxa" w:w="1881"/>
+          </w:tcPr>
+          <w:p>
+            <w:r/>
+            <w:r>
+              <w:rPr>
+                <w:rFonts w:ascii="Microsoft YaHei" w:hAnsi="Microsoft YaHei" w:eastAsia="Microsoft YaHei"/>
+                <w:b w:val="0"/>
+                <w:sz w:val="18"/>
+              </w:rPr>
+              <w:t>100.00%</w:t>
+            </w:r>
+          </w:p>
+        </w:tc>
+        <w:tc>
+          <w:tcPr>
+            <w:tcW w:type="dxa" w:w="1881"/>
+          </w:tcPr>
+          <w:p>
+            <w:r/>
+            <w:r>
+              <w:rPr>
+                <w:rFonts w:ascii="Microsoft YaHei" w:hAnsi="Microsoft YaHei" w:eastAsia="Microsoft YaHei"/>
+                <w:b w:val="0"/>
+                <w:sz w:val="18"/>
+              </w:rPr>
+              <w:t>100.00%</w:t>
+            </w:r>
+          </w:p>
+        </w:tc>
+        <w:tc>
+          <w:tcPr>
+            <w:tcW w:type="dxa" w:w="1881"/>
+          </w:tcPr>
+          <w:p>
+            <w:r/>
+            <w:r>
+              <w:rPr>
+                <w:rFonts w:ascii="Microsoft YaHei" w:hAnsi="Microsoft YaHei" w:eastAsia="Microsoft YaHei"/>
+                <w:b w:val="0"/>
+                <w:sz w:val="18"/>
+              </w:rPr>
+              <w:t>60</w:t>
+            </w:r>
+          </w:p>
+        </w:tc>
+      </w:tr>
+      <w:tr>
+        <w:tc>
+          <w:tcPr>
+            <w:tcW w:type="dxa" w:w="1881"/>
+          </w:tcPr>
+          <w:p>
+            <w:r/>
+            <w:r>
+              <w:rPr>
+                <w:rFonts w:ascii="Microsoft YaHei" w:hAnsi="Microsoft YaHei" w:eastAsia="Microsoft YaHei"/>
+                <w:b w:val="0"/>
+                <w:sz w:val="18"/>
+              </w:rPr>
+              <w:t>检索 P95</w:t>
+            </w:r>
+          </w:p>
+        </w:tc>
+        <w:tc>
+          <w:tcPr>
+            <w:tcW w:type="dxa" w:w="1881"/>
+          </w:tcPr>
+          <w:p>
+            <w:r/>
+            <w:r>
+              <w:rPr>
+                <w:rFonts w:ascii="Microsoft YaHei" w:hAnsi="Microsoft YaHei" w:eastAsia="Microsoft YaHei"/>
+                <w:b w:val="0"/>
+                <w:sz w:val="18"/>
+              </w:rPr>
+              <w:t>&lt;=500ms</w:t>
+            </w:r>
+          </w:p>
+        </w:tc>
+        <w:tc>
+          <w:tcPr>
+            <w:tcW w:type="dxa" w:w="1881"/>
+          </w:tcPr>
+          <w:p>
+            <w:r/>
+            <w:r>
+              <w:rPr>
+                <w:rFonts w:ascii="Microsoft YaHei" w:hAnsi="Microsoft YaHei" w:eastAsia="Microsoft YaHei"/>
+                <w:b w:val="0"/>
+                <w:sz w:val="18"/>
+              </w:rPr>
+              <w:t>67.320ms</w:t>
+            </w:r>
+          </w:p>
+        </w:tc>
+        <w:tc>
+          <w:tcPr>
+            <w:tcW w:type="dxa" w:w="1881"/>
+          </w:tcPr>
+          <w:p>
+            <w:r/>
+            <w:r>
+              <w:rPr>
+                <w:rFonts w:ascii="Microsoft YaHei" w:hAnsi="Microsoft YaHei" w:eastAsia="Microsoft YaHei"/>
+                <w:b w:val="0"/>
+                <w:sz w:val="18"/>
+              </w:rPr>
+              <w:t>111.626ms</w:t>
+            </w:r>
+          </w:p>
+        </w:tc>
+        <w:tc>
+          <w:tcPr>
+            <w:tcW w:type="dxa" w:w="1881"/>
+          </w:tcPr>
+          <w:p>
+            <w:r/>
+            <w:r>
+              <w:rPr>
+                <w:rFonts w:ascii="Microsoft YaHei" w:hAnsi="Microsoft YaHei" w:eastAsia="Microsoft YaHei"/>
+                <w:b w:val="0"/>
+                <w:sz w:val="18"/>
+              </w:rPr>
+              <w:t>80</w:t>
+            </w:r>
+          </w:p>
+        </w:tc>
+      </w:tr>
+      <w:tr>
+        <w:tc>
+          <w:tcPr>
+            <w:tcW w:type="dxa" w:w="1881"/>
+          </w:tcPr>
+          <w:p>
+            <w:r/>
+            <w:r>
+              <w:rPr>
+                <w:rFonts w:ascii="Microsoft YaHei" w:hAnsi="Microsoft YaHei" w:eastAsia="Microsoft YaHei"/>
+                <w:b w:val="0"/>
+                <w:sz w:val="18"/>
+              </w:rPr>
+              <w:t>敏感实体 F1</w:t>
+            </w:r>
+          </w:p>
+        </w:tc>
+        <w:tc>
+          <w:tcPr>
+            <w:tcW w:type="dxa" w:w="1881"/>
+          </w:tcPr>
+          <w:p>
+            <w:r/>
+            <w:r>
+              <w:rPr>
+                <w:rFonts w:ascii="Microsoft YaHei" w:hAnsi="Microsoft YaHei" w:eastAsia="Microsoft YaHei"/>
+                <w:b w:val="0"/>
+                <w:sz w:val="18"/>
+              </w:rPr>
+              <w:t>&gt;=90%</w:t>
+            </w:r>
+          </w:p>
+        </w:tc>
+        <w:tc>
+          <w:tcPr>
+            <w:tcW w:type="dxa" w:w="1881"/>
+          </w:tcPr>
+          <w:p>
+            <w:r/>
+            <w:r>
+              <w:rPr>
+                <w:rFonts w:ascii="Microsoft YaHei" w:hAnsi="Microsoft YaHei" w:eastAsia="Microsoft YaHei"/>
+                <w:b w:val="0"/>
+                <w:sz w:val="18"/>
+              </w:rPr>
+              <w:t>100.00%</w:t>
+            </w:r>
+          </w:p>
+        </w:tc>
+        <w:tc>
+          <w:tcPr>
+            <w:tcW w:type="dxa" w:w="1881"/>
+          </w:tcPr>
+          <w:p>
+            <w:r/>
+            <w:r>
+              <w:rPr>
+                <w:rFonts w:ascii="Microsoft YaHei" w:hAnsi="Microsoft YaHei" w:eastAsia="Microsoft YaHei"/>
+                <w:b w:val="0"/>
+                <w:sz w:val="18"/>
+              </w:rPr>
+              <w:t>100.00%</w:t>
+            </w:r>
+          </w:p>
+        </w:tc>
+        <w:tc>
+          <w:tcPr>
+            <w:tcW w:type="dxa" w:w="1881"/>
+          </w:tcPr>
+          <w:p>
+            <w:r/>
+            <w:r>
+              <w:rPr>
+                <w:rFonts w:ascii="Microsoft YaHei" w:hAnsi="Microsoft YaHei" w:eastAsia="Microsoft YaHei"/>
+                <w:b w:val="0"/>
+                <w:sz w:val="18"/>
+              </w:rPr>
+              <w:t>50</w:t>
+            </w:r>
+          </w:p>
+        </w:tc>
+      </w:tr>
+    </w:tbl>
     <w:p>
       <w:pPr>
         <w:spacing w:line="324" w:lineRule="auto"/>
@@ -1520,7 +2026,79 @@
           <w:rFonts w:ascii="Microsoft YaHei" w:hAnsi="Microsoft YaHei" w:eastAsia="Microsoft YaHei"/>
           <w:sz w:val="21"/>
         </w:rPr>
-        <w:t>规模检索与实际服务负载分别报告，后者包含接入、SQLite、重启及混合读写和 HTTP。当前数据统一见 docs/22_第三轮验收报告.md 和 artifacts/verification/round3/；公开 test 被开发者多次接触，不能视为独立盲测。10k 热查询 p99 362.265ms，内存峰值 245.124MB；增加汉字索引后较第二轮延迟与内存上升，仍满足本次 500ms 门槛，不宣称性能全面提升或真实 SDK 泛化。</w:t>
+        <w:t>自动化测试：Windows 146 项（通过）；V11 134 项（通过）。两个报告各自绑定被测版本，最终交付需核对源码摘要。</w:t>
+      </w:r>
+    </w:p>
+    <w:p>
+      <w:pPr>
+        <w:spacing w:line="324" w:lineRule="auto"/>
+      </w:pPr>
+      <w:r>
+        <w:rPr>
+          <w:rFonts w:ascii="Microsoft YaHei" w:hAnsi="Microsoft YaHei" w:eastAsia="Microsoft YaHei"/>
+          <w:sz w:val="21"/>
+        </w:rPr>
+        <w:t>五项及附加安全门槛：Windows True；V11 True。敏感识别为实体级微平均，Windows TP/FP/FN=30/0/0。</w:t>
+      </w:r>
+    </w:p>
+    <w:p>
+      <w:pPr>
+        <w:spacing w:line="324" w:lineRule="auto"/>
+      </w:pPr>
+      <w:r>
+        <w:rPr>
+          <w:rFonts w:ascii="Microsoft YaHei" w:hAnsi="Microsoft YaHei" w:eastAsia="Microsoft YaHei"/>
+          <w:sz w:val="21"/>
+        </w:rPr>
+        <w:t>旧 ABI 原生单探针返回 768 维向量，耗时 13390.615ms；模型身份未验证，不是原生 P95 或质量达标证据。向量数据库往返、真实 Agent/容器和独立 Judge 尚未验证。</w:t>
+      </w:r>
+    </w:p>
+    <w:p>
+      <w:pPr>
+        <w:spacing w:line="324" w:lineRule="auto"/>
+      </w:pPr>
+      <w:r>
+        <w:rPr>
+          <w:rFonts w:ascii="Microsoft YaHei" w:hAnsi="Microsoft YaHei" w:eastAsia="Microsoft YaHei"/>
+          <w:sz w:val="21"/>
+        </w:rPr>
+        <w:t>数据原始 SHA256：51ce224491a4252b69d282138785b28f4a9b8a64212b512f587dd48bfbcd1a98。</w:t>
+      </w:r>
+    </w:p>
+    <w:p>
+      <w:pPr>
+        <w:spacing w:line="324" w:lineRule="auto"/>
+      </w:pPr>
+      <w:r>
+        <w:rPr>
+          <w:rFonts w:ascii="Microsoft YaHei" w:hAnsi="Microsoft YaHei" w:eastAsia="Microsoft YaHei"/>
+          <w:sz w:val="21"/>
+        </w:rPr>
+        <w:t>原始报告：artifacts/verification/round5/requests_windows.json、artifacts/verification/round5/kylin/requests.json；完整来源摘要见 artifacts/verification/round5/evidence_summary.json。</w:t>
+      </w:r>
+    </w:p>
+    <w:p>
+      <w:pPr>
+        <w:spacing w:line="324" w:lineRule="auto"/>
+      </w:pPr>
+      <w:r>
+        <w:rPr>
+          <w:rFonts w:ascii="Microsoft YaHei" w:hAnsi="Microsoft YaHei" w:eastAsia="Microsoft YaHei"/>
+          <w:sz w:val="21"/>
+        </w:rPr>
+        <w:t>延迟来自80个不同查询的nearest-rank P95，覆盖实际MemoryService.search的服务锁、检索和序列化；不预热，不含HTTP传输及Agent推理。10,000条合成记录不代表真实业务分布。冻结基线、偏好及敏感识别失败与修复过程均保留，见 docs/30_逐请求评测与冻结基线.md，未修改标签或复制请求以改变分母。</w:t>
+      </w:r>
+    </w:p>
+    <w:p>
+      <w:pPr>
+        <w:spacing w:line="324" w:lineRule="auto"/>
+      </w:pPr>
+      <w:r>
+        <w:rPr>
+          <w:rFonts w:ascii="Microsoft YaHei" w:hAnsi="Microsoft YaHei" w:eastAsia="Microsoft YaHei"/>
+          <w:sz w:val="21"/>
+        </w:rPr>
+        <w:t>v1/v2保留为历史标签诊断：标签含单条低证据输入，按当前晋升门槛有未达项，不能沿用旧满分。v3内容/模板族隔离及dev阈值校准继续作为独立检索回归，不替代上述五项。四档规模基准与HTTP/SQLite混合负载另报，不把热p99改称逐请求P95。</w:t>
       </w:r>
     </w:p>
     <w:p>
@@ -2040,7 +2618,7 @@
           <w:rFonts w:ascii="Microsoft YaHei" w:hAnsi="Microsoft YaHei" w:eastAsia="Microsoft YaHei"/>
           <w:sz w:val="21"/>
         </w:rPr>
-        <w:t>从发榜单位取得真实 SDK、模型、数据和指定银河麒麟版本。</w:t>
+        <w:t>请出题方确认V11虚拟机部署形式、匹配的SDK模型/向量资源和正式评测口径。</w:t>
       </w:r>
     </w:p>
     <w:p>
@@ -2052,7 +2630,7 @@
           <w:rFonts w:ascii="Microsoft YaHei" w:hAnsi="Microsoft YaHei" w:eastAsia="Microsoft YaHei"/>
           <w:sz w:val="21"/>
         </w:rPr>
-        <w:t>在指定架构复跑自检、全部测试、v2 评测与 10,000 条基准。</w:t>
+        <w:t>在获认可环境执行真实Agent/容器/独立Judge以及同一冻结五项，不沿用HashEmbedding原生性能。</w:t>
       </w:r>
     </w:p>
     <w:p>
@@ -2108,7 +2686,7 @@
           <w:rFonts w:ascii="Microsoft YaHei" w:hAnsi="Microsoft YaHei" w:eastAsia="Microsoft YaHei"/>
           <w:sz w:val="21"/>
         </w:rPr>
-        <w:t>本方案把 OS Agent 记忆管理从历史堆叠改造成有作用域、有证据、有生命周期、有冲突治理、有遗忘审计的端侧闭环。现有源码和开发机证据支持进入真实银河麒麟与 SDK 联调，但在外部测试完成前，项目状态应表述为“核心原型与开发机验证完成，赛题指定环境待验收”。</w:t>
+        <w:t>本方案把 OS Agent 记忆管理从历史堆叠改造成有作用域、有证据、有生命周期、有冲突治理、有遗忘审计的端侧闭环。准确状态为“Windows/V11虚拟机公开合成内部回归五项达标，旧ABI单探针成功；原生完整集成、独立盲测和赛事验收未完成”。正式交付保持INCOMPLETE，不自动提交或发送邮件。</w:t>
       </w:r>
     </w:p>
     <w:p>
@@ -2127,7 +2705,7 @@
         <w:pStyle w:val="Heading1"/>
       </w:pPr>
       <w:r>
-        <w:t>第四轮：官方口径与隔离环境验收</w:t>
+        <w:t>第五轮逐请求与双环境验收</w:t>
       </w:r>
     </w:p>
     <w:p>
@@ -2139,7 +2717,7 @@
           <w:rFonts w:ascii="Microsoft YaHei" w:hAnsi="Microsoft YaHei" w:eastAsia="Microsoft YaHei"/>
           <w:sz w:val="21"/>
         </w:rPr>
-        <w:t>更新时间：2026-09-07T06:26:02+00:00</w:t>
+        <w:t>生成时间（UTC）：2026-09-07T11:35:11+00:00</w:t>
       </w:r>
     </w:p>
     <w:p>
@@ -2151,7 +2729,7 @@
           <w:rFonts w:ascii="Microsoft YaHei" w:hAnsi="Microsoft YaHei" w:eastAsia="Microsoft YaHei"/>
           <w:sz w:val="21"/>
         </w:rPr>
-        <w:t>官方强制部署环境为银河麒麟 V11；SDK 为推荐项。下表是开发者持有公开合成标签的内部诊断，不能当作独立盲测或官方认证。</w:t>
+        <w:t>公开合成冻结回归，不是第三方盲测或官方认证；两个环境均为 HashEmbedding 256 维、10,000 条记录、top_k=3、阈值 0.265，实际调用 MemoryService.search。</w:t>
       </w:r>
     </w:p>
     <w:tbl>
@@ -2180,7 +2758,7 @@
                 <w:b/>
                 <w:sz w:val="18"/>
               </w:rPr>
-              <w:t>官方指标</w:t>
+              <w:t>指标</w:t>
             </w:r>
           </w:p>
         </w:tc>
@@ -2196,7 +2774,7 @@
                 <w:b/>
                 <w:sz w:val="18"/>
               </w:rPr>
-              <w:t>目标</w:t>
+              <w:t>门槛</w:t>
             </w:r>
           </w:p>
         </w:tc>
@@ -2212,7 +2790,7 @@
                 <w:b/>
                 <w:sz w:val="18"/>
               </w:rPr>
-              <w:t>当前内部值</w:t>
+              <w:t>Windows</w:t>
             </w:r>
           </w:p>
         </w:tc>
@@ -2228,7 +2806,7 @@
                 <w:b/>
                 <w:sz w:val="18"/>
               </w:rPr>
-              <w:t>分母</w:t>
+              <w:t>麒麟 V11 虚拟机</w:t>
             </w:r>
           </w:p>
         </w:tc>
@@ -2244,7 +2822,7 @@
                 <w:b/>
                 <w:sz w:val="18"/>
               </w:rPr>
-              <w:t>限制</w:t>
+              <w:t>请求数</w:t>
             </w:r>
           </w:p>
         </w:tc>
@@ -2262,7 +2840,7 @@
                 <w:b w:val="0"/>
                 <w:sz w:val="18"/>
               </w:rPr>
-              <w:t>偏好提取准确率</w:t>
+              <w:t>偏好逐请求准确率</w:t>
             </w:r>
           </w:p>
         </w:tc>
@@ -2278,171 +2856,7 @@
                 <w:b w:val="0"/>
                 <w:sz w:val="18"/>
               </w:rPr>
-              <w:t>≥85%</w:t>
-            </w:r>
-          </w:p>
-        </w:tc>
-        <w:tc>
-          <w:tcPr>
-            <w:tcW w:type="dxa" w:w="1881"/>
-          </w:tcPr>
-          <w:p>
-            <w:r/>
-            <w:r>
-              <w:rPr>
-                <w:rFonts w:ascii="Microsoft YaHei" w:hAnsi="Microsoft YaHei" w:eastAsia="Microsoft YaHei"/>
-                <w:b w:val="0"/>
-                <w:sz w:val="18"/>
-              </w:rPr>
-              <w:t>46.15%</w:t>
-            </w:r>
-          </w:p>
-        </w:tc>
-        <w:tc>
-          <w:tcPr>
-            <w:tcW w:type="dxa" w:w="1881"/>
-          </w:tcPr>
-          <w:p>
-            <w:r/>
-            <w:r>
-              <w:rPr>
-                <w:rFonts w:ascii="Microsoft YaHei" w:hAnsi="Microsoft YaHei" w:eastAsia="Microsoft YaHei"/>
-                <w:b w:val="0"/>
-                <w:sz w:val="18"/>
-              </w:rPr>
-              <w:t>13</w:t>
-            </w:r>
-          </w:p>
-        </w:tc>
-        <w:tc>
-          <w:tcPr>
-            <w:tcW w:type="dxa" w:w="1881"/>
-          </w:tcPr>
-          <w:p>
-            <w:r/>
-            <w:r>
-              <w:rPr>
-                <w:rFonts w:ascii="Microsoft YaHei" w:hAnsi="Microsoft YaHei" w:eastAsia="Microsoft YaHei"/>
-                <w:b w:val="0"/>
-                <w:sz w:val="18"/>
-              </w:rPr>
-              <w:t>旧v2持久偏好槽位；非独立请求，未达目标</w:t>
-            </w:r>
-          </w:p>
-        </w:tc>
-      </w:tr>
-      <w:tr>
-        <w:tc>
-          <w:tcPr>
-            <w:tcW w:type="dxa" w:w="1881"/>
-          </w:tcPr>
-          <w:p>
-            <w:r/>
-            <w:r>
-              <w:rPr>
-                <w:rFonts w:ascii="Microsoft YaHei" w:hAnsi="Microsoft YaHei" w:eastAsia="Microsoft YaHei"/>
-                <w:b w:val="0"/>
-                <w:sz w:val="18"/>
-              </w:rPr>
-              <w:t>知识检索召回率</w:t>
-            </w:r>
-          </w:p>
-        </w:tc>
-        <w:tc>
-          <w:tcPr>
-            <w:tcW w:type="dxa" w:w="1881"/>
-          </w:tcPr>
-          <w:p>
-            <w:r/>
-            <w:r>
-              <w:rPr>
-                <w:rFonts w:ascii="Microsoft YaHei" w:hAnsi="Microsoft YaHei" w:eastAsia="Microsoft YaHei"/>
-                <w:b w:val="0"/>
-                <w:sz w:val="18"/>
-              </w:rPr>
-              <w:t>≥85%</w:t>
-            </w:r>
-          </w:p>
-        </w:tc>
-        <w:tc>
-          <w:tcPr>
-            <w:tcW w:type="dxa" w:w="1881"/>
-          </w:tcPr>
-          <w:p>
-            <w:r/>
-            <w:r>
-              <w:rPr>
-                <w:rFonts w:ascii="Microsoft YaHei" w:hAnsi="Microsoft YaHei" w:eastAsia="Microsoft YaHei"/>
-                <w:b w:val="0"/>
-                <w:sz w:val="18"/>
-              </w:rPr>
-              <w:t>91.67%</w:t>
-            </w:r>
-          </w:p>
-        </w:tc>
-        <w:tc>
-          <w:tcPr>
-            <w:tcW w:type="dxa" w:w="1881"/>
-          </w:tcPr>
-          <w:p>
-            <w:r/>
-            <w:r>
-              <w:rPr>
-                <w:rFonts w:ascii="Microsoft YaHei" w:hAnsi="Microsoft YaHei" w:eastAsia="Microsoft YaHei"/>
-                <w:b w:val="0"/>
-                <w:sz w:val="18"/>
-              </w:rPr>
-              <w:t>12</w:t>
-            </w:r>
-          </w:p>
-        </w:tc>
-        <w:tc>
-          <w:tcPr>
-            <w:tcW w:type="dxa" w:w="1881"/>
-          </w:tcPr>
-          <w:p>
-            <w:r/>
-            <w:r>
-              <w:rPr>
-                <w:rFonts w:ascii="Microsoft YaHei" w:hAnsi="Microsoft YaHei" w:eastAsia="Microsoft YaHei"/>
-                <w:b w:val="0"/>
-                <w:sz w:val="18"/>
-              </w:rPr>
-              <w:t>v3正例Recall@3，少于50请求</w:t>
-            </w:r>
-          </w:p>
-        </w:tc>
-      </w:tr>
-      <w:tr>
-        <w:tc>
-          <w:tcPr>
-            <w:tcW w:type="dxa" w:w="1881"/>
-          </w:tcPr>
-          <w:p>
-            <w:r/>
-            <w:r>
-              <w:rPr>
-                <w:rFonts w:ascii="Microsoft YaHei" w:hAnsi="Microsoft YaHei" w:eastAsia="Microsoft YaHei"/>
-                <w:b w:val="0"/>
-                <w:sz w:val="18"/>
-              </w:rPr>
-              <w:t>知识冲突处理正确率</w:t>
-            </w:r>
-          </w:p>
-        </w:tc>
-        <w:tc>
-          <w:tcPr>
-            <w:tcW w:type="dxa" w:w="1881"/>
-          </w:tcPr>
-          <w:p>
-            <w:r/>
-            <w:r>
-              <w:rPr>
-                <w:rFonts w:ascii="Microsoft YaHei" w:hAnsi="Microsoft YaHei" w:eastAsia="Microsoft YaHei"/>
-                <w:b w:val="0"/>
-                <w:sz w:val="18"/>
-              </w:rPr>
-              <w:t>≥88%</w:t>
+              <w:t>&gt;=85%</w:t>
             </w:r>
           </w:p>
         </w:tc>
@@ -2474,7 +2888,7 @@
                 <w:b w:val="0"/>
                 <w:sz w:val="18"/>
               </w:rPr>
-              <w:t>2</w:t>
+              <w:t>100.00%</w:t>
             </w:r>
           </w:p>
         </w:tc>
@@ -2490,7 +2904,7 @@
                 <w:b w:val="0"/>
                 <w:sz w:val="18"/>
               </w:rPr>
-              <w:t>仅2个旧集案例，少于50请求</w:t>
+              <w:t>68</w:t>
             </w:r>
           </w:p>
         </w:tc>
@@ -2508,7 +2922,7 @@
                 <w:b w:val="0"/>
                 <w:sz w:val="18"/>
               </w:rPr>
-              <w:t>检索响应延迟P95</w:t>
+              <w:t>知识 Recall@3</w:t>
             </w:r>
           </w:p>
         </w:tc>
@@ -2524,7 +2938,7 @@
                 <w:b w:val="0"/>
                 <w:sz w:val="18"/>
               </w:rPr>
-              <w:t>≤500ms</w:t>
+              <w:t>&gt;=85%</w:t>
             </w:r>
           </w:p>
         </w:tc>
@@ -2540,7 +2954,7 @@
                 <w:b w:val="0"/>
                 <w:sz w:val="18"/>
               </w:rPr>
-              <w:t>190.565ms</w:t>
+              <w:t>100.00%</w:t>
             </w:r>
           </w:p>
         </w:tc>
@@ -2556,7 +2970,7 @@
                 <w:b w:val="0"/>
                 <w:sz w:val="18"/>
               </w:rPr>
-              <w:t>50</w:t>
+              <w:t>100.00%</w:t>
             </w:r>
           </w:p>
         </w:tc>
@@ -2572,7 +2986,7 @@
                 <w:b w:val="0"/>
                 <w:sz w:val="18"/>
               </w:rPr>
-              <w:t>HashEmbedding，进程内，合成主题模板</w:t>
+              <w:t>60</w:t>
             </w:r>
           </w:p>
         </w:tc>
@@ -2590,7 +3004,7 @@
                 <w:b w:val="0"/>
                 <w:sz w:val="18"/>
               </w:rPr>
-              <w:t>敏感信息识别F1</w:t>
+              <w:t>冲突正确率</w:t>
             </w:r>
           </w:p>
         </w:tc>
@@ -2606,7 +3020,187 @@
                 <w:b w:val="0"/>
                 <w:sz w:val="18"/>
               </w:rPr>
-              <w:t>≥90%</w:t>
+              <w:t>&gt;=88%</w:t>
+            </w:r>
+          </w:p>
+        </w:tc>
+        <w:tc>
+          <w:tcPr>
+            <w:tcW w:type="dxa" w:w="1881"/>
+          </w:tcPr>
+          <w:p>
+            <w:r/>
+            <w:r>
+              <w:rPr>
+                <w:rFonts w:ascii="Microsoft YaHei" w:hAnsi="Microsoft YaHei" w:eastAsia="Microsoft YaHei"/>
+                <w:b w:val="0"/>
+                <w:sz w:val="18"/>
+              </w:rPr>
+              <w:t>100.00%</w:t>
+            </w:r>
+          </w:p>
+        </w:tc>
+        <w:tc>
+          <w:tcPr>
+            <w:tcW w:type="dxa" w:w="1881"/>
+          </w:tcPr>
+          <w:p>
+            <w:r/>
+            <w:r>
+              <w:rPr>
+                <w:rFonts w:ascii="Microsoft YaHei" w:hAnsi="Microsoft YaHei" w:eastAsia="Microsoft YaHei"/>
+                <w:b w:val="0"/>
+                <w:sz w:val="18"/>
+              </w:rPr>
+              <w:t>100.00%</w:t>
+            </w:r>
+          </w:p>
+        </w:tc>
+        <w:tc>
+          <w:tcPr>
+            <w:tcW w:type="dxa" w:w="1881"/>
+          </w:tcPr>
+          <w:p>
+            <w:r/>
+            <w:r>
+              <w:rPr>
+                <w:rFonts w:ascii="Microsoft YaHei" w:hAnsi="Microsoft YaHei" w:eastAsia="Microsoft YaHei"/>
+                <w:b w:val="0"/>
+                <w:sz w:val="18"/>
+              </w:rPr>
+              <w:t>60</w:t>
+            </w:r>
+          </w:p>
+        </w:tc>
+      </w:tr>
+      <w:tr>
+        <w:tc>
+          <w:tcPr>
+            <w:tcW w:type="dxa" w:w="1881"/>
+          </w:tcPr>
+          <w:p>
+            <w:r/>
+            <w:r>
+              <w:rPr>
+                <w:rFonts w:ascii="Microsoft YaHei" w:hAnsi="Microsoft YaHei" w:eastAsia="Microsoft YaHei"/>
+                <w:b w:val="0"/>
+                <w:sz w:val="18"/>
+              </w:rPr>
+              <w:t>检索 P95</w:t>
+            </w:r>
+          </w:p>
+        </w:tc>
+        <w:tc>
+          <w:tcPr>
+            <w:tcW w:type="dxa" w:w="1881"/>
+          </w:tcPr>
+          <w:p>
+            <w:r/>
+            <w:r>
+              <w:rPr>
+                <w:rFonts w:ascii="Microsoft YaHei" w:hAnsi="Microsoft YaHei" w:eastAsia="Microsoft YaHei"/>
+                <w:b w:val="0"/>
+                <w:sz w:val="18"/>
+              </w:rPr>
+              <w:t>&lt;=500ms</w:t>
+            </w:r>
+          </w:p>
+        </w:tc>
+        <w:tc>
+          <w:tcPr>
+            <w:tcW w:type="dxa" w:w="1881"/>
+          </w:tcPr>
+          <w:p>
+            <w:r/>
+            <w:r>
+              <w:rPr>
+                <w:rFonts w:ascii="Microsoft YaHei" w:hAnsi="Microsoft YaHei" w:eastAsia="Microsoft YaHei"/>
+                <w:b w:val="0"/>
+                <w:sz w:val="18"/>
+              </w:rPr>
+              <w:t>67.320ms</w:t>
+            </w:r>
+          </w:p>
+        </w:tc>
+        <w:tc>
+          <w:tcPr>
+            <w:tcW w:type="dxa" w:w="1881"/>
+          </w:tcPr>
+          <w:p>
+            <w:r/>
+            <w:r>
+              <w:rPr>
+                <w:rFonts w:ascii="Microsoft YaHei" w:hAnsi="Microsoft YaHei" w:eastAsia="Microsoft YaHei"/>
+                <w:b w:val="0"/>
+                <w:sz w:val="18"/>
+              </w:rPr>
+              <w:t>111.626ms</w:t>
+            </w:r>
+          </w:p>
+        </w:tc>
+        <w:tc>
+          <w:tcPr>
+            <w:tcW w:type="dxa" w:w="1881"/>
+          </w:tcPr>
+          <w:p>
+            <w:r/>
+            <w:r>
+              <w:rPr>
+                <w:rFonts w:ascii="Microsoft YaHei" w:hAnsi="Microsoft YaHei" w:eastAsia="Microsoft YaHei"/>
+                <w:b w:val="0"/>
+                <w:sz w:val="18"/>
+              </w:rPr>
+              <w:t>80</w:t>
+            </w:r>
+          </w:p>
+        </w:tc>
+      </w:tr>
+      <w:tr>
+        <w:tc>
+          <w:tcPr>
+            <w:tcW w:type="dxa" w:w="1881"/>
+          </w:tcPr>
+          <w:p>
+            <w:r/>
+            <w:r>
+              <w:rPr>
+                <w:rFonts w:ascii="Microsoft YaHei" w:hAnsi="Microsoft YaHei" w:eastAsia="Microsoft YaHei"/>
+                <w:b w:val="0"/>
+                <w:sz w:val="18"/>
+              </w:rPr>
+              <w:t>敏感实体 F1</w:t>
+            </w:r>
+          </w:p>
+        </w:tc>
+        <w:tc>
+          <w:tcPr>
+            <w:tcW w:type="dxa" w:w="1881"/>
+          </w:tcPr>
+          <w:p>
+            <w:r/>
+            <w:r>
+              <w:rPr>
+                <w:rFonts w:ascii="Microsoft YaHei" w:hAnsi="Microsoft YaHei" w:eastAsia="Microsoft YaHei"/>
+                <w:b w:val="0"/>
+                <w:sz w:val="18"/>
+              </w:rPr>
+              <w:t>&gt;=90%</w:t>
+            </w:r>
+          </w:p>
+        </w:tc>
+        <w:tc>
+          <w:tcPr>
+            <w:tcW w:type="dxa" w:w="1881"/>
+          </w:tcPr>
+          <w:p>
+            <w:r/>
+            <w:r>
+              <w:rPr>
+                <w:rFonts w:ascii="Microsoft YaHei" w:hAnsi="Microsoft YaHei" w:eastAsia="Microsoft YaHei"/>
+                <w:b w:val="0"/>
+                <w:sz w:val="18"/>
+              </w:rPr>
+              <w:t>100.00%</w:t>
             </w:r>
           </w:p>
         </w:tc>
@@ -2642,22 +3236,6 @@
             </w:r>
           </w:p>
         </w:tc>
-        <w:tc>
-          <w:tcPr>
-            <w:tcW w:type="dxa" w:w="1881"/>
-          </w:tcPr>
-          <w:p>
-            <w:r/>
-            <w:r>
-              <w:rPr>
-                <w:rFonts w:ascii="Microsoft YaHei" w:hAnsi="Microsoft YaHei" w:eastAsia="Microsoft YaHei"/>
-                <w:b w:val="0"/>
-                <w:sz w:val="18"/>
-              </w:rPr>
-              <w:t>50公开合成请求；请求级分类，非实体级F1</w:t>
-            </w:r>
-          </w:p>
-        </w:tc>
       </w:tr>
     </w:tbl>
     <w:p>
@@ -2669,7 +3247,7 @@
           <w:rFonts w:ascii="Microsoft YaHei" w:hAnsi="Microsoft YaHei" w:eastAsia="Microsoft YaHei"/>
           <w:sz w:val="21"/>
         </w:rPr>
-        <w:t>每项官方测试至少50次独立请求；当前偏好、召回、冲突的分母不足，不使用重复执行来凑数。偏好旧评测通过真实生命周期门槛，未降低授权或晋升要求来提高分数。</w:t>
+        <w:t>自动化测试：Windows 146 项（通过）；V11 134 项（通过）。两个报告各自绑定被测版本，最终交付需核对源码摘要。</w:t>
       </w:r>
     </w:p>
     <w:p>
@@ -2681,7 +3259,7 @@
           <w:rFonts w:ascii="Microsoft YaHei" w:hAnsi="Microsoft YaHei" w:eastAsia="Microsoft YaHei"/>
           <w:sz w:val="21"/>
         </w:rPr>
-        <w:t>Windows完整工程检查通过：True；测试数：115。原始记录见 round4/final_verification.json。</w:t>
+        <w:t>五项及附加安全门槛：Windows True；V11 True。敏感识别为实体级微平均，Windows TP/FP/FN=30/0/0。</w:t>
       </w:r>
     </w:p>
     <w:p>
@@ -2693,7 +3271,7 @@
           <w:rFonts w:ascii="Microsoft YaHei" w:hAnsi="Microsoft YaHei" w:eastAsia="Microsoft YaHei"/>
           <w:sz w:val="21"/>
         </w:rPr>
-        <w:t>V11专用虚拟机已安装：False；客户机回归通过：False。详情见 round4/kylin_vm.json（存在时）。</w:t>
+        <w:t>旧 ABI 原生单探针返回 768 维向量，耗时 13390.615ms；模型身份未验证，不是原生 P95 或质量达标证据。向量数据库往返、真实 Agent/容器和独立 Judge 尚未验证。</w:t>
       </w:r>
     </w:p>
     <w:p>
@@ -2705,27 +3283,27 @@
           <w:rFonts w:ascii="Microsoft YaHei" w:hAnsi="Microsoft YaHei" w:eastAsia="Microsoft YaHei"/>
           <w:sz w:val="21"/>
         </w:rPr>
-        <w:t>虚拟机实测不能自行证明赛事认可；架构与虚拟化信息随报告保存。真实SDK/模型/向量服务连接仍以独立诊断为准。</w:t>
+        <w:t>数据原始 SHA256：51ce224491a4252b69d282138785b28f4a9b8a64212b512f587dd48bfbcd1a98。</w:t>
       </w:r>
     </w:p>
     <w:p>
       <w:pPr>
-        <w:pStyle w:val="Heading2"/>
-      </w:pPr>
-      <w:r>
-        <w:t>本轮实现</w:t>
-      </w:r>
-    </w:p>
-    <w:p>
-      <w:pPr>
-        <w:pStyle w:val="ListBullet"/>
+        <w:spacing w:line="324" w:lineRule="auto"/>
       </w:pPr>
       <w:r>
         <w:rPr>
           <w:rFonts w:ascii="Microsoft YaHei" w:hAnsi="Microsoft YaHei" w:eastAsia="Microsoft YaHei"/>
           <w:sz w:val="21"/>
         </w:rPr>
-        <w:t>官方五项指标、50请求门槛、V11严格识别；内部结果和正式就绪分离。</w:t>
+        <w:t>原始报告：artifacts/verification/round5/requests_windows.json、artifacts/verification/round5/kylin/requests.json；完整来源摘要见 artifacts/verification/round5/evidence_summary.json。</w:t>
+      </w:r>
+    </w:p>
+    <w:p>
+      <w:pPr>
+        <w:pStyle w:val="Heading2"/>
+      </w:pPr>
+      <w:r>
+        <w:t>评分口径</w:t>
       </w:r>
     </w:p>
     <w:p>
@@ -2737,7 +3315,7 @@
           <w:rFonts w:ascii="Microsoft YaHei" w:hAnsi="Microsoft YaHei" w:eastAsia="Microsoft YaHei"/>
           <w:sz w:val="21"/>
         </w:rPr>
-        <w:t>独立实验目录、venv与虚拟磁盘；镜像校验；赛后先核查、再可恢复撤除。</w:t>
+        <w:t>偏好按每个请求的完整键值集合评分，多报或漏报都算错；提取和长期持久化授权分开。</w:t>
       </w:r>
     </w:p>
     <w:p>
@@ -2749,7 +3327,7 @@
           <w:rFonts w:ascii="Microsoft YaHei" w:hAnsi="Microsoft YaHei" w:eastAsia="Microsoft YaHei"/>
           <w:sz w:val="21"/>
         </w:rPr>
-        <w:t>Markdown/YAML四类记忆、显式授权、版本更新、索引预算和失败回滚。</w:t>
+        <w:t>召回为60个不同正例请求的 Recall@3；另有12个无答案、8个跨作用域请求，不能通过乱答提高召回。</w:t>
       </w:r>
     </w:p>
     <w:p>
@@ -2761,7 +3339,7 @@
           <w:rFonts w:ascii="Microsoft YaHei" w:hAnsi="Microsoft YaHei" w:eastAsia="Microsoft YaHei"/>
           <w:sz w:val="21"/>
         </w:rPr>
-        <w:t>按需召回最多5条、超时及失败关闭、正文读取预算、歧义删除逐项确认。</w:t>
+        <w:t>冲突为60组独立存储上的检测与最终状态联合评分，包含应冲突及不应冲突的反例。</w:t>
       </w:r>
     </w:p>
     <w:p>
@@ -2773,7 +3351,7 @@
           <w:rFonts w:ascii="Microsoft YaHei" w:hAnsi="Microsoft YaHei" w:eastAsia="Microsoft YaHei"/>
           <w:sz w:val="21"/>
         </w:rPr>
-        <w:t>否定与多字段偏好修正；5会话50轮行动评测，检查15个实际文件。</w:t>
+        <w:t>P95取80个不同查询的 nearest-rank，不预热、不调整单条阈值；含服务锁及结果序列化，不含HTTP传输或Agent推理。填充语料为合成干扰项，不代表真实业务分布。</w:t>
       </w:r>
     </w:p>
     <w:p>
@@ -2785,19 +3363,63 @@
           <w:rFonts w:ascii="Microsoft YaHei" w:hAnsi="Microsoft YaHei" w:eastAsia="Microsoft YaHei"/>
           <w:sz w:val="21"/>
         </w:rPr>
-        <w:t>真实Embedding C ABI子进程适配；无库或错误输出时失败，不回退冒充接通。</w:t>
+        <w:t>敏感识别为50请求上的实体类型及精确值多重集；重复检测计FP，漏检计FN，另查脱敏泄漏。</w:t>
       </w:r>
     </w:p>
     <w:p>
       <w:pPr>
-        <w:spacing w:line="324" w:lineRule="auto"/>
+        <w:pStyle w:val="ListBullet"/>
       </w:pPr>
       <w:r>
         <w:rPr>
           <w:rFonts w:ascii="Microsoft YaHei" w:hAnsi="Microsoft YaHei" w:eastAsia="Microsoft YaHei"/>
           <w:sz w:val="21"/>
         </w:rPr>
-        <w:t>行动替身15/15仅是框架自检；真实KylinBot/模型、单样本容器与独立LLM Judge尚未完成。向量数据库C++服务接入也仍待完成。</w:t>
+        <w:t>持久化、入库、无答案、作用域和脱敏泄漏分别作为硬门槛；不降低授权或生命周期要求。</w:t>
+      </w:r>
+    </w:p>
+    <w:p>
+      <w:pPr>
+        <w:pStyle w:val="Heading2"/>
+      </w:pPr>
+      <w:r>
+        <w:t>迭代与证据</w:t>
+      </w:r>
+    </w:p>
+    <w:p>
+      <w:pPr>
+        <w:spacing w:line="324" w:lineRule="auto"/>
+      </w:pPr>
+      <w:r>
+        <w:rPr>
+          <w:rFonts w:ascii="Microsoft YaHei" w:hAnsi="Microsoft YaHei" w:eastAsia="Microsoft YaHei"/>
+          <w:sz w:val="21"/>
+        </w:rPr>
+        <w:t>冻结基线见 docs/30_逐请求评测与冻结基线.md。首轮偏好70.59%、敏感F1 70.59%的失败、偏好迭代和后续全量质量迭代均保留在 round5；没有改标签、复制请求或更换分母。</w:t>
+      </w:r>
+    </w:p>
+    <w:p>
+      <w:pPr>
+        <w:spacing w:line="324" w:lineRule="auto"/>
+      </w:pPr>
+      <w:r>
+        <w:rPr>
+          <w:rFonts w:ascii="Microsoft YaHei" w:hAnsi="Microsoft YaHei" w:eastAsia="Microsoft YaHei"/>
+          <w:sz w:val="21"/>
+        </w:rPr>
+        <w:t>V11磁盘安装、根文件系统、虚拟化和首轮临时目录失败详见 docs/31_麒麟V11客户机实测.md；SDK新旧ABI和真实探针详见 docs/27_真实SDK接入与证据边界.md。</w:t>
+      </w:r>
+    </w:p>
+    <w:p>
+      <w:pPr>
+        <w:spacing w:line="324" w:lineRule="auto"/>
+      </w:pPr>
+      <w:r>
+        <w:rPr>
+          <w:rFonts w:ascii="Microsoft YaHei" w:hAnsi="Microsoft YaHei" w:eastAsia="Microsoft YaHei"/>
+          <w:sz w:val="21"/>
+        </w:rPr>
+        <w:t>v1/v2旧标签诊断及v3历史检索数据继续保留，不沿用旧满分宣称，也不为绿灯削弱晋升门槛。</w:t>
       </w:r>
     </w:p>
     <w:p>
@@ -2819,11 +3441,9 @@
         </w:rPr>
         <w:t>python -S -m unittest discover -s tests -v</w:t>
         <w:br/>
-        <w:t>python -S scripts/evaluate_official.py --output artifacts/runtime/official.json --size 10000</w:t>
+        <w:t>python -S scripts/evaluate_requests.py --size 10000 --require-targets --output artifacts/runtime/requests.json</w:t>
         <w:br/>
-        <w:t>python -S scripts/evaluate_official.py --output artifacts/runtime/official-required.json --require-official</w:t>
-        <w:br/>
-        <w:t>python -S scripts/check_kylin_native.py --output artifacts/runtime/native-sdk.json</w:t>
+        <w:t>python -S scripts/verify_release.py --artifact-dir artifacts/runtime/release --sizes 100,1000,5000,10000 --rounds 30</w:t>
       </w:r>
     </w:p>
     <w:p>
@@ -2835,7 +3455,15 @@
           <w:rFonts w:ascii="Microsoft YaHei" w:hAnsi="Microsoft YaHei" w:eastAsia="Microsoft YaHei"/>
           <w:sz w:val="21"/>
         </w:rPr>
-        <w:t>第二条只生成内部诊断；带 --require-official 的命令在证据不足时退出2；SDK诊断未实际连接时退出2。</w:t>
+        <w:t>实际V11客户机使用 env TMPDIR=/var/tmp python3 -S scripts/verify_kylin_guest.py --output &lt;新目录&gt;。不能在Windows执行后把报告名改成麒麟结果。</w:t>
+      </w:r>
+    </w:p>
+    <w:p>
+      <w:pPr>
+        <w:pStyle w:val="Heading2"/>
+      </w:pPr>
+      <w:r>
+        <w:t>外部未完成</w:t>
       </w:r>
     </w:p>
     <w:p>
@@ -2847,7 +3475,7 @@
           <w:rFonts w:ascii="Microsoft YaHei" w:hAnsi="Microsoft YaHei" w:eastAsia="Microsoft YaHei"/>
           <w:sz w:val="21"/>
         </w:rPr>
-        <w:t>当前材料为INCOMPLETE草案。独立盲测、授权案例、视频、赛事审核、报名与邮件回执仍需补齐。正式邮件不得由脚本自动发送。</w:t>
+        <w:t>官方强制银河麒麟V11，SDK为推荐项；V11虚拟机实测不等于出题方认可部署形式。第三方盲测、正式Agent/Judge、匹配原生模型/向量资源、授权案例、不超过7分钟的最终视频复核、平台审核、盖章报名表和提交回执仍需完成。</w:t>
       </w:r>
     </w:p>
     <w:p>
@@ -2859,7 +3487,7 @@
           <w:rFonts w:ascii="Microsoft YaHei" w:hAnsi="Microsoft YaHei" w:eastAsia="Microsoft YaHei"/>
           <w:sz w:val="21"/>
         </w:rPr>
-        <w:t>历史第三轮归档和原始报告保留；91.67%召回与100%无答案正确率是历史内部检索指标，不是官方两个85%均达成。</w:t>
+        <w:t>本地发布总验收：None（null表示尚未运行最终验收）。正式提交保持 INCOMPLETE，competition_ready=false，不自动发送邮件。</w:t>
       </w:r>
     </w:p>
     <w:sectPr>
@@ -2884,14 +3512,14 @@
         <w:rFonts w:ascii="Microsoft YaHei" w:hAnsi="Microsoft YaHei" w:eastAsia="Microsoft YaHei"/>
         <w:sz w:val="16"/>
       </w:rPr>
-      <w:t>OS Agent 记忆优化 · 开发机交付材料 · 结论边界见正文</w:t>
+      <w:t>OS Agent 记忆优化 · 第五轮内部验证 · 结论边界见正文</w:t>
     </w:r>
     <w:r>
       <w:rPr>
         <w:rFonts w:ascii="Microsoft YaHei" w:hAnsi="Microsoft YaHei" w:eastAsia="Microsoft YaHei"/>
         <w:sz w:val="16"/>
       </w:rPr>
-      <w:t>OS Agent 记忆优化 · 开发机交付材料 · 结论边界见正文</w:t>
+      <w:t>OS Agent 记忆优化 · 第五轮内部验证 · 结论边界见正文</w:t>
     </w:r>
   </w:p>
 </w:ftr>

</xml_diff>

<commit_message>
test(release): seal verified Windows and V11 delivery evidence (R08)
</commit_message>
<xml_diff>
--- a/deliverables/doc/OS_Agent_记忆优化_技术方案与测试报告.docx
+++ b/deliverables/doc/OS_Agent_记忆优化_技术方案与测试报告.docx
@@ -1897,7 +1897,7 @@
                 <w:b w:val="0"/>
                 <w:sz w:val="18"/>
               </w:rPr>
-              <w:t>67.320ms</w:t>
+              <w:t>77.629ms</w:t>
             </w:r>
           </w:p>
         </w:tc>
@@ -1913,7 +1913,7 @@
                 <w:b w:val="0"/>
                 <w:sz w:val="18"/>
               </w:rPr>
-              <w:t>111.626ms</w:t>
+              <w:t>156.977ms</w:t>
             </w:r>
           </w:p>
         </w:tc>
@@ -2026,7 +2026,7 @@
           <w:rFonts w:ascii="Microsoft YaHei" w:hAnsi="Microsoft YaHei" w:eastAsia="Microsoft YaHei"/>
           <w:sz w:val="21"/>
         </w:rPr>
-        <w:t>自动化测试：Windows 146 项（通过）；V11 134 项（通过）。两个报告各自绑定被测版本，最终交付需核对源码摘要。</w:t>
+        <w:t>自动化测试：Windows 164 项（通过）；V11 164 项（通过）。两个报告各自绑定被测版本，最终交付需核对源码摘要。</w:t>
       </w:r>
     </w:p>
     <w:p>
@@ -2074,7 +2074,7 @@
           <w:rFonts w:ascii="Microsoft YaHei" w:hAnsi="Microsoft YaHei" w:eastAsia="Microsoft YaHei"/>
           <w:sz w:val="21"/>
         </w:rPr>
-        <w:t>原始报告：artifacts/verification/round5/requests_windows.json、artifacts/verification/round5/kylin/requests.json；完整来源摘要见 artifacts/verification/round5/evidence_summary.json。</w:t>
+        <w:t>原始报告：artifacts/verification/round5/windows/requests.json、artifacts/verification/round5/kylin_final/requests.json；完整来源摘要见 artifacts/verification/round5/evidence_summary.json。</w:t>
       </w:r>
     </w:p>
     <w:p>
@@ -2717,7 +2717,7 @@
           <w:rFonts w:ascii="Microsoft YaHei" w:hAnsi="Microsoft YaHei" w:eastAsia="Microsoft YaHei"/>
           <w:sz w:val="21"/>
         </w:rPr>
-        <w:t>生成时间（UTC）：2026-09-07T11:35:11+00:00</w:t>
+        <w:t>生成时间（UTC）：2026-09-07T12:47:07+00:00</w:t>
       </w:r>
     </w:p>
     <w:p>
@@ -3118,7 +3118,7 @@
                 <w:b w:val="0"/>
                 <w:sz w:val="18"/>
               </w:rPr>
-              <w:t>67.320ms</w:t>
+              <w:t>77.629ms</w:t>
             </w:r>
           </w:p>
         </w:tc>
@@ -3134,7 +3134,7 @@
                 <w:b w:val="0"/>
                 <w:sz w:val="18"/>
               </w:rPr>
-              <w:t>111.626ms</w:t>
+              <w:t>156.977ms</w:t>
             </w:r>
           </w:p>
         </w:tc>
@@ -3247,7 +3247,7 @@
           <w:rFonts w:ascii="Microsoft YaHei" w:hAnsi="Microsoft YaHei" w:eastAsia="Microsoft YaHei"/>
           <w:sz w:val="21"/>
         </w:rPr>
-        <w:t>自动化测试：Windows 146 项（通过）；V11 134 项（通过）。两个报告各自绑定被测版本，最终交付需核对源码摘要。</w:t>
+        <w:t>自动化测试：Windows 164 项（通过）；V11 164 项（通过）。两个报告各自绑定被测版本，最终交付需核对源码摘要。</w:t>
       </w:r>
     </w:p>
     <w:p>
@@ -3295,7 +3295,7 @@
           <w:rFonts w:ascii="Microsoft YaHei" w:hAnsi="Microsoft YaHei" w:eastAsia="Microsoft YaHei"/>
           <w:sz w:val="21"/>
         </w:rPr>
-        <w:t>原始报告：artifacts/verification/round5/requests_windows.json、artifacts/verification/round5/kylin/requests.json；完整来源摘要见 artifacts/verification/round5/evidence_summary.json。</w:t>
+        <w:t>原始报告：artifacts/verification/round5/windows/requests.json、artifacts/verification/round5/kylin_final/requests.json；完整来源摘要见 artifacts/verification/round5/evidence_summary.json。</w:t>
       </w:r>
     </w:p>
     <w:p>
@@ -3441,7 +3441,7 @@
         </w:rPr>
         <w:t>python -S -m unittest discover -s tests -v</w:t>
         <w:br/>
-        <w:t>python -S scripts/evaluate_requests.py --size 10000 --require-targets --output artifacts/runtime/requests.json</w:t>
+        <w:t>python -X utf8 -S scripts/evaluate_requests.py --size 10000 --require-frozen --output artifacts/runtime/requests.json</w:t>
         <w:br/>
         <w:t>python -S scripts/verify_release.py --artifact-dir artifacts/runtime/release --sizes 100,1000,5000,10000 --rounds 30</w:t>
       </w:r>
@@ -3487,7 +3487,7 @@
           <w:rFonts w:ascii="Microsoft YaHei" w:hAnsi="Microsoft YaHei" w:eastAsia="Microsoft YaHei"/>
           <w:sz w:val="21"/>
         </w:rPr>
-        <w:t>本地发布总验收：None（null表示尚未运行最终验收）。正式提交保持 INCOMPLETE，competition_ready=false，不自动发送邮件。</w:t>
+        <w:t>本地发布总验收：True（null表示尚未运行最终验收）。正式提交保持 INCOMPLETE，competition_ready=false，不自动发送邮件。</w:t>
       </w:r>
     </w:p>
     <w:sectPr>

</xml_diff>

<commit_message>
fix(deliverables): repair and visually verify DOCX pagination (C03)
</commit_message>
<xml_diff>
--- a/deliverables/doc/OS_Agent_记忆优化_技术方案与测试报告.docx
+++ b/deliverables/doc/OS_Agent_记忆优化_技术方案与测试报告.docx
@@ -193,6 +193,10 @@
     <w:p>
       <w:pPr>
         <w:pStyle w:val="ListNumber"/>
+        <w:numPr>
+          <w:ilvl w:val="0"/>
+          <w:numId w:val="10"/>
+        </w:numPr>
       </w:pPr>
       <w:r>
         <w:rPr>
@@ -205,6 +209,10 @@
     <w:p>
       <w:pPr>
         <w:pStyle w:val="ListNumber"/>
+        <w:numPr>
+          <w:ilvl w:val="0"/>
+          <w:numId w:val="10"/>
+        </w:numPr>
       </w:pPr>
       <w:r>
         <w:rPr>
@@ -217,6 +225,10 @@
     <w:p>
       <w:pPr>
         <w:pStyle w:val="ListNumber"/>
+        <w:numPr>
+          <w:ilvl w:val="0"/>
+          <w:numId w:val="10"/>
+        </w:numPr>
       </w:pPr>
       <w:r>
         <w:rPr>
@@ -229,6 +241,10 @@
     <w:p>
       <w:pPr>
         <w:pStyle w:val="ListNumber"/>
+        <w:numPr>
+          <w:ilvl w:val="0"/>
+          <w:numId w:val="10"/>
+        </w:numPr>
       </w:pPr>
       <w:r>
         <w:rPr>
@@ -241,6 +257,10 @@
     <w:p>
       <w:pPr>
         <w:pStyle w:val="ListNumber"/>
+        <w:numPr>
+          <w:ilvl w:val="0"/>
+          <w:numId w:val="10"/>
+        </w:numPr>
       </w:pPr>
       <w:r>
         <w:rPr>
@@ -1066,6 +1086,10 @@
     <w:p>
       <w:pPr>
         <w:pStyle w:val="ListNumber"/>
+        <w:numPr>
+          <w:ilvl w:val="0"/>
+          <w:numId w:val="11"/>
+        </w:numPr>
       </w:pPr>
       <w:r>
         <w:rPr>
@@ -1078,6 +1102,10 @@
     <w:p>
       <w:pPr>
         <w:pStyle w:val="ListNumber"/>
+        <w:numPr>
+          <w:ilvl w:val="0"/>
+          <w:numId w:val="11"/>
+        </w:numPr>
       </w:pPr>
       <w:r>
         <w:rPr>
@@ -1090,6 +1118,10 @@
     <w:p>
       <w:pPr>
         <w:pStyle w:val="ListNumber"/>
+        <w:numPr>
+          <w:ilvl w:val="0"/>
+          <w:numId w:val="11"/>
+        </w:numPr>
       </w:pPr>
       <w:r>
         <w:rPr>
@@ -1102,6 +1134,10 @@
     <w:p>
       <w:pPr>
         <w:pStyle w:val="ListNumber"/>
+        <w:numPr>
+          <w:ilvl w:val="0"/>
+          <w:numId w:val="11"/>
+        </w:numPr>
       </w:pPr>
       <w:r>
         <w:rPr>
@@ -1114,6 +1150,10 @@
     <w:p>
       <w:pPr>
         <w:pStyle w:val="ListNumber"/>
+        <w:numPr>
+          <w:ilvl w:val="0"/>
+          <w:numId w:val="11"/>
+        </w:numPr>
       </w:pPr>
       <w:r>
         <w:rPr>
@@ -1126,6 +1166,10 @@
     <w:p>
       <w:pPr>
         <w:pStyle w:val="ListNumber"/>
+        <w:numPr>
+          <w:ilvl w:val="0"/>
+          <w:numId w:val="11"/>
+        </w:numPr>
       </w:pPr>
       <w:r>
         <w:rPr>
@@ -1346,6 +1390,10 @@
     <w:p>
       <w:pPr>
         <w:pStyle w:val="ListNumber"/>
+        <w:numPr>
+          <w:ilvl w:val="0"/>
+          <w:numId w:val="12"/>
+        </w:numPr>
       </w:pPr>
       <w:r>
         <w:rPr>
@@ -1358,6 +1406,10 @@
     <w:p>
       <w:pPr>
         <w:pStyle w:val="ListNumber"/>
+        <w:numPr>
+          <w:ilvl w:val="0"/>
+          <w:numId w:val="12"/>
+        </w:numPr>
       </w:pPr>
       <w:r>
         <w:rPr>
@@ -1370,6 +1422,10 @@
     <w:p>
       <w:pPr>
         <w:pStyle w:val="ListNumber"/>
+        <w:numPr>
+          <w:ilvl w:val="0"/>
+          <w:numId w:val="12"/>
+        </w:numPr>
       </w:pPr>
       <w:r>
         <w:rPr>
@@ -1382,6 +1438,10 @@
     <w:p>
       <w:pPr>
         <w:pStyle w:val="ListNumber"/>
+        <w:numPr>
+          <w:ilvl w:val="0"/>
+          <w:numId w:val="12"/>
+        </w:numPr>
       </w:pPr>
       <w:r>
         <w:rPr>
@@ -1394,6 +1454,10 @@
     <w:p>
       <w:pPr>
         <w:pStyle w:val="ListNumber"/>
+        <w:numPr>
+          <w:ilvl w:val="0"/>
+          <w:numId w:val="12"/>
+        </w:numPr>
       </w:pPr>
       <w:r>
         <w:rPr>
@@ -2532,6 +2596,10 @@
     <w:p>
       <w:pPr>
         <w:pStyle w:val="ListNumber"/>
+        <w:numPr>
+          <w:ilvl w:val="0"/>
+          <w:numId w:val="13"/>
+        </w:numPr>
       </w:pPr>
       <w:r>
         <w:rPr>
@@ -2544,6 +2612,10 @@
     <w:p>
       <w:pPr>
         <w:pStyle w:val="ListNumber"/>
+        <w:numPr>
+          <w:ilvl w:val="0"/>
+          <w:numId w:val="13"/>
+        </w:numPr>
       </w:pPr>
       <w:r>
         <w:rPr>
@@ -2556,6 +2628,10 @@
     <w:p>
       <w:pPr>
         <w:pStyle w:val="ListNumber"/>
+        <w:numPr>
+          <w:ilvl w:val="0"/>
+          <w:numId w:val="13"/>
+        </w:numPr>
       </w:pPr>
       <w:r>
         <w:rPr>
@@ -2568,6 +2644,10 @@
     <w:p>
       <w:pPr>
         <w:pStyle w:val="ListNumber"/>
+        <w:numPr>
+          <w:ilvl w:val="0"/>
+          <w:numId w:val="13"/>
+        </w:numPr>
       </w:pPr>
       <w:r>
         <w:rPr>
@@ -2580,6 +2660,10 @@
     <w:p>
       <w:pPr>
         <w:pStyle w:val="ListNumber"/>
+        <w:numPr>
+          <w:ilvl w:val="0"/>
+          <w:numId w:val="13"/>
+        </w:numPr>
       </w:pPr>
       <w:r>
         <w:rPr>
@@ -2592,6 +2676,10 @@
     <w:p>
       <w:pPr>
         <w:pStyle w:val="ListNumber"/>
+        <w:numPr>
+          <w:ilvl w:val="0"/>
+          <w:numId w:val="13"/>
+        </w:numPr>
       </w:pPr>
       <w:r>
         <w:rPr>
@@ -2612,6 +2700,10 @@
     <w:p>
       <w:pPr>
         <w:pStyle w:val="ListNumber"/>
+        <w:numPr>
+          <w:ilvl w:val="0"/>
+          <w:numId w:val="14"/>
+        </w:numPr>
       </w:pPr>
       <w:r>
         <w:rPr>
@@ -2624,6 +2716,10 @@
     <w:p>
       <w:pPr>
         <w:pStyle w:val="ListNumber"/>
+        <w:numPr>
+          <w:ilvl w:val="0"/>
+          <w:numId w:val="14"/>
+        </w:numPr>
       </w:pPr>
       <w:r>
         <w:rPr>
@@ -2636,6 +2732,10 @@
     <w:p>
       <w:pPr>
         <w:pStyle w:val="ListNumber"/>
+        <w:numPr>
+          <w:ilvl w:val="0"/>
+          <w:numId w:val="14"/>
+        </w:numPr>
       </w:pPr>
       <w:r>
         <w:rPr>
@@ -2648,6 +2748,10 @@
     <w:p>
       <w:pPr>
         <w:pStyle w:val="ListNumber"/>
+        <w:numPr>
+          <w:ilvl w:val="0"/>
+          <w:numId w:val="14"/>
+        </w:numPr>
       </w:pPr>
       <w:r>
         <w:rPr>
@@ -2660,6 +2764,10 @@
     <w:p>
       <w:pPr>
         <w:pStyle w:val="ListNumber"/>
+        <w:numPr>
+          <w:ilvl w:val="0"/>
+          <w:numId w:val="14"/>
+        </w:numPr>
       </w:pPr>
       <w:r>
         <w:rPr>
@@ -3514,13 +3622,6 @@
       </w:rPr>
       <w:t>OS Agent 记忆优化 · 第五轮内部验证 · 结论边界见正文</w:t>
     </w:r>
-    <w:r>
-      <w:rPr>
-        <w:rFonts w:ascii="Microsoft YaHei" w:hAnsi="Microsoft YaHei" w:eastAsia="Microsoft YaHei"/>
-        <w:sz w:val="16"/>
-      </w:rPr>
-      <w:t>OS Agent 记忆优化 · 第五轮内部验证 · 结论边界见正文</w:t>
-    </w:r>
   </w:p>
 </w:ftr>
 </file>
@@ -3724,6 +3825,36 @@
   </w:num>
   <w:num w:numId="9">
     <w:abstractNumId w:val="0"/>
+  </w:num>
+  <w:num w:numId="10">
+    <w:abstractNumId w:val="7"/>
+    <w:lvlOverride w:ilvl="0">
+      <w:startOverride w:val="1"/>
+    </w:lvlOverride>
+  </w:num>
+  <w:num w:numId="11">
+    <w:abstractNumId w:val="7"/>
+    <w:lvlOverride w:ilvl="0">
+      <w:startOverride w:val="1"/>
+    </w:lvlOverride>
+  </w:num>
+  <w:num w:numId="12">
+    <w:abstractNumId w:val="7"/>
+    <w:lvlOverride w:ilvl="0">
+      <w:startOverride w:val="1"/>
+    </w:lvlOverride>
+  </w:num>
+  <w:num w:numId="13">
+    <w:abstractNumId w:val="7"/>
+    <w:lvlOverride w:ilvl="0">
+      <w:startOverride w:val="1"/>
+    </w:lvlOverride>
+  </w:num>
+  <w:num w:numId="14">
+    <w:abstractNumId w:val="7"/>
+    <w:lvlOverride w:ilvl="0">
+      <w:startOverride w:val="1"/>
+    </w:lvlOverride>
   </w:num>
 </w:numbering>
 </file>

</xml_diff>